<commit_message>
docs: update thesis with validated project state
</commit_message>
<xml_diff>
--- a/ArtigoMG_revisado_MGMOTORSBR.docx
+++ b/ArtigoMG_revisado_MGMOTORSBR.docx
@@ -110,63 +110,7 @@
         <w:jc w:val="both"/>
       </w:pPr>
       <w:r>
-        <w:rPr>
-          <w:rFonts w:ascii="Times New Roman" w:hAnsi="Times New Roman"/>
-          <w:sz w:val="24"/>
-        </w:rPr>
-        <w:t>O comércio eletrônico brasileiro vem ampliando sua relevância como canal de pesquisa, comparação e negociação. Este trabalho apresenta o desenvolvimento da MGMOTORSBR, plataforma digital de intermediação de veículos construída com HTML5, CSS3, JavaScript e PostgreSQL gerenciado pelo Supabase. A solução foi delimitada à divulgação de anúncios, pesquisa e filtragem de veículos, contato entre usuários e suporte conversacional por inteligência artificial, sem processamento de pagamento ou transferência de propriedade. O percurso metodológico compreendeu levantamento de referências, modelagem de requisitos e casos de uso, projeto do banco de dados, implementação incremental e testes manuais. Os resultados indicaram funcionamento satisfatório dos principais fluxos de cadastro, pesquisa, anúncios, contato, moderação e navegação responsiva; notificações foram implementadas com migration persistente, mas ainda dependem de aplicação e evidência em staging/produção. O Chatling foi incorporado como serviço externo. Foi confirmado o plano Free e seus limites públicos; a versão específica da interface e a configuração detalhada do agente ainda dependem do painel do provedor. O trabalho contribui como protótipo acadêmico e delimita próximos passos de validação de usabilidade, segurança, desempenho e proteção de dados.</w:t>
-      </w:r>
-      <w:r>
-        <w:rPr>
-          <w:rFonts w:ascii="Times New Roman" w:hAnsi="Times New Roman"/>
-          <w:i/>
-          <w:sz w:val="24"/>
-        </w:rPr>
-      </w:r>
-      <w:r>
-        <w:rPr>
-          <w:rFonts w:ascii="Times New Roman" w:hAnsi="Times New Roman"/>
-          <w:sz w:val="24"/>
-        </w:rPr>
-      </w:r>
-      <w:r>
-        <w:rPr>
-          <w:rFonts w:ascii="Times New Roman" w:hAnsi="Times New Roman"/>
-          <w:i/>
-          <w:sz w:val="24"/>
-        </w:rPr>
-      </w:r>
-      <w:r>
-        <w:rPr>
-          <w:rFonts w:ascii="Times New Roman" w:hAnsi="Times New Roman"/>
-          <w:sz w:val="24"/>
-        </w:rPr>
-      </w:r>
-      <w:r>
-        <w:rPr>
-          <w:rFonts w:ascii="Times New Roman" w:hAnsi="Times New Roman"/>
-          <w:i/>
-          <w:sz w:val="24"/>
-        </w:rPr>
-      </w:r>
-      <w:r>
-        <w:rPr>
-          <w:rFonts w:ascii="Times New Roman" w:hAnsi="Times New Roman"/>
-          <w:sz w:val="24"/>
-        </w:rPr>
-      </w:r>
-      <w:r>
-        <w:rPr>
-          <w:rFonts w:ascii="Times New Roman" w:hAnsi="Times New Roman"/>
-          <w:i/>
-          <w:sz w:val="24"/>
-        </w:rPr>
-      </w:r>
-      <w:r>
-        <w:rPr>
-          <w:rFonts w:ascii="Times New Roman" w:hAnsi="Times New Roman"/>
-          <w:sz w:val="24"/>
-        </w:rPr>
+        <w:t>O comércio eletrônico brasileiro vem ampliando sua relevância como canal de pesquisa, comparação e negociação. Este trabalho apresenta o desenvolvimento da MGMOTORSBR, plataforma digital de intermediação de veículos construída com HTML5, CSS3, JavaScript e PostgreSQL gerenciado pelo Supabase. A solução foi delimitada à divulgação de anúncios, pesquisa e filtragem de veículos, contato entre usuários, notificações persistentes e suporte conversacional por inteligência artificial, sem processamento de pagamento ou transferência de propriedade. O percurso metodológico compreendeu levantamento de referências, modelagem de requisitos e casos de uso, projeto do banco de dados, implementação incremental e testes manuais em contas distintas. Os resultados indicaram funcionamento satisfatório dos principais fluxos de cadastro, pesquisa, anúncios, contato, mensagens, envio de fotos, notificações, moderação e navegação responsiva. A comunicação entre contas e as notificações persistentes foram validadas em produção. As fotos novas do chat utilizam bucket privado e URLs assinadas, com controle de acesso por participante. O Chatling foi incorporado como serviço externo, sujeito aos limites do plano Free. O trabalho contribui como protótipo acadêmico funcional e delimita próximos passos de validação de usabilidade, desempenho e proteção de dados.</w:t>
       </w:r>
     </w:p>
     <w:p>
@@ -4402,7 +4346,7 @@
         <w:jc w:val="both"/>
       </w:pPr>
       <w:r>
-        <w:t>O front-end utiliza HTML5, CSS3 e JavaScript sem framework. O Supabase Free fornece PostgreSQL 17.6, autenticação, Storage e endpoints; o cliente é @supabase/supabase-js 2.45.4. O ambiente de desenvolvimento utilizou Node.js 26.12.0 e Visual Studio Code 1.142.0. Git e GitHub foram usados para versionamento e o site está publicado no Vercel, no endereço oficial https://mgmotorss.vercel.app/MG-INICIO/inicio.html. Repositório: https://github.com/murilotecoteco/MGMOTORSBR.</w:t>
+        <w:t>O front-end utiliza HTML5, CSS3 e JavaScript sem framework. O Supabase Free fornece PostgreSQL, autenticação, Storage e endpoints; o cliente é @supabase/supabase-js 2.45.4. As fotos novas das conversas são armazenadas no bucket privado FOTOS-MENSAGENS e acessadas por URLs assinadas, enquanto as fotos antigas permanecem compatíveis. O ambiente de desenvolvimento utilizou Node.js 26.12.0 e Visual Studio Code 1.142.0. Git e GitHub foram usados para versionamento e o site está publicado no Vercel, no endereço oficial https://mgmotorss.vercel.app/MG-INICIO/inicio.html. Repositório: https://github.com/murilotecoteco/MGMOTORSBR.</w:t>
       </w:r>
     </w:p>
     <w:p>
@@ -4412,7 +4356,7 @@
         <w:jc w:val="both"/>
       </w:pPr>
       <w:r>
-        <w:t>Nos testes e no desenvolvimento foram utilizados Arch Linux e Windows, com Firefox, Brave e Chrome. No ambiente Arch Linux verificado, Firefox está na versão 158.0 e Chromium na versão 154.0.8037.97; os executáveis locais do Brave e do Google Chrome não estão instalados neste ambiente, portanto suas versões precisam ser confirmadas no Windows ou no registro original. Para a verificação responsiva, foi utilizado o simulador Mobile FIRST no Firefox, versão 4.20.4, com smartphones, tablets e outros tamanhos de viewport pré-configurados, além de comparações em múltiplos dispositivos. O registro disponível confirma a variação de tamanhos, mas não identifica quais modelos e resoluções foram selecionados em cada caso; por isso, esses detalhes permanecem como pendência do diário de testes. Entre as extensões relevantes do VS Code estão Live Server 5.7.10, Python 2026.8.0 e Pylance 2026.4.1. O README informa que nenhuma licença foi aplicada e que o projeto é educacional e de portfólio.</w:t>
+        <w:t>Nos testes e no desenvolvimento foram utilizados Arch Linux e Windows, com Firefox, Brave e Chrome. A validação final registrada pelos autores foi realizada em Chromium e Firefox sobre Arch Linux, além de testes em dispositivo móvel. Foram confirmados login, logout, mensagens entre duas contas, envio e recebimento de fotos, mensagens não lidas, notificações persistentes, atualização das conversas e funcionamento responsivo. A versão específica dos navegadores e as resoluções devem ser mantidas no diário de testes quando a banca solicitar reprodução detalhada.</w:t>
       </w:r>
     </w:p>
     <w:p>
@@ -9413,3060 +9357,7 @@
         <w:jc w:val="both"/>
       </w:pPr>
       <w:r>
-        <w:rPr>
-          <w:rFonts w:ascii="Times New Roman" w:hAnsi="Times New Roman"/>
-          <w:i/>
-          <w:sz w:val="24"/>
-        </w:rPr>
-        <w:t>O</w:t>
-      </w:r>
-      <w:r>
-        <w:rPr>
-          <w:rFonts w:ascii="Times New Roman" w:hAnsi="Times New Roman"/>
-          <w:i/>
-          <w:sz w:val="24"/>
-        </w:rPr>
-        <w:t xml:space="preserve"> </w:t>
-      </w:r>
-      <w:r>
-        <w:rPr>
-          <w:rFonts w:ascii="Times New Roman" w:hAnsi="Times New Roman"/>
-          <w:i/>
-          <w:sz w:val="24"/>
-        </w:rPr>
-        <w:t>s</w:t>
-      </w:r>
-      <w:r>
-        <w:rPr>
-          <w:rFonts w:ascii="Times New Roman" w:hAnsi="Times New Roman"/>
-          <w:i/>
-          <w:sz w:val="24"/>
-        </w:rPr>
-        <w:t>c</w:t>
-      </w:r>
-      <w:r>
-        <w:rPr>
-          <w:rFonts w:ascii="Times New Roman" w:hAnsi="Times New Roman"/>
-          <w:sz w:val="24"/>
-        </w:rPr>
-        <w:t>h</w:t>
-      </w:r>
-      <w:r>
-        <w:rPr>
-          <w:rFonts w:ascii="Times New Roman" w:hAnsi="Times New Roman"/>
-          <w:i/>
-          <w:sz w:val="24"/>
-        </w:rPr>
-        <w:t>e</w:t>
-      </w:r>
-      <w:r>
-        <w:rPr>
-          <w:rFonts w:ascii="Times New Roman" w:hAnsi="Times New Roman"/>
-          <w:sz w:val="24"/>
-        </w:rPr>
-        <w:t>ma</w:t>
-      </w:r>
-      <w:r>
-        <w:rPr>
-          <w:rFonts w:ascii="Times New Roman" w:hAnsi="Times New Roman"/>
-          <w:i/>
-          <w:sz w:val="24"/>
-        </w:rPr>
-        <w:t xml:space="preserve"> </w:t>
-      </w:r>
-      <w:r>
-        <w:rPr>
-          <w:rFonts w:ascii="Times New Roman" w:hAnsi="Times New Roman"/>
-          <w:i/>
-          <w:sz w:val="24"/>
-        </w:rPr>
-        <w:t>e</w:t>
-      </w:r>
-      <w:r>
-        <w:rPr>
-          <w:rFonts w:ascii="Times New Roman" w:hAnsi="Times New Roman"/>
-          <w:sz w:val="24"/>
-        </w:rPr>
-        <w:t>m</w:t>
-      </w:r>
-      <w:r>
-        <w:rPr>
-          <w:rFonts w:ascii="Times New Roman" w:hAnsi="Times New Roman"/>
-          <w:i/>
-          <w:sz w:val="24"/>
-        </w:rPr>
-        <w:t xml:space="preserve"> </w:t>
-      </w:r>
-      <w:r>
-        <w:rPr>
-          <w:rFonts w:ascii="Times New Roman" w:hAnsi="Times New Roman"/>
-          <w:i/>
-          <w:sz w:val="24"/>
-        </w:rPr>
-        <w:t>s</w:t>
-      </w:r>
-      <w:r>
-        <w:rPr>
-          <w:rFonts w:ascii="Times New Roman" w:hAnsi="Times New Roman"/>
-          <w:i/>
-          <w:sz w:val="24"/>
-        </w:rPr>
-        <w:t>u</w:t>
-      </w:r>
-      <w:r>
-        <w:rPr>
-          <w:rFonts w:ascii="Times New Roman" w:hAnsi="Times New Roman"/>
-          <w:sz w:val="24"/>
-        </w:rPr>
-        <w:t>paba</w:t>
-      </w:r>
-      <w:r>
-        <w:rPr>
-          <w:rFonts w:ascii="Times New Roman" w:hAnsi="Times New Roman"/>
-          <w:i/>
-          <w:sz w:val="24"/>
-        </w:rPr>
-        <w:t>s</w:t>
-      </w:r>
-      <w:r>
-        <w:rPr>
-          <w:rFonts w:ascii="Times New Roman" w:hAnsi="Times New Roman"/>
-          <w:i/>
-          <w:sz w:val="24"/>
-        </w:rPr>
-        <w:t>e</w:t>
-      </w:r>
-      <w:r>
-        <w:rPr>
-          <w:rFonts w:ascii="Times New Roman" w:hAnsi="Times New Roman"/>
-          <w:sz w:val="24"/>
-        </w:rPr>
-        <w:t>/m</w:t>
-      </w:r>
-      <w:r>
-        <w:rPr>
-          <w:rFonts w:ascii="Times New Roman" w:hAnsi="Times New Roman"/>
-          <w:i/>
-          <w:sz w:val="24"/>
-        </w:rPr>
-        <w:t>i</w:t>
-      </w:r>
-      <w:r>
-        <w:rPr>
-          <w:rFonts w:ascii="Times New Roman" w:hAnsi="Times New Roman"/>
-          <w:sz w:val="24"/>
-        </w:rPr>
-        <w:t>g</w:t>
-      </w:r>
-      <w:r>
-        <w:rPr>
-          <w:rFonts w:ascii="Times New Roman" w:hAnsi="Times New Roman"/>
-          <w:i/>
-          <w:sz w:val="24"/>
-        </w:rPr>
-        <w:t>r</w:t>
-      </w:r>
-      <w:r>
-        <w:rPr>
-          <w:rFonts w:ascii="Times New Roman" w:hAnsi="Times New Roman"/>
-          <w:sz w:val="24"/>
-        </w:rPr>
-        <w:t>a</w:t>
-      </w:r>
-      <w:r>
-        <w:rPr>
-          <w:rFonts w:ascii="Times New Roman" w:hAnsi="Times New Roman"/>
-          <w:i/>
-          <w:sz w:val="24"/>
-        </w:rPr>
-        <w:t>t</w:t>
-      </w:r>
-      <w:r>
-        <w:rPr>
-          <w:rFonts w:ascii="Times New Roman" w:hAnsi="Times New Roman"/>
-          <w:i/>
-          <w:sz w:val="24"/>
-        </w:rPr>
-        <w:t>i</w:t>
-      </w:r>
-      <w:r>
-        <w:rPr>
-          <w:rFonts w:ascii="Times New Roman" w:hAnsi="Times New Roman"/>
-          <w:i/>
-          <w:sz w:val="24"/>
-        </w:rPr>
-        <w:t>o</w:t>
-      </w:r>
-      <w:r>
-        <w:rPr>
-          <w:rFonts w:ascii="Times New Roman" w:hAnsi="Times New Roman"/>
-          <w:sz w:val="24"/>
-        </w:rPr>
-        <w:t>n</w:t>
-      </w:r>
-      <w:r>
-        <w:rPr>
-          <w:rFonts w:ascii="Times New Roman" w:hAnsi="Times New Roman"/>
-          <w:i/>
-          <w:sz w:val="24"/>
-        </w:rPr>
-        <w:t>s</w:t>
-      </w:r>
-      <w:r>
-        <w:rPr>
-          <w:rFonts w:ascii="Times New Roman" w:hAnsi="Times New Roman"/>
-          <w:i/>
-          <w:sz w:val="24"/>
-        </w:rPr>
-        <w:t xml:space="preserve"> </w:t>
-      </w:r>
-      <w:r>
-        <w:rPr>
-          <w:rFonts w:ascii="Times New Roman" w:hAnsi="Times New Roman"/>
-          <w:sz w:val="24"/>
-        </w:rPr>
-        <w:t>ap</w:t>
-      </w:r>
-      <w:r>
-        <w:rPr>
-          <w:rFonts w:ascii="Times New Roman" w:hAnsi="Times New Roman"/>
-          <w:i/>
-          <w:sz w:val="24"/>
-        </w:rPr>
-        <w:t>r</w:t>
-      </w:r>
-      <w:r>
-        <w:rPr>
-          <w:rFonts w:ascii="Times New Roman" w:hAnsi="Times New Roman"/>
-          <w:i/>
-          <w:sz w:val="24"/>
-        </w:rPr>
-        <w:t>e</w:t>
-      </w:r>
-      <w:r>
-        <w:rPr>
-          <w:rFonts w:ascii="Times New Roman" w:hAnsi="Times New Roman"/>
-          <w:i/>
-          <w:sz w:val="24"/>
-        </w:rPr>
-        <w:t>s</w:t>
-      </w:r>
-      <w:r>
-        <w:rPr>
-          <w:rFonts w:ascii="Times New Roman" w:hAnsi="Times New Roman"/>
-          <w:i/>
-          <w:sz w:val="24"/>
-        </w:rPr>
-        <w:t>e</w:t>
-      </w:r>
-      <w:r>
-        <w:rPr>
-          <w:rFonts w:ascii="Times New Roman" w:hAnsi="Times New Roman"/>
-          <w:sz w:val="24"/>
-        </w:rPr>
-        <w:t>n</w:t>
-      </w:r>
-      <w:r>
-        <w:rPr>
-          <w:rFonts w:ascii="Times New Roman" w:hAnsi="Times New Roman"/>
-          <w:i/>
-          <w:sz w:val="24"/>
-        </w:rPr>
-        <w:t>t</w:t>
-      </w:r>
-      <w:r>
-        <w:rPr>
-          <w:rFonts w:ascii="Times New Roman" w:hAnsi="Times New Roman"/>
-          <w:sz w:val="24"/>
-        </w:rPr>
-        <w:t>a</w:t>
-      </w:r>
-      <w:r>
-        <w:rPr>
-          <w:rFonts w:ascii="Times New Roman" w:hAnsi="Times New Roman"/>
-          <w:i/>
-          <w:sz w:val="24"/>
-        </w:rPr>
-        <w:t xml:space="preserve"> </w:t>
-      </w:r>
-      <w:r>
-        <w:rPr>
-          <w:rFonts w:ascii="Times New Roman" w:hAnsi="Times New Roman"/>
-          <w:i/>
-          <w:sz w:val="24"/>
-        </w:rPr>
-        <w:t>c</w:t>
-      </w:r>
-      <w:r>
-        <w:rPr>
-          <w:rFonts w:ascii="Times New Roman" w:hAnsi="Times New Roman"/>
-          <w:i/>
-          <w:sz w:val="24"/>
-        </w:rPr>
-        <w:t>o</w:t>
-      </w:r>
-      <w:r>
-        <w:rPr>
-          <w:rFonts w:ascii="Times New Roman" w:hAnsi="Times New Roman"/>
-          <w:sz w:val="24"/>
-        </w:rPr>
-        <w:t>m</w:t>
-      </w:r>
-      <w:r>
-        <w:rPr>
-          <w:rFonts w:ascii="Times New Roman" w:hAnsi="Times New Roman"/>
-          <w:i/>
-          <w:sz w:val="24"/>
-        </w:rPr>
-        <w:t>o</w:t>
-      </w:r>
-      <w:r>
-        <w:rPr>
-          <w:rFonts w:ascii="Times New Roman" w:hAnsi="Times New Roman"/>
-          <w:i/>
-          <w:sz w:val="24"/>
-        </w:rPr>
-        <w:t xml:space="preserve"> </w:t>
-      </w:r>
-      <w:r>
-        <w:rPr>
-          <w:rFonts w:ascii="Times New Roman" w:hAnsi="Times New Roman"/>
-          <w:i/>
-          <w:sz w:val="24"/>
-        </w:rPr>
-        <w:t>e</w:t>
-      </w:r>
-      <w:r>
-        <w:rPr>
-          <w:rFonts w:ascii="Times New Roman" w:hAnsi="Times New Roman"/>
-          <w:sz w:val="24"/>
-        </w:rPr>
-        <w:t>n</w:t>
-      </w:r>
-      <w:r>
-        <w:rPr>
-          <w:rFonts w:ascii="Times New Roman" w:hAnsi="Times New Roman"/>
-          <w:i/>
-          <w:sz w:val="24"/>
-        </w:rPr>
-        <w:t>t</w:t>
-      </w:r>
-      <w:r>
-        <w:rPr>
-          <w:rFonts w:ascii="Times New Roman" w:hAnsi="Times New Roman"/>
-          <w:i/>
-          <w:sz w:val="24"/>
-        </w:rPr>
-        <w:t>i</w:t>
-      </w:r>
-      <w:r>
-        <w:rPr>
-          <w:rFonts w:ascii="Times New Roman" w:hAnsi="Times New Roman"/>
-          <w:sz w:val="24"/>
-        </w:rPr>
-        <w:t>dad</w:t>
-      </w:r>
-      <w:r>
-        <w:rPr>
-          <w:rFonts w:ascii="Times New Roman" w:hAnsi="Times New Roman"/>
-          <w:i/>
-          <w:sz w:val="24"/>
-        </w:rPr>
-        <w:t>e</w:t>
-      </w:r>
-      <w:r>
-        <w:rPr>
-          <w:rFonts w:ascii="Times New Roman" w:hAnsi="Times New Roman"/>
-          <w:i/>
-          <w:sz w:val="24"/>
-        </w:rPr>
-        <w:t>s</w:t>
-      </w:r>
-      <w:r>
-        <w:rPr>
-          <w:rFonts w:ascii="Times New Roman" w:hAnsi="Times New Roman"/>
-          <w:i/>
-          <w:sz w:val="24"/>
-        </w:rPr>
-        <w:t xml:space="preserve"> </w:t>
-      </w:r>
-      <w:r>
-        <w:rPr>
-          <w:rFonts w:ascii="Times New Roman" w:hAnsi="Times New Roman"/>
-          <w:i/>
-          <w:sz w:val="24"/>
-        </w:rPr>
-        <w:t>c</w:t>
-      </w:r>
-      <w:r>
-        <w:rPr>
-          <w:rFonts w:ascii="Times New Roman" w:hAnsi="Times New Roman"/>
-          <w:i/>
-          <w:sz w:val="24"/>
-        </w:rPr>
-        <w:t>e</w:t>
-      </w:r>
-      <w:r>
-        <w:rPr>
-          <w:rFonts w:ascii="Times New Roman" w:hAnsi="Times New Roman"/>
-          <w:sz w:val="24"/>
-        </w:rPr>
-        <w:t>n</w:t>
-      </w:r>
-      <w:r>
-        <w:rPr>
-          <w:rFonts w:ascii="Times New Roman" w:hAnsi="Times New Roman"/>
-          <w:i/>
-          <w:sz w:val="24"/>
-        </w:rPr>
-        <w:t>t</w:t>
-      </w:r>
-      <w:r>
-        <w:rPr>
-          <w:rFonts w:ascii="Times New Roman" w:hAnsi="Times New Roman"/>
-          <w:i/>
-          <w:sz w:val="24"/>
-        </w:rPr>
-        <w:t>r</w:t>
-      </w:r>
-      <w:r>
-        <w:rPr>
-          <w:rFonts w:ascii="Times New Roman" w:hAnsi="Times New Roman"/>
-          <w:sz w:val="24"/>
-        </w:rPr>
-        <w:t>a</w:t>
-      </w:r>
-      <w:r>
-        <w:rPr>
-          <w:rFonts w:ascii="Times New Roman" w:hAnsi="Times New Roman"/>
-          <w:i/>
-          <w:sz w:val="24"/>
-        </w:rPr>
-        <w:t>i</w:t>
-      </w:r>
-      <w:r>
-        <w:rPr>
-          <w:rFonts w:ascii="Times New Roman" w:hAnsi="Times New Roman"/>
-          <w:i/>
-          <w:sz w:val="24"/>
-        </w:rPr>
-        <w:t>s</w:t>
-      </w:r>
-      <w:r>
-        <w:rPr>
-          <w:rFonts w:ascii="Times New Roman" w:hAnsi="Times New Roman"/>
-          <w:i/>
-          <w:sz w:val="24"/>
-        </w:rPr>
-        <w:t xml:space="preserve"> </w:t>
-      </w:r>
-      <w:r>
-        <w:rPr>
-          <w:rFonts w:ascii="Times New Roman" w:hAnsi="Times New Roman"/>
-          <w:i/>
-          <w:sz w:val="24"/>
-        </w:rPr>
-        <w:t>u</w:t>
-      </w:r>
-      <w:r>
-        <w:rPr>
-          <w:rFonts w:ascii="Times New Roman" w:hAnsi="Times New Roman"/>
-          <w:i/>
-          <w:sz w:val="24"/>
-        </w:rPr>
-        <w:t>s</w:t>
-      </w:r>
-      <w:r>
-        <w:rPr>
-          <w:rFonts w:ascii="Times New Roman" w:hAnsi="Times New Roman"/>
-          <w:i/>
-          <w:sz w:val="24"/>
-        </w:rPr>
-        <w:t>u</w:t>
-      </w:r>
-      <w:r>
-        <w:rPr>
-          <w:rFonts w:ascii="Times New Roman" w:hAnsi="Times New Roman"/>
-          <w:sz w:val="24"/>
-        </w:rPr>
-        <w:t>a</w:t>
-      </w:r>
-      <w:r>
-        <w:rPr>
-          <w:rFonts w:ascii="Times New Roman" w:hAnsi="Times New Roman"/>
-          <w:i/>
-          <w:sz w:val="24"/>
-        </w:rPr>
-        <w:t>r</w:t>
-      </w:r>
-      <w:r>
-        <w:rPr>
-          <w:rFonts w:ascii="Times New Roman" w:hAnsi="Times New Roman"/>
-          <w:i/>
-          <w:sz w:val="24"/>
-        </w:rPr>
-        <w:t>i</w:t>
-      </w:r>
-      <w:r>
-        <w:rPr>
-          <w:rFonts w:ascii="Times New Roman" w:hAnsi="Times New Roman"/>
-          <w:i/>
-          <w:sz w:val="24"/>
-        </w:rPr>
-        <w:t>o</w:t>
-      </w:r>
-      <w:r>
-        <w:rPr>
-          <w:rFonts w:ascii="Times New Roman" w:hAnsi="Times New Roman"/>
-          <w:i/>
-          <w:sz w:val="24"/>
-        </w:rPr>
-        <w:t>s</w:t>
-      </w:r>
-      <w:r>
-        <w:rPr>
-          <w:rFonts w:ascii="Times New Roman" w:hAnsi="Times New Roman"/>
-          <w:sz w:val="24"/>
-        </w:rPr>
-        <w:t>,</w:t>
-      </w:r>
-      <w:r>
-        <w:rPr>
-          <w:rFonts w:ascii="Times New Roman" w:hAnsi="Times New Roman"/>
-          <w:i/>
-          <w:sz w:val="24"/>
-        </w:rPr>
-        <w:t xml:space="preserve"> </w:t>
-      </w:r>
-      <w:r>
-        <w:rPr>
-          <w:rFonts w:ascii="Times New Roman" w:hAnsi="Times New Roman"/>
-          <w:sz w:val="24"/>
-        </w:rPr>
-        <w:t>an</w:t>
-      </w:r>
-      <w:r>
-        <w:rPr>
-          <w:rFonts w:ascii="Times New Roman" w:hAnsi="Times New Roman"/>
-          <w:i/>
-          <w:sz w:val="24"/>
-        </w:rPr>
-        <w:t>u</w:t>
-      </w:r>
-      <w:r>
-        <w:rPr>
-          <w:rFonts w:ascii="Times New Roman" w:hAnsi="Times New Roman"/>
-          <w:sz w:val="24"/>
-        </w:rPr>
-        <w:t>n</w:t>
-      </w:r>
-      <w:r>
-        <w:rPr>
-          <w:rFonts w:ascii="Times New Roman" w:hAnsi="Times New Roman"/>
-          <w:i/>
-          <w:sz w:val="24"/>
-        </w:rPr>
-        <w:t>c</w:t>
-      </w:r>
-      <w:r>
-        <w:rPr>
-          <w:rFonts w:ascii="Times New Roman" w:hAnsi="Times New Roman"/>
-          <w:i/>
-          <w:sz w:val="24"/>
-        </w:rPr>
-        <w:t>i</w:t>
-      </w:r>
-      <w:r>
-        <w:rPr>
-          <w:rFonts w:ascii="Times New Roman" w:hAnsi="Times New Roman"/>
-          <w:i/>
-          <w:sz w:val="24"/>
-        </w:rPr>
-        <w:t>o</w:t>
-      </w:r>
-      <w:r>
-        <w:rPr>
-          <w:rFonts w:ascii="Times New Roman" w:hAnsi="Times New Roman"/>
-          <w:i/>
-          <w:sz w:val="24"/>
-        </w:rPr>
-        <w:t>s</w:t>
-      </w:r>
-      <w:r>
-        <w:rPr>
-          <w:rFonts w:ascii="Times New Roman" w:hAnsi="Times New Roman"/>
-          <w:sz w:val="24"/>
-        </w:rPr>
-        <w:t>,</w:t>
-      </w:r>
-      <w:r>
-        <w:rPr>
-          <w:rFonts w:ascii="Times New Roman" w:hAnsi="Times New Roman"/>
-          <w:i/>
-          <w:sz w:val="24"/>
-        </w:rPr>
-        <w:t xml:space="preserve"> </w:t>
-      </w:r>
-      <w:r>
-        <w:rPr>
-          <w:rFonts w:ascii="Times New Roman" w:hAnsi="Times New Roman"/>
-          <w:sz w:val="24"/>
-        </w:rPr>
-        <w:t>ma</w:t>
-      </w:r>
-      <w:r>
-        <w:rPr>
-          <w:rFonts w:ascii="Times New Roman" w:hAnsi="Times New Roman"/>
-          <w:i/>
-          <w:sz w:val="24"/>
-        </w:rPr>
-        <w:t>r</w:t>
-      </w:r>
-      <w:r>
-        <w:rPr>
-          <w:rFonts w:ascii="Times New Roman" w:hAnsi="Times New Roman"/>
-          <w:i/>
-          <w:sz w:val="24"/>
-        </w:rPr>
-        <w:t>c</w:t>
-      </w:r>
-      <w:r>
-        <w:rPr>
-          <w:rFonts w:ascii="Times New Roman" w:hAnsi="Times New Roman"/>
-          <w:sz w:val="24"/>
-        </w:rPr>
-        <w:t>a</w:t>
-      </w:r>
-      <w:r>
-        <w:rPr>
-          <w:rFonts w:ascii="Times New Roman" w:hAnsi="Times New Roman"/>
-          <w:i/>
-          <w:sz w:val="24"/>
-        </w:rPr>
-        <w:t>s</w:t>
-      </w:r>
-      <w:r>
-        <w:rPr>
-          <w:rFonts w:ascii="Times New Roman" w:hAnsi="Times New Roman"/>
-          <w:sz w:val="24"/>
-        </w:rPr>
-        <w:t>,</w:t>
-      </w:r>
-      <w:r>
-        <w:rPr>
-          <w:rFonts w:ascii="Times New Roman" w:hAnsi="Times New Roman"/>
-          <w:i/>
-          <w:sz w:val="24"/>
-        </w:rPr>
-        <w:t xml:space="preserve"> </w:t>
-      </w:r>
-      <w:r>
-        <w:rPr>
-          <w:rFonts w:ascii="Times New Roman" w:hAnsi="Times New Roman"/>
-          <w:sz w:val="24"/>
-        </w:rPr>
-        <w:t>m</w:t>
-      </w:r>
-      <w:r>
-        <w:rPr>
-          <w:rFonts w:ascii="Times New Roman" w:hAnsi="Times New Roman"/>
-          <w:i/>
-          <w:sz w:val="24"/>
-        </w:rPr>
-        <w:t>o</w:t>
-      </w:r>
-      <w:r>
-        <w:rPr>
-          <w:rFonts w:ascii="Times New Roman" w:hAnsi="Times New Roman"/>
-          <w:sz w:val="24"/>
-        </w:rPr>
-        <w:t>d</w:t>
-      </w:r>
-      <w:r>
-        <w:rPr>
-          <w:rFonts w:ascii="Times New Roman" w:hAnsi="Times New Roman"/>
-          <w:i/>
-          <w:sz w:val="24"/>
-        </w:rPr>
-        <w:t>e</w:t>
-      </w:r>
-      <w:r>
-        <w:rPr>
-          <w:rFonts w:ascii="Times New Roman" w:hAnsi="Times New Roman"/>
-          <w:i/>
-          <w:sz w:val="24"/>
-        </w:rPr>
-        <w:t>l</w:t>
-      </w:r>
-      <w:r>
-        <w:rPr>
-          <w:rFonts w:ascii="Times New Roman" w:hAnsi="Times New Roman"/>
-          <w:i/>
-          <w:sz w:val="24"/>
-        </w:rPr>
-        <w:t>o</w:t>
-      </w:r>
-      <w:r>
-        <w:rPr>
-          <w:rFonts w:ascii="Times New Roman" w:hAnsi="Times New Roman"/>
-          <w:i/>
-          <w:sz w:val="24"/>
-        </w:rPr>
-        <w:t>s</w:t>
-      </w:r>
-      <w:r>
-        <w:rPr>
-          <w:rFonts w:ascii="Times New Roman" w:hAnsi="Times New Roman"/>
-          <w:sz w:val="24"/>
-        </w:rPr>
-        <w:t>,</w:t>
-      </w:r>
-      <w:r>
-        <w:rPr>
-          <w:rFonts w:ascii="Times New Roman" w:hAnsi="Times New Roman"/>
-          <w:i/>
-          <w:sz w:val="24"/>
-        </w:rPr>
-        <w:t xml:space="preserve"> </w:t>
-      </w:r>
-      <w:r>
-        <w:rPr>
-          <w:rFonts w:ascii="Times New Roman" w:hAnsi="Times New Roman"/>
-          <w:i/>
-          <w:sz w:val="24"/>
-        </w:rPr>
-        <w:t>v</w:t>
-      </w:r>
-      <w:r>
-        <w:rPr>
-          <w:rFonts w:ascii="Times New Roman" w:hAnsi="Times New Roman"/>
-          <w:i/>
-          <w:sz w:val="24"/>
-        </w:rPr>
-        <w:t>e</w:t>
-      </w:r>
-      <w:r>
-        <w:rPr>
-          <w:rFonts w:ascii="Times New Roman" w:hAnsi="Times New Roman"/>
-          <w:i/>
-          <w:sz w:val="24"/>
-        </w:rPr>
-        <w:t>r</w:t>
-      </w:r>
-      <w:r>
-        <w:rPr>
-          <w:rFonts w:ascii="Times New Roman" w:hAnsi="Times New Roman"/>
-          <w:i/>
-          <w:sz w:val="24"/>
-        </w:rPr>
-        <w:t>s</w:t>
-      </w:r>
-      <w:r>
-        <w:rPr>
-          <w:rFonts w:ascii="Times New Roman" w:hAnsi="Times New Roman"/>
-          <w:i/>
-          <w:sz w:val="24"/>
-        </w:rPr>
-        <w:t>o</w:t>
-      </w:r>
-      <w:r>
-        <w:rPr>
-          <w:rFonts w:ascii="Times New Roman" w:hAnsi="Times New Roman"/>
-          <w:i/>
-          <w:sz w:val="24"/>
-        </w:rPr>
-        <w:t>e</w:t>
-      </w:r>
-      <w:r>
-        <w:rPr>
-          <w:rFonts w:ascii="Times New Roman" w:hAnsi="Times New Roman"/>
-          <w:i/>
-          <w:sz w:val="24"/>
-        </w:rPr>
-        <w:t>s</w:t>
-      </w:r>
-      <w:r>
-        <w:rPr>
-          <w:rFonts w:ascii="Times New Roman" w:hAnsi="Times New Roman"/>
-          <w:sz w:val="24"/>
-        </w:rPr>
-        <w:t>,</w:t>
-      </w:r>
-      <w:r>
-        <w:rPr>
-          <w:rFonts w:ascii="Times New Roman" w:hAnsi="Times New Roman"/>
-          <w:i/>
-          <w:sz w:val="24"/>
-        </w:rPr>
-        <w:t xml:space="preserve"> </w:t>
-      </w:r>
-      <w:r>
-        <w:rPr>
-          <w:rFonts w:ascii="Times New Roman" w:hAnsi="Times New Roman"/>
-          <w:sz w:val="24"/>
-        </w:rPr>
-        <w:t>f</w:t>
-      </w:r>
-      <w:r>
-        <w:rPr>
-          <w:rFonts w:ascii="Times New Roman" w:hAnsi="Times New Roman"/>
-          <w:i/>
-          <w:sz w:val="24"/>
-        </w:rPr>
-        <w:t>o</w:t>
-      </w:r>
-      <w:r>
-        <w:rPr>
-          <w:rFonts w:ascii="Times New Roman" w:hAnsi="Times New Roman"/>
-          <w:i/>
-          <w:sz w:val="24"/>
-        </w:rPr>
-        <w:t>t</w:t>
-      </w:r>
-      <w:r>
-        <w:rPr>
-          <w:rFonts w:ascii="Times New Roman" w:hAnsi="Times New Roman"/>
-          <w:i/>
-          <w:sz w:val="24"/>
-        </w:rPr>
-        <w:t>o</w:t>
-      </w:r>
-      <w:r>
-        <w:rPr>
-          <w:rFonts w:ascii="Times New Roman" w:hAnsi="Times New Roman"/>
-          <w:i/>
-          <w:sz w:val="24"/>
-        </w:rPr>
-        <w:t>s</w:t>
-      </w:r>
-      <w:r>
-        <w:rPr>
-          <w:rFonts w:ascii="Times New Roman" w:hAnsi="Times New Roman"/>
-          <w:sz w:val="24"/>
-        </w:rPr>
-        <w:t>_an</w:t>
-      </w:r>
-      <w:r>
-        <w:rPr>
-          <w:rFonts w:ascii="Times New Roman" w:hAnsi="Times New Roman"/>
-          <w:i/>
-          <w:sz w:val="24"/>
-        </w:rPr>
-        <w:t>u</w:t>
-      </w:r>
-      <w:r>
-        <w:rPr>
-          <w:rFonts w:ascii="Times New Roman" w:hAnsi="Times New Roman"/>
-          <w:sz w:val="24"/>
-        </w:rPr>
-        <w:t>n</w:t>
-      </w:r>
-      <w:r>
-        <w:rPr>
-          <w:rFonts w:ascii="Times New Roman" w:hAnsi="Times New Roman"/>
-          <w:i/>
-          <w:sz w:val="24"/>
-        </w:rPr>
-        <w:t>c</w:t>
-      </w:r>
-      <w:r>
-        <w:rPr>
-          <w:rFonts w:ascii="Times New Roman" w:hAnsi="Times New Roman"/>
-          <w:i/>
-          <w:sz w:val="24"/>
-        </w:rPr>
-        <w:t>i</w:t>
-      </w:r>
-      <w:r>
-        <w:rPr>
-          <w:rFonts w:ascii="Times New Roman" w:hAnsi="Times New Roman"/>
-          <w:i/>
-          <w:sz w:val="24"/>
-        </w:rPr>
-        <w:t>o</w:t>
-      </w:r>
-      <w:r>
-        <w:rPr>
-          <w:rFonts w:ascii="Times New Roman" w:hAnsi="Times New Roman"/>
-          <w:sz w:val="24"/>
-        </w:rPr>
-        <w:t>,</w:t>
-      </w:r>
-      <w:r>
-        <w:rPr>
-          <w:rFonts w:ascii="Times New Roman" w:hAnsi="Times New Roman"/>
-          <w:i/>
-          <w:sz w:val="24"/>
-        </w:rPr>
-        <w:t xml:space="preserve"> </w:t>
-      </w:r>
-      <w:r>
-        <w:rPr>
-          <w:rFonts w:ascii="Times New Roman" w:hAnsi="Times New Roman"/>
-          <w:sz w:val="24"/>
-        </w:rPr>
-        <w:t>fa</w:t>
-      </w:r>
-      <w:r>
-        <w:rPr>
-          <w:rFonts w:ascii="Times New Roman" w:hAnsi="Times New Roman"/>
-          <w:i/>
-          <w:sz w:val="24"/>
-        </w:rPr>
-        <w:t>v</w:t>
-      </w:r>
-      <w:r>
-        <w:rPr>
-          <w:rFonts w:ascii="Times New Roman" w:hAnsi="Times New Roman"/>
-          <w:i/>
-          <w:sz w:val="24"/>
-        </w:rPr>
-        <w:t>o</w:t>
-      </w:r>
-      <w:r>
-        <w:rPr>
-          <w:rFonts w:ascii="Times New Roman" w:hAnsi="Times New Roman"/>
-          <w:i/>
-          <w:sz w:val="24"/>
-        </w:rPr>
-        <w:t>r</w:t>
-      </w:r>
-      <w:r>
-        <w:rPr>
-          <w:rFonts w:ascii="Times New Roman" w:hAnsi="Times New Roman"/>
-          <w:i/>
-          <w:sz w:val="24"/>
-        </w:rPr>
-        <w:t>i</w:t>
-      </w:r>
-      <w:r>
-        <w:rPr>
-          <w:rFonts w:ascii="Times New Roman" w:hAnsi="Times New Roman"/>
-          <w:i/>
-          <w:sz w:val="24"/>
-        </w:rPr>
-        <w:t>t</w:t>
-      </w:r>
-      <w:r>
-        <w:rPr>
-          <w:rFonts w:ascii="Times New Roman" w:hAnsi="Times New Roman"/>
-          <w:i/>
-          <w:sz w:val="24"/>
-        </w:rPr>
-        <w:t>o</w:t>
-      </w:r>
-      <w:r>
-        <w:rPr>
-          <w:rFonts w:ascii="Times New Roman" w:hAnsi="Times New Roman"/>
-          <w:i/>
-          <w:sz w:val="24"/>
-        </w:rPr>
-        <w:t>s</w:t>
-      </w:r>
-      <w:r>
-        <w:rPr>
-          <w:rFonts w:ascii="Times New Roman" w:hAnsi="Times New Roman"/>
-          <w:sz w:val="24"/>
-        </w:rPr>
-        <w:t>,</w:t>
-      </w:r>
-      <w:r>
-        <w:rPr>
-          <w:rFonts w:ascii="Times New Roman" w:hAnsi="Times New Roman"/>
-          <w:i/>
-          <w:sz w:val="24"/>
-        </w:rPr>
-        <w:t xml:space="preserve"> </w:t>
-      </w:r>
-      <w:r>
-        <w:rPr>
-          <w:rFonts w:ascii="Times New Roman" w:hAnsi="Times New Roman"/>
-          <w:i/>
-          <w:sz w:val="24"/>
-        </w:rPr>
-        <w:t>c</w:t>
-      </w:r>
-      <w:r>
-        <w:rPr>
-          <w:rFonts w:ascii="Times New Roman" w:hAnsi="Times New Roman"/>
-          <w:i/>
-          <w:sz w:val="24"/>
-        </w:rPr>
-        <w:t>u</w:t>
-      </w:r>
-      <w:r>
-        <w:rPr>
-          <w:rFonts w:ascii="Times New Roman" w:hAnsi="Times New Roman"/>
-          <w:i/>
-          <w:sz w:val="24"/>
-        </w:rPr>
-        <w:t>r</w:t>
-      </w:r>
-      <w:r>
-        <w:rPr>
-          <w:rFonts w:ascii="Times New Roman" w:hAnsi="Times New Roman"/>
-          <w:i/>
-          <w:sz w:val="24"/>
-        </w:rPr>
-        <w:t>t</w:t>
-      </w:r>
-      <w:r>
-        <w:rPr>
-          <w:rFonts w:ascii="Times New Roman" w:hAnsi="Times New Roman"/>
-          <w:i/>
-          <w:sz w:val="24"/>
-        </w:rPr>
-        <w:t>i</w:t>
-      </w:r>
-      <w:r>
-        <w:rPr>
-          <w:rFonts w:ascii="Times New Roman" w:hAnsi="Times New Roman"/>
-          <w:sz w:val="24"/>
-        </w:rPr>
-        <w:t>da</w:t>
-      </w:r>
-      <w:r>
-        <w:rPr>
-          <w:rFonts w:ascii="Times New Roman" w:hAnsi="Times New Roman"/>
-          <w:i/>
-          <w:sz w:val="24"/>
-        </w:rPr>
-        <w:t>s</w:t>
-      </w:r>
-      <w:r>
-        <w:rPr>
-          <w:rFonts w:ascii="Times New Roman" w:hAnsi="Times New Roman"/>
-          <w:sz w:val="24"/>
-        </w:rPr>
-        <w:t>_an</w:t>
-      </w:r>
-      <w:r>
-        <w:rPr>
-          <w:rFonts w:ascii="Times New Roman" w:hAnsi="Times New Roman"/>
-          <w:i/>
-          <w:sz w:val="24"/>
-        </w:rPr>
-        <w:t>u</w:t>
-      </w:r>
-      <w:r>
-        <w:rPr>
-          <w:rFonts w:ascii="Times New Roman" w:hAnsi="Times New Roman"/>
-          <w:sz w:val="24"/>
-        </w:rPr>
-        <w:t>n</w:t>
-      </w:r>
-      <w:r>
-        <w:rPr>
-          <w:rFonts w:ascii="Times New Roman" w:hAnsi="Times New Roman"/>
-          <w:i/>
-          <w:sz w:val="24"/>
-        </w:rPr>
-        <w:t>c</w:t>
-      </w:r>
-      <w:r>
-        <w:rPr>
-          <w:rFonts w:ascii="Times New Roman" w:hAnsi="Times New Roman"/>
-          <w:i/>
-          <w:sz w:val="24"/>
-        </w:rPr>
-        <w:t>i</w:t>
-      </w:r>
-      <w:r>
-        <w:rPr>
-          <w:rFonts w:ascii="Times New Roman" w:hAnsi="Times New Roman"/>
-          <w:i/>
-          <w:sz w:val="24"/>
-        </w:rPr>
-        <w:t>o</w:t>
-      </w:r>
-      <w:r>
-        <w:rPr>
-          <w:rFonts w:ascii="Times New Roman" w:hAnsi="Times New Roman"/>
-          <w:sz w:val="24"/>
-        </w:rPr>
-        <w:t>,</w:t>
-      </w:r>
-      <w:r>
-        <w:rPr>
-          <w:rFonts w:ascii="Times New Roman" w:hAnsi="Times New Roman"/>
-          <w:i/>
-          <w:sz w:val="24"/>
-        </w:rPr>
-        <w:t xml:space="preserve"> </w:t>
-      </w:r>
-      <w:r>
-        <w:rPr>
-          <w:rFonts w:ascii="Times New Roman" w:hAnsi="Times New Roman"/>
-          <w:sz w:val="24"/>
-        </w:rPr>
-        <w:t>m</w:t>
-      </w:r>
-      <w:r>
-        <w:rPr>
-          <w:rFonts w:ascii="Times New Roman" w:hAnsi="Times New Roman"/>
-          <w:i/>
-          <w:sz w:val="24"/>
-        </w:rPr>
-        <w:t>e</w:t>
-      </w:r>
-      <w:r>
-        <w:rPr>
-          <w:rFonts w:ascii="Times New Roman" w:hAnsi="Times New Roman"/>
-          <w:sz w:val="24"/>
-        </w:rPr>
-        <w:t>n</w:t>
-      </w:r>
-      <w:r>
-        <w:rPr>
-          <w:rFonts w:ascii="Times New Roman" w:hAnsi="Times New Roman"/>
-          <w:i/>
-          <w:sz w:val="24"/>
-        </w:rPr>
-        <w:t>s</w:t>
-      </w:r>
-      <w:r>
-        <w:rPr>
-          <w:rFonts w:ascii="Times New Roman" w:hAnsi="Times New Roman"/>
-          <w:sz w:val="24"/>
-        </w:rPr>
-        <w:t>ag</w:t>
-      </w:r>
-      <w:r>
-        <w:rPr>
-          <w:rFonts w:ascii="Times New Roman" w:hAnsi="Times New Roman"/>
-          <w:i/>
-          <w:sz w:val="24"/>
-        </w:rPr>
-        <w:t>e</w:t>
-      </w:r>
-      <w:r>
-        <w:rPr>
-          <w:rFonts w:ascii="Times New Roman" w:hAnsi="Times New Roman"/>
-          <w:sz w:val="24"/>
-        </w:rPr>
-        <w:t>n</w:t>
-      </w:r>
-      <w:r>
-        <w:rPr>
-          <w:rFonts w:ascii="Times New Roman" w:hAnsi="Times New Roman"/>
-          <w:i/>
-          <w:sz w:val="24"/>
-        </w:rPr>
-        <w:t>s</w:t>
-      </w:r>
-      <w:r>
-        <w:rPr>
-          <w:rFonts w:ascii="Times New Roman" w:hAnsi="Times New Roman"/>
-          <w:sz w:val="24"/>
-        </w:rPr>
-        <w:t>,</w:t>
-      </w:r>
-      <w:r>
-        <w:rPr>
-          <w:rFonts w:ascii="Times New Roman" w:hAnsi="Times New Roman"/>
-          <w:i/>
-          <w:sz w:val="24"/>
-        </w:rPr>
-        <w:t xml:space="preserve"> </w:t>
-      </w:r>
-      <w:r>
-        <w:rPr>
-          <w:rFonts w:ascii="Times New Roman" w:hAnsi="Times New Roman"/>
-          <w:i/>
-          <w:sz w:val="24"/>
-        </w:rPr>
-        <w:t>c</w:t>
-      </w:r>
-      <w:r>
-        <w:rPr>
-          <w:rFonts w:ascii="Times New Roman" w:hAnsi="Times New Roman"/>
-          <w:i/>
-          <w:sz w:val="24"/>
-        </w:rPr>
-        <w:t>o</w:t>
-      </w:r>
-      <w:r>
-        <w:rPr>
-          <w:rFonts w:ascii="Times New Roman" w:hAnsi="Times New Roman"/>
-          <w:sz w:val="24"/>
-        </w:rPr>
-        <w:t>n</w:t>
-      </w:r>
-      <w:r>
-        <w:rPr>
-          <w:rFonts w:ascii="Times New Roman" w:hAnsi="Times New Roman"/>
-          <w:i/>
-          <w:sz w:val="24"/>
-        </w:rPr>
-        <w:t>v</w:t>
-      </w:r>
-      <w:r>
-        <w:rPr>
-          <w:rFonts w:ascii="Times New Roman" w:hAnsi="Times New Roman"/>
-          <w:i/>
-          <w:sz w:val="24"/>
-        </w:rPr>
-        <w:t>e</w:t>
-      </w:r>
-      <w:r>
-        <w:rPr>
-          <w:rFonts w:ascii="Times New Roman" w:hAnsi="Times New Roman"/>
-          <w:i/>
-          <w:sz w:val="24"/>
-        </w:rPr>
-        <w:t>r</w:t>
-      </w:r>
-      <w:r>
-        <w:rPr>
-          <w:rFonts w:ascii="Times New Roman" w:hAnsi="Times New Roman"/>
-          <w:i/>
-          <w:sz w:val="24"/>
-        </w:rPr>
-        <w:t>s</w:t>
-      </w:r>
-      <w:r>
-        <w:rPr>
-          <w:rFonts w:ascii="Times New Roman" w:hAnsi="Times New Roman"/>
-          <w:sz w:val="24"/>
-        </w:rPr>
-        <w:t>a</w:t>
-      </w:r>
-      <w:r>
-        <w:rPr>
-          <w:rFonts w:ascii="Times New Roman" w:hAnsi="Times New Roman"/>
-          <w:i/>
-          <w:sz w:val="24"/>
-        </w:rPr>
-        <w:t>s</w:t>
-      </w:r>
-      <w:r>
-        <w:rPr>
-          <w:rFonts w:ascii="Times New Roman" w:hAnsi="Times New Roman"/>
-          <w:sz w:val="24"/>
-        </w:rPr>
-        <w:t>,</w:t>
-      </w:r>
-      <w:r>
-        <w:rPr>
-          <w:rFonts w:ascii="Times New Roman" w:hAnsi="Times New Roman"/>
-          <w:i/>
-          <w:sz w:val="24"/>
-        </w:rPr>
-        <w:t xml:space="preserve"> </w:t>
-      </w:r>
-      <w:r>
-        <w:rPr>
-          <w:rFonts w:ascii="Times New Roman" w:hAnsi="Times New Roman"/>
-          <w:sz w:val="24"/>
-        </w:rPr>
-        <w:t>d</w:t>
-      </w:r>
-      <w:r>
-        <w:rPr>
-          <w:rFonts w:ascii="Times New Roman" w:hAnsi="Times New Roman"/>
-          <w:i/>
-          <w:sz w:val="24"/>
-        </w:rPr>
-        <w:t>e</w:t>
-      </w:r>
-      <w:r>
-        <w:rPr>
-          <w:rFonts w:ascii="Times New Roman" w:hAnsi="Times New Roman"/>
-          <w:sz w:val="24"/>
-        </w:rPr>
-        <w:t>n</w:t>
-      </w:r>
-      <w:r>
-        <w:rPr>
-          <w:rFonts w:ascii="Times New Roman" w:hAnsi="Times New Roman"/>
-          <w:i/>
-          <w:sz w:val="24"/>
-        </w:rPr>
-        <w:t>u</w:t>
-      </w:r>
-      <w:r>
-        <w:rPr>
-          <w:rFonts w:ascii="Times New Roman" w:hAnsi="Times New Roman"/>
-          <w:sz w:val="24"/>
-        </w:rPr>
-        <w:t>n</w:t>
-      </w:r>
-      <w:r>
-        <w:rPr>
-          <w:rFonts w:ascii="Times New Roman" w:hAnsi="Times New Roman"/>
-          <w:i/>
-          <w:sz w:val="24"/>
-        </w:rPr>
-        <w:t>c</w:t>
-      </w:r>
-      <w:r>
-        <w:rPr>
-          <w:rFonts w:ascii="Times New Roman" w:hAnsi="Times New Roman"/>
-          <w:i/>
-          <w:sz w:val="24"/>
-        </w:rPr>
-        <w:t>i</w:t>
-      </w:r>
-      <w:r>
-        <w:rPr>
-          <w:rFonts w:ascii="Times New Roman" w:hAnsi="Times New Roman"/>
-          <w:sz w:val="24"/>
-        </w:rPr>
-        <w:t>a</w:t>
-      </w:r>
-      <w:r>
-        <w:rPr>
-          <w:rFonts w:ascii="Times New Roman" w:hAnsi="Times New Roman"/>
-          <w:i/>
-          <w:sz w:val="24"/>
-        </w:rPr>
-        <w:t>s</w:t>
-      </w:r>
-      <w:r>
-        <w:rPr>
-          <w:rFonts w:ascii="Times New Roman" w:hAnsi="Times New Roman"/>
-          <w:sz w:val="24"/>
-        </w:rPr>
-        <w:t>,</w:t>
-      </w:r>
-      <w:r>
-        <w:rPr>
-          <w:rFonts w:ascii="Times New Roman" w:hAnsi="Times New Roman"/>
-          <w:i/>
-          <w:sz w:val="24"/>
-        </w:rPr>
-        <w:t xml:space="preserve"> </w:t>
-      </w:r>
-      <w:r>
-        <w:rPr>
-          <w:rFonts w:ascii="Times New Roman" w:hAnsi="Times New Roman"/>
-          <w:i/>
-          <w:sz w:val="24"/>
-        </w:rPr>
-        <w:t>s</w:t>
-      </w:r>
-      <w:r>
-        <w:rPr>
-          <w:rFonts w:ascii="Times New Roman" w:hAnsi="Times New Roman"/>
-          <w:i/>
-          <w:sz w:val="24"/>
-        </w:rPr>
-        <w:t>e</w:t>
-      </w:r>
-      <w:r>
-        <w:rPr>
-          <w:rFonts w:ascii="Times New Roman" w:hAnsi="Times New Roman"/>
-          <w:sz w:val="24"/>
-        </w:rPr>
-        <w:t>g</w:t>
-      </w:r>
-      <w:r>
-        <w:rPr>
-          <w:rFonts w:ascii="Times New Roman" w:hAnsi="Times New Roman"/>
-          <w:i/>
-          <w:sz w:val="24"/>
-        </w:rPr>
-        <w:t>u</w:t>
-      </w:r>
-      <w:r>
-        <w:rPr>
-          <w:rFonts w:ascii="Times New Roman" w:hAnsi="Times New Roman"/>
-          <w:i/>
-          <w:sz w:val="24"/>
-        </w:rPr>
-        <w:t>i</w:t>
-      </w:r>
-      <w:r>
-        <w:rPr>
-          <w:rFonts w:ascii="Times New Roman" w:hAnsi="Times New Roman"/>
-          <w:sz w:val="24"/>
-        </w:rPr>
-        <w:t>d</w:t>
-      </w:r>
-      <w:r>
-        <w:rPr>
-          <w:rFonts w:ascii="Times New Roman" w:hAnsi="Times New Roman"/>
-          <w:i/>
-          <w:sz w:val="24"/>
-        </w:rPr>
-        <w:t>o</w:t>
-      </w:r>
-      <w:r>
-        <w:rPr>
-          <w:rFonts w:ascii="Times New Roman" w:hAnsi="Times New Roman"/>
-          <w:i/>
-          <w:sz w:val="24"/>
-        </w:rPr>
-        <w:t>r</w:t>
-      </w:r>
-      <w:r>
-        <w:rPr>
-          <w:rFonts w:ascii="Times New Roman" w:hAnsi="Times New Roman"/>
-          <w:i/>
-          <w:sz w:val="24"/>
-        </w:rPr>
-        <w:t>e</w:t>
-      </w:r>
-      <w:r>
-        <w:rPr>
-          <w:rFonts w:ascii="Times New Roman" w:hAnsi="Times New Roman"/>
-          <w:i/>
-          <w:sz w:val="24"/>
-        </w:rPr>
-        <w:t>s</w:t>
-      </w:r>
-      <w:r>
-        <w:rPr>
-          <w:rFonts w:ascii="Times New Roman" w:hAnsi="Times New Roman"/>
-          <w:i/>
-          <w:sz w:val="24"/>
-        </w:rPr>
-        <w:t xml:space="preserve"> </w:t>
-      </w:r>
-      <w:r>
-        <w:rPr>
-          <w:rFonts w:ascii="Times New Roman" w:hAnsi="Times New Roman"/>
-          <w:i/>
-          <w:sz w:val="24"/>
-        </w:rPr>
-        <w:t>e</w:t>
-      </w:r>
-      <w:r>
-        <w:rPr>
-          <w:rFonts w:ascii="Times New Roman" w:hAnsi="Times New Roman"/>
-          <w:i/>
-          <w:sz w:val="24"/>
-        </w:rPr>
-        <w:t xml:space="preserve"> </w:t>
-      </w:r>
-      <w:r>
-        <w:rPr>
-          <w:rFonts w:ascii="Times New Roman" w:hAnsi="Times New Roman"/>
-          <w:i/>
-          <w:sz w:val="24"/>
-        </w:rPr>
-        <w:t>c</w:t>
-      </w:r>
-      <w:r>
-        <w:rPr>
-          <w:rFonts w:ascii="Times New Roman" w:hAnsi="Times New Roman"/>
-          <w:i/>
-          <w:sz w:val="24"/>
-        </w:rPr>
-        <w:t>o</w:t>
-      </w:r>
-      <w:r>
-        <w:rPr>
-          <w:rFonts w:ascii="Times New Roman" w:hAnsi="Times New Roman"/>
-          <w:sz w:val="24"/>
-        </w:rPr>
-        <w:t>nf</w:t>
-      </w:r>
-      <w:r>
-        <w:rPr>
-          <w:rFonts w:ascii="Times New Roman" w:hAnsi="Times New Roman"/>
-          <w:i/>
-          <w:sz w:val="24"/>
-        </w:rPr>
-        <w:t>i</w:t>
-      </w:r>
-      <w:r>
-        <w:rPr>
-          <w:rFonts w:ascii="Times New Roman" w:hAnsi="Times New Roman"/>
-          <w:sz w:val="24"/>
-        </w:rPr>
-        <w:t>g_</w:t>
-      </w:r>
-      <w:r>
-        <w:rPr>
-          <w:rFonts w:ascii="Times New Roman" w:hAnsi="Times New Roman"/>
-          <w:i/>
-          <w:sz w:val="24"/>
-        </w:rPr>
-        <w:t>u</w:t>
-      </w:r>
-      <w:r>
-        <w:rPr>
-          <w:rFonts w:ascii="Times New Roman" w:hAnsi="Times New Roman"/>
-          <w:i/>
-          <w:sz w:val="24"/>
-        </w:rPr>
-        <w:t>s</w:t>
-      </w:r>
-      <w:r>
-        <w:rPr>
-          <w:rFonts w:ascii="Times New Roman" w:hAnsi="Times New Roman"/>
-          <w:i/>
-          <w:sz w:val="24"/>
-        </w:rPr>
-        <w:t>u</w:t>
-      </w:r>
-      <w:r>
-        <w:rPr>
-          <w:rFonts w:ascii="Times New Roman" w:hAnsi="Times New Roman"/>
-          <w:sz w:val="24"/>
-        </w:rPr>
-        <w:t>a</w:t>
-      </w:r>
-      <w:r>
-        <w:rPr>
-          <w:rFonts w:ascii="Times New Roman" w:hAnsi="Times New Roman"/>
-          <w:i/>
-          <w:sz w:val="24"/>
-        </w:rPr>
-        <w:t>r</w:t>
-      </w:r>
-      <w:r>
-        <w:rPr>
-          <w:rFonts w:ascii="Times New Roman" w:hAnsi="Times New Roman"/>
-          <w:i/>
-          <w:sz w:val="24"/>
-        </w:rPr>
-        <w:t>i</w:t>
-      </w:r>
-      <w:r>
-        <w:rPr>
-          <w:rFonts w:ascii="Times New Roman" w:hAnsi="Times New Roman"/>
-          <w:i/>
-          <w:sz w:val="24"/>
-        </w:rPr>
-        <w:t>o</w:t>
-      </w:r>
-      <w:r>
-        <w:rPr>
-          <w:rFonts w:ascii="Times New Roman" w:hAnsi="Times New Roman"/>
-          <w:sz w:val="24"/>
-        </w:rPr>
-        <w:t>.</w:t>
-      </w:r>
-      <w:r>
-        <w:rPr>
-          <w:rFonts w:ascii="Times New Roman" w:hAnsi="Times New Roman"/>
-          <w:i/>
-          <w:sz w:val="24"/>
-        </w:rPr>
-        <w:t xml:space="preserve"> </w:t>
-      </w:r>
-      <w:r>
-        <w:rPr>
-          <w:rFonts w:ascii="Times New Roman" w:hAnsi="Times New Roman"/>
-          <w:sz w:val="24"/>
-        </w:rPr>
-        <w:t>A</w:t>
-      </w:r>
-      <w:r>
-        <w:rPr>
-          <w:rFonts w:ascii="Times New Roman" w:hAnsi="Times New Roman"/>
-          <w:i/>
-          <w:sz w:val="24"/>
-        </w:rPr>
-        <w:t xml:space="preserve"> </w:t>
-      </w:r>
-      <w:r>
-        <w:rPr>
-          <w:rFonts w:ascii="Times New Roman" w:hAnsi="Times New Roman"/>
-          <w:sz w:val="24"/>
-        </w:rPr>
-        <w:t>d</w:t>
-      </w:r>
-      <w:r>
-        <w:rPr>
-          <w:rFonts w:ascii="Times New Roman" w:hAnsi="Times New Roman"/>
-          <w:i/>
-          <w:sz w:val="24"/>
-        </w:rPr>
-        <w:t>e</w:t>
-      </w:r>
-      <w:r>
-        <w:rPr>
-          <w:rFonts w:ascii="Times New Roman" w:hAnsi="Times New Roman"/>
-          <w:i/>
-          <w:sz w:val="24"/>
-        </w:rPr>
-        <w:t>s</w:t>
-      </w:r>
-      <w:r>
-        <w:rPr>
-          <w:rFonts w:ascii="Times New Roman" w:hAnsi="Times New Roman"/>
-          <w:i/>
-          <w:sz w:val="24"/>
-        </w:rPr>
-        <w:t>c</w:t>
-      </w:r>
-      <w:r>
-        <w:rPr>
-          <w:rFonts w:ascii="Times New Roman" w:hAnsi="Times New Roman"/>
-          <w:i/>
-          <w:sz w:val="24"/>
-        </w:rPr>
-        <w:t>r</w:t>
-      </w:r>
-      <w:r>
-        <w:rPr>
-          <w:rFonts w:ascii="Times New Roman" w:hAnsi="Times New Roman"/>
-          <w:i/>
-          <w:sz w:val="24"/>
-        </w:rPr>
-        <w:t>i</w:t>
-      </w:r>
-      <w:r>
-        <w:rPr>
-          <w:rFonts w:ascii="Times New Roman" w:hAnsi="Times New Roman"/>
-          <w:sz w:val="24"/>
-        </w:rPr>
-        <w:t>çã</w:t>
-      </w:r>
-      <w:r>
-        <w:rPr>
-          <w:rFonts w:ascii="Times New Roman" w:hAnsi="Times New Roman"/>
-          <w:i/>
-          <w:sz w:val="24"/>
-        </w:rPr>
-        <w:t>o</w:t>
-      </w:r>
-      <w:r>
-        <w:rPr>
-          <w:rFonts w:ascii="Times New Roman" w:hAnsi="Times New Roman"/>
-          <w:i/>
-          <w:sz w:val="24"/>
-        </w:rPr>
-        <w:t xml:space="preserve"> </w:t>
-      </w:r>
-      <w:r>
-        <w:rPr>
-          <w:rFonts w:ascii="Times New Roman" w:hAnsi="Times New Roman"/>
-          <w:sz w:val="24"/>
-        </w:rPr>
-        <w:t>f</w:t>
-      </w:r>
-      <w:r>
-        <w:rPr>
-          <w:rFonts w:ascii="Times New Roman" w:hAnsi="Times New Roman"/>
-          <w:i/>
-          <w:sz w:val="24"/>
-        </w:rPr>
-        <w:t>o</w:t>
-      </w:r>
-      <w:r>
-        <w:rPr>
-          <w:rFonts w:ascii="Times New Roman" w:hAnsi="Times New Roman"/>
-          <w:i/>
-          <w:sz w:val="24"/>
-        </w:rPr>
-        <w:t>i</w:t>
-      </w:r>
-      <w:r>
-        <w:rPr>
-          <w:rFonts w:ascii="Times New Roman" w:hAnsi="Times New Roman"/>
-          <w:i/>
-          <w:sz w:val="24"/>
-        </w:rPr>
-        <w:t xml:space="preserve"> </w:t>
-      </w:r>
-      <w:r>
-        <w:rPr>
-          <w:rFonts w:ascii="Times New Roman" w:hAnsi="Times New Roman"/>
-          <w:i/>
-          <w:sz w:val="24"/>
-        </w:rPr>
-        <w:t>c</w:t>
-      </w:r>
-      <w:r>
-        <w:rPr>
-          <w:rFonts w:ascii="Times New Roman" w:hAnsi="Times New Roman"/>
-          <w:i/>
-          <w:sz w:val="24"/>
-        </w:rPr>
-        <w:t>o</w:t>
-      </w:r>
-      <w:r>
-        <w:rPr>
-          <w:rFonts w:ascii="Times New Roman" w:hAnsi="Times New Roman"/>
-          <w:i/>
-          <w:sz w:val="24"/>
-        </w:rPr>
-        <w:t>r</w:t>
-      </w:r>
-      <w:r>
-        <w:rPr>
-          <w:rFonts w:ascii="Times New Roman" w:hAnsi="Times New Roman"/>
-          <w:i/>
-          <w:sz w:val="24"/>
-        </w:rPr>
-        <w:t>r</w:t>
-      </w:r>
-      <w:r>
-        <w:rPr>
-          <w:rFonts w:ascii="Times New Roman" w:hAnsi="Times New Roman"/>
-          <w:i/>
-          <w:sz w:val="24"/>
-        </w:rPr>
-        <w:t>i</w:t>
-      </w:r>
-      <w:r>
-        <w:rPr>
-          <w:rFonts w:ascii="Times New Roman" w:hAnsi="Times New Roman"/>
-          <w:sz w:val="24"/>
-        </w:rPr>
-        <w:t>g</w:t>
-      </w:r>
-      <w:r>
-        <w:rPr>
-          <w:rFonts w:ascii="Times New Roman" w:hAnsi="Times New Roman"/>
-          <w:i/>
-          <w:sz w:val="24"/>
-        </w:rPr>
-        <w:t>i</w:t>
-      </w:r>
-      <w:r>
-        <w:rPr>
-          <w:rFonts w:ascii="Times New Roman" w:hAnsi="Times New Roman"/>
-          <w:sz w:val="24"/>
-        </w:rPr>
-        <w:t>da</w:t>
-      </w:r>
-      <w:r>
-        <w:rPr>
-          <w:rFonts w:ascii="Times New Roman" w:hAnsi="Times New Roman"/>
-          <w:i/>
-          <w:sz w:val="24"/>
-        </w:rPr>
-        <w:t xml:space="preserve"> </w:t>
-      </w:r>
-      <w:r>
-        <w:rPr>
-          <w:rFonts w:ascii="Times New Roman" w:hAnsi="Times New Roman"/>
-          <w:sz w:val="24"/>
-        </w:rPr>
-        <w:t>pa</w:t>
-      </w:r>
-      <w:r>
-        <w:rPr>
-          <w:rFonts w:ascii="Times New Roman" w:hAnsi="Times New Roman"/>
-          <w:i/>
-          <w:sz w:val="24"/>
-        </w:rPr>
-        <w:t>r</w:t>
-      </w:r>
-      <w:r>
-        <w:rPr>
-          <w:rFonts w:ascii="Times New Roman" w:hAnsi="Times New Roman"/>
-          <w:sz w:val="24"/>
-        </w:rPr>
-        <w:t>a</w:t>
-      </w:r>
-      <w:r>
-        <w:rPr>
-          <w:rFonts w:ascii="Times New Roman" w:hAnsi="Times New Roman"/>
-          <w:i/>
-          <w:sz w:val="24"/>
-        </w:rPr>
-        <w:t xml:space="preserve"> </w:t>
-      </w:r>
-      <w:r>
-        <w:rPr>
-          <w:rFonts w:ascii="Times New Roman" w:hAnsi="Times New Roman"/>
-          <w:i/>
-          <w:sz w:val="24"/>
-        </w:rPr>
-        <w:t>r</w:t>
-      </w:r>
-      <w:r>
-        <w:rPr>
-          <w:rFonts w:ascii="Times New Roman" w:hAnsi="Times New Roman"/>
-          <w:i/>
-          <w:sz w:val="24"/>
-        </w:rPr>
-        <w:t>e</w:t>
-      </w:r>
-      <w:r>
-        <w:rPr>
-          <w:rFonts w:ascii="Times New Roman" w:hAnsi="Times New Roman"/>
-          <w:sz w:val="24"/>
-        </w:rPr>
-        <w:t>f</w:t>
-      </w:r>
-      <w:r>
-        <w:rPr>
-          <w:rFonts w:ascii="Times New Roman" w:hAnsi="Times New Roman"/>
-          <w:i/>
-          <w:sz w:val="24"/>
-        </w:rPr>
-        <w:t>l</w:t>
-      </w:r>
-      <w:r>
-        <w:rPr>
-          <w:rFonts w:ascii="Times New Roman" w:hAnsi="Times New Roman"/>
-          <w:i/>
-          <w:sz w:val="24"/>
-        </w:rPr>
-        <w:t>e</w:t>
-      </w:r>
-      <w:r>
-        <w:rPr>
-          <w:rFonts w:ascii="Times New Roman" w:hAnsi="Times New Roman"/>
-          <w:i/>
-          <w:sz w:val="24"/>
-        </w:rPr>
-        <w:t>t</w:t>
-      </w:r>
-      <w:r>
-        <w:rPr>
-          <w:rFonts w:ascii="Times New Roman" w:hAnsi="Times New Roman"/>
-          <w:i/>
-          <w:sz w:val="24"/>
-        </w:rPr>
-        <w:t>i</w:t>
-      </w:r>
-      <w:r>
-        <w:rPr>
-          <w:rFonts w:ascii="Times New Roman" w:hAnsi="Times New Roman"/>
-          <w:i/>
-          <w:sz w:val="24"/>
-        </w:rPr>
-        <w:t>r</w:t>
-      </w:r>
-      <w:r>
-        <w:rPr>
-          <w:rFonts w:ascii="Times New Roman" w:hAnsi="Times New Roman"/>
-          <w:i/>
-          <w:sz w:val="24"/>
-        </w:rPr>
-        <w:t xml:space="preserve"> </w:t>
-      </w:r>
-      <w:r>
-        <w:rPr>
-          <w:rFonts w:ascii="Times New Roman" w:hAnsi="Times New Roman"/>
-          <w:i/>
-          <w:sz w:val="24"/>
-        </w:rPr>
-        <w:t>o</w:t>
-      </w:r>
-      <w:r>
-        <w:rPr>
-          <w:rFonts w:ascii="Times New Roman" w:hAnsi="Times New Roman"/>
-          <w:i/>
-          <w:sz w:val="24"/>
-        </w:rPr>
-        <w:t xml:space="preserve"> </w:t>
-      </w:r>
-      <w:r>
-        <w:rPr>
-          <w:rFonts w:ascii="Times New Roman" w:hAnsi="Times New Roman"/>
-          <w:i/>
-          <w:sz w:val="24"/>
-        </w:rPr>
-        <w:t>s</w:t>
-      </w:r>
-      <w:r>
-        <w:rPr>
-          <w:rFonts w:ascii="Times New Roman" w:hAnsi="Times New Roman"/>
-          <w:i/>
-          <w:sz w:val="24"/>
-        </w:rPr>
-        <w:t>c</w:t>
-      </w:r>
-      <w:r>
-        <w:rPr>
-          <w:rFonts w:ascii="Times New Roman" w:hAnsi="Times New Roman"/>
-          <w:sz w:val="24"/>
-        </w:rPr>
-        <w:t>h</w:t>
-      </w:r>
-      <w:r>
-        <w:rPr>
-          <w:rFonts w:ascii="Times New Roman" w:hAnsi="Times New Roman"/>
-          <w:i/>
-          <w:sz w:val="24"/>
-        </w:rPr>
-        <w:t>e</w:t>
-      </w:r>
-      <w:r>
-        <w:rPr>
-          <w:rFonts w:ascii="Times New Roman" w:hAnsi="Times New Roman"/>
-          <w:sz w:val="24"/>
-        </w:rPr>
-        <w:t>ma</w:t>
-      </w:r>
-      <w:r>
-        <w:rPr>
-          <w:rFonts w:ascii="Times New Roman" w:hAnsi="Times New Roman"/>
-          <w:i/>
-          <w:sz w:val="24"/>
-        </w:rPr>
-        <w:t xml:space="preserve"> </w:t>
-      </w:r>
-      <w:r>
-        <w:rPr>
-          <w:rFonts w:ascii="Times New Roman" w:hAnsi="Times New Roman"/>
-          <w:sz w:val="24"/>
-        </w:rPr>
-        <w:t>a</w:t>
-      </w:r>
-      <w:r>
-        <w:rPr>
-          <w:rFonts w:ascii="Times New Roman" w:hAnsi="Times New Roman"/>
-          <w:i/>
-          <w:sz w:val="24"/>
-        </w:rPr>
-        <w:t>t</w:t>
-      </w:r>
-      <w:r>
-        <w:rPr>
-          <w:rFonts w:ascii="Times New Roman" w:hAnsi="Times New Roman"/>
-          <w:i/>
-          <w:sz w:val="24"/>
-        </w:rPr>
-        <w:t>u</w:t>
-      </w:r>
-      <w:r>
-        <w:rPr>
-          <w:rFonts w:ascii="Times New Roman" w:hAnsi="Times New Roman"/>
-          <w:sz w:val="24"/>
-        </w:rPr>
-        <w:t>a</w:t>
-      </w:r>
-      <w:r>
-        <w:rPr>
-          <w:rFonts w:ascii="Times New Roman" w:hAnsi="Times New Roman"/>
-          <w:i/>
-          <w:sz w:val="24"/>
-        </w:rPr>
-        <w:t>l</w:t>
-      </w:r>
-      <w:r>
-        <w:rPr>
-          <w:rFonts w:ascii="Times New Roman" w:hAnsi="Times New Roman"/>
-          <w:sz w:val="24"/>
-        </w:rPr>
-        <w:t>;</w:t>
-      </w:r>
-      <w:r>
-        <w:rPr>
-          <w:rFonts w:ascii="Times New Roman" w:hAnsi="Times New Roman"/>
-          <w:i/>
-          <w:sz w:val="24"/>
-        </w:rPr>
-        <w:t xml:space="preserve"> </w:t>
-      </w:r>
-      <w:r>
-        <w:rPr>
-          <w:rFonts w:ascii="Times New Roman" w:hAnsi="Times New Roman"/>
-          <w:i/>
-          <w:sz w:val="24"/>
-        </w:rPr>
-        <w:t>v</w:t>
-      </w:r>
-      <w:r>
-        <w:rPr>
-          <w:rFonts w:ascii="Times New Roman" w:hAnsi="Times New Roman"/>
-          <w:i/>
-          <w:sz w:val="24"/>
-        </w:rPr>
-        <w:t>e</w:t>
-      </w:r>
-      <w:r>
-        <w:rPr>
-          <w:rFonts w:ascii="Times New Roman" w:hAnsi="Times New Roman"/>
-          <w:i/>
-          <w:sz w:val="24"/>
-        </w:rPr>
-        <w:t>i</w:t>
-      </w:r>
-      <w:r>
-        <w:rPr>
-          <w:rFonts w:ascii="Times New Roman" w:hAnsi="Times New Roman"/>
-          <w:i/>
-          <w:sz w:val="24"/>
-        </w:rPr>
-        <w:t>c</w:t>
-      </w:r>
-      <w:r>
-        <w:rPr>
-          <w:rFonts w:ascii="Times New Roman" w:hAnsi="Times New Roman"/>
-          <w:i/>
-          <w:sz w:val="24"/>
-        </w:rPr>
-        <w:t>u</w:t>
-      </w:r>
-      <w:r>
-        <w:rPr>
-          <w:rFonts w:ascii="Times New Roman" w:hAnsi="Times New Roman"/>
-          <w:i/>
-          <w:sz w:val="24"/>
-        </w:rPr>
-        <w:t>l</w:t>
-      </w:r>
-      <w:r>
-        <w:rPr>
-          <w:rFonts w:ascii="Times New Roman" w:hAnsi="Times New Roman"/>
-          <w:i/>
-          <w:sz w:val="24"/>
-        </w:rPr>
-        <w:t>o</w:t>
-      </w:r>
-      <w:r>
-        <w:rPr>
-          <w:rFonts w:ascii="Times New Roman" w:hAnsi="Times New Roman"/>
-          <w:i/>
-          <w:sz w:val="24"/>
-        </w:rPr>
-        <w:t>s</w:t>
-      </w:r>
-      <w:r>
-        <w:rPr>
-          <w:rFonts w:ascii="Times New Roman" w:hAnsi="Times New Roman"/>
-          <w:sz w:val="24"/>
-        </w:rPr>
-        <w:t>,</w:t>
-      </w:r>
-      <w:r>
-        <w:rPr>
-          <w:rFonts w:ascii="Times New Roman" w:hAnsi="Times New Roman"/>
-          <w:i/>
-          <w:sz w:val="24"/>
-        </w:rPr>
-        <w:t xml:space="preserve"> </w:t>
-      </w:r>
-      <w:r>
-        <w:rPr>
-          <w:rFonts w:ascii="Times New Roman" w:hAnsi="Times New Roman"/>
-          <w:sz w:val="24"/>
-        </w:rPr>
-        <w:t>n</w:t>
-      </w:r>
-      <w:r>
-        <w:rPr>
-          <w:rFonts w:ascii="Times New Roman" w:hAnsi="Times New Roman"/>
-          <w:i/>
-          <w:sz w:val="24"/>
-        </w:rPr>
-        <w:t>o</w:t>
-      </w:r>
-      <w:r>
-        <w:rPr>
-          <w:rFonts w:ascii="Times New Roman" w:hAnsi="Times New Roman"/>
-          <w:i/>
-          <w:sz w:val="24"/>
-        </w:rPr>
-        <w:t>t</w:t>
-      </w:r>
-      <w:r>
-        <w:rPr>
-          <w:rFonts w:ascii="Times New Roman" w:hAnsi="Times New Roman"/>
-          <w:i/>
-          <w:sz w:val="24"/>
-        </w:rPr>
-        <w:t>i</w:t>
-      </w:r>
-      <w:r>
-        <w:rPr>
-          <w:rFonts w:ascii="Times New Roman" w:hAnsi="Times New Roman"/>
-          <w:sz w:val="24"/>
-        </w:rPr>
-        <w:t>f</w:t>
-      </w:r>
-      <w:r>
-        <w:rPr>
-          <w:rFonts w:ascii="Times New Roman" w:hAnsi="Times New Roman"/>
-          <w:i/>
-          <w:sz w:val="24"/>
-        </w:rPr>
-        <w:t>i</w:t>
-      </w:r>
-      <w:r>
-        <w:rPr>
-          <w:rFonts w:ascii="Times New Roman" w:hAnsi="Times New Roman"/>
-          <w:i/>
-          <w:sz w:val="24"/>
-        </w:rPr>
-        <w:t>c</w:t>
-      </w:r>
-      <w:r>
-        <w:rPr>
-          <w:rFonts w:ascii="Times New Roman" w:hAnsi="Times New Roman"/>
-          <w:sz w:val="24"/>
-        </w:rPr>
-        <w:t>a</w:t>
-      </w:r>
-      <w:r>
-        <w:rPr>
-          <w:rFonts w:ascii="Times New Roman" w:hAnsi="Times New Roman"/>
-          <w:i/>
-          <w:sz w:val="24"/>
-        </w:rPr>
-        <w:t>c</w:t>
-      </w:r>
-      <w:r>
-        <w:rPr>
-          <w:rFonts w:ascii="Times New Roman" w:hAnsi="Times New Roman"/>
-          <w:i/>
-          <w:sz w:val="24"/>
-        </w:rPr>
-        <w:t>o</w:t>
-      </w:r>
-      <w:r>
-        <w:rPr>
-          <w:rFonts w:ascii="Times New Roman" w:hAnsi="Times New Roman"/>
-          <w:i/>
-          <w:sz w:val="24"/>
-        </w:rPr>
-        <w:t>e</w:t>
-      </w:r>
-      <w:r>
-        <w:rPr>
-          <w:rFonts w:ascii="Times New Roman" w:hAnsi="Times New Roman"/>
-          <w:i/>
-          <w:sz w:val="24"/>
-        </w:rPr>
-        <w:t>s</w:t>
-      </w:r>
-      <w:r>
-        <w:rPr>
-          <w:rFonts w:ascii="Times New Roman" w:hAnsi="Times New Roman"/>
-          <w:i/>
-          <w:sz w:val="24"/>
-        </w:rPr>
-        <w:t xml:space="preserve"> </w:t>
-      </w:r>
-      <w:r>
-        <w:rPr>
-          <w:rFonts w:ascii="Times New Roman" w:hAnsi="Times New Roman"/>
-          <w:i/>
-          <w:sz w:val="24"/>
-        </w:rPr>
-        <w:t>e</w:t>
-      </w:r>
-      <w:r>
-        <w:rPr>
-          <w:rFonts w:ascii="Times New Roman" w:hAnsi="Times New Roman"/>
-          <w:i/>
-          <w:sz w:val="24"/>
-        </w:rPr>
-        <w:t xml:space="preserve"> </w:t>
-      </w:r>
-      <w:r>
-        <w:rPr>
-          <w:rFonts w:ascii="Times New Roman" w:hAnsi="Times New Roman"/>
-          <w:sz w:val="24"/>
-        </w:rPr>
-        <w:t>m</w:t>
-      </w:r>
-      <w:r>
-        <w:rPr>
-          <w:rFonts w:ascii="Times New Roman" w:hAnsi="Times New Roman"/>
-          <w:i/>
-          <w:sz w:val="24"/>
-        </w:rPr>
-        <w:t>e</w:t>
-      </w:r>
-      <w:r>
-        <w:rPr>
-          <w:rFonts w:ascii="Times New Roman" w:hAnsi="Times New Roman"/>
-          <w:sz w:val="24"/>
-        </w:rPr>
-        <w:t>n</w:t>
-      </w:r>
-      <w:r>
-        <w:rPr>
-          <w:rFonts w:ascii="Times New Roman" w:hAnsi="Times New Roman"/>
-          <w:i/>
-          <w:sz w:val="24"/>
-        </w:rPr>
-        <w:t>s</w:t>
-      </w:r>
-      <w:r>
-        <w:rPr>
-          <w:rFonts w:ascii="Times New Roman" w:hAnsi="Times New Roman"/>
-          <w:sz w:val="24"/>
-        </w:rPr>
-        <w:t>ag</w:t>
-      </w:r>
-      <w:r>
-        <w:rPr>
-          <w:rFonts w:ascii="Times New Roman" w:hAnsi="Times New Roman"/>
-          <w:i/>
-          <w:sz w:val="24"/>
-        </w:rPr>
-        <w:t>e</w:t>
-      </w:r>
-      <w:r>
-        <w:rPr>
-          <w:rFonts w:ascii="Times New Roman" w:hAnsi="Times New Roman"/>
-          <w:sz w:val="24"/>
-        </w:rPr>
-        <w:t>n</w:t>
-      </w:r>
-      <w:r>
-        <w:rPr>
-          <w:rFonts w:ascii="Times New Roman" w:hAnsi="Times New Roman"/>
-          <w:i/>
-          <w:sz w:val="24"/>
-        </w:rPr>
-        <w:t>s</w:t>
-      </w:r>
-      <w:r>
-        <w:rPr>
-          <w:rFonts w:ascii="Times New Roman" w:hAnsi="Times New Roman"/>
-          <w:sz w:val="24"/>
-        </w:rPr>
-        <w:t>_</w:t>
-      </w:r>
-      <w:r>
-        <w:rPr>
-          <w:rFonts w:ascii="Times New Roman" w:hAnsi="Times New Roman"/>
-          <w:i/>
-          <w:sz w:val="24"/>
-        </w:rPr>
-        <w:t>c</w:t>
-      </w:r>
-      <w:r>
-        <w:rPr>
-          <w:rFonts w:ascii="Times New Roman" w:hAnsi="Times New Roman"/>
-          <w:i/>
-          <w:sz w:val="24"/>
-        </w:rPr>
-        <w:t>o</w:t>
-      </w:r>
-      <w:r>
-        <w:rPr>
-          <w:rFonts w:ascii="Times New Roman" w:hAnsi="Times New Roman"/>
-          <w:sz w:val="24"/>
-        </w:rPr>
-        <w:t>n</w:t>
-      </w:r>
-      <w:r>
-        <w:rPr>
-          <w:rFonts w:ascii="Times New Roman" w:hAnsi="Times New Roman"/>
-          <w:i/>
-          <w:sz w:val="24"/>
-        </w:rPr>
-        <w:t>t</w:t>
-      </w:r>
-      <w:r>
-        <w:rPr>
-          <w:rFonts w:ascii="Times New Roman" w:hAnsi="Times New Roman"/>
-          <w:sz w:val="24"/>
-        </w:rPr>
-        <w:t>a</w:t>
-      </w:r>
-      <w:r>
-        <w:rPr>
-          <w:rFonts w:ascii="Times New Roman" w:hAnsi="Times New Roman"/>
-          <w:i/>
-          <w:sz w:val="24"/>
-        </w:rPr>
-        <w:t>t</w:t>
-      </w:r>
-      <w:r>
-        <w:rPr>
-          <w:rFonts w:ascii="Times New Roman" w:hAnsi="Times New Roman"/>
-          <w:i/>
-          <w:sz w:val="24"/>
-        </w:rPr>
-        <w:t>o</w:t>
-      </w:r>
-      <w:r>
-        <w:rPr>
-          <w:rFonts w:ascii="Times New Roman" w:hAnsi="Times New Roman"/>
-          <w:i/>
-          <w:sz w:val="24"/>
-        </w:rPr>
-        <w:t xml:space="preserve"> </w:t>
-      </w:r>
-      <w:r>
-        <w:rPr>
-          <w:rFonts w:ascii="Times New Roman" w:hAnsi="Times New Roman"/>
-          <w:sz w:val="24"/>
-        </w:rPr>
-        <w:t>nã</w:t>
-      </w:r>
-      <w:r>
-        <w:rPr>
-          <w:rFonts w:ascii="Times New Roman" w:hAnsi="Times New Roman"/>
-          <w:i/>
-          <w:sz w:val="24"/>
-        </w:rPr>
-        <w:t>o</w:t>
-      </w:r>
-      <w:r>
-        <w:rPr>
-          <w:rFonts w:ascii="Times New Roman" w:hAnsi="Times New Roman"/>
-          <w:i/>
-          <w:sz w:val="24"/>
-        </w:rPr>
-        <w:t xml:space="preserve"> </w:t>
-      </w:r>
-      <w:r>
-        <w:rPr>
-          <w:rFonts w:ascii="Times New Roman" w:hAnsi="Times New Roman"/>
-          <w:i/>
-          <w:sz w:val="24"/>
-        </w:rPr>
-        <w:t>s</w:t>
-      </w:r>
-      <w:r>
-        <w:rPr>
-          <w:rFonts w:ascii="Times New Roman" w:hAnsi="Times New Roman"/>
-          <w:sz w:val="24"/>
-        </w:rPr>
-        <w:t>ã</w:t>
-      </w:r>
-      <w:r>
-        <w:rPr>
-          <w:rFonts w:ascii="Times New Roman" w:hAnsi="Times New Roman"/>
-          <w:i/>
-          <w:sz w:val="24"/>
-        </w:rPr>
-        <w:t>o</w:t>
-      </w:r>
-      <w:r>
-        <w:rPr>
-          <w:rFonts w:ascii="Times New Roman" w:hAnsi="Times New Roman"/>
-          <w:i/>
-          <w:sz w:val="24"/>
-        </w:rPr>
-        <w:t xml:space="preserve"> </w:t>
-      </w:r>
-      <w:r>
-        <w:rPr>
-          <w:rFonts w:ascii="Times New Roman" w:hAnsi="Times New Roman"/>
-          <w:i/>
-          <w:sz w:val="24"/>
-        </w:rPr>
-        <w:t>t</w:t>
-      </w:r>
-      <w:r>
-        <w:rPr>
-          <w:rFonts w:ascii="Times New Roman" w:hAnsi="Times New Roman"/>
-          <w:i/>
-          <w:sz w:val="24"/>
-        </w:rPr>
-        <w:t>r</w:t>
-      </w:r>
-      <w:r>
-        <w:rPr>
-          <w:rFonts w:ascii="Times New Roman" w:hAnsi="Times New Roman"/>
-          <w:sz w:val="24"/>
-        </w:rPr>
-        <w:t>a</w:t>
-      </w:r>
-      <w:r>
-        <w:rPr>
-          <w:rFonts w:ascii="Times New Roman" w:hAnsi="Times New Roman"/>
-          <w:i/>
-          <w:sz w:val="24"/>
-        </w:rPr>
-        <w:t>t</w:t>
-      </w:r>
-      <w:r>
-        <w:rPr>
-          <w:rFonts w:ascii="Times New Roman" w:hAnsi="Times New Roman"/>
-          <w:sz w:val="24"/>
-        </w:rPr>
-        <w:t>ada</w:t>
-      </w:r>
-      <w:r>
-        <w:rPr>
-          <w:rFonts w:ascii="Times New Roman" w:hAnsi="Times New Roman"/>
-          <w:i/>
-          <w:sz w:val="24"/>
-        </w:rPr>
-        <w:t>s</w:t>
-      </w:r>
-      <w:r>
-        <w:rPr>
-          <w:rFonts w:ascii="Times New Roman" w:hAnsi="Times New Roman"/>
-          <w:i/>
-          <w:sz w:val="24"/>
-        </w:rPr>
-        <w:t xml:space="preserve"> </w:t>
-      </w:r>
-      <w:r>
-        <w:rPr>
-          <w:rFonts w:ascii="Times New Roman" w:hAnsi="Times New Roman"/>
-          <w:i/>
-          <w:sz w:val="24"/>
-        </w:rPr>
-        <w:t>c</w:t>
-      </w:r>
-      <w:r>
-        <w:rPr>
-          <w:rFonts w:ascii="Times New Roman" w:hAnsi="Times New Roman"/>
-          <w:i/>
-          <w:sz w:val="24"/>
-        </w:rPr>
-        <w:t>o</w:t>
-      </w:r>
-      <w:r>
-        <w:rPr>
-          <w:rFonts w:ascii="Times New Roman" w:hAnsi="Times New Roman"/>
-          <w:sz w:val="24"/>
-        </w:rPr>
-        <w:t>m</w:t>
-      </w:r>
-      <w:r>
-        <w:rPr>
-          <w:rFonts w:ascii="Times New Roman" w:hAnsi="Times New Roman"/>
-          <w:i/>
-          <w:sz w:val="24"/>
-        </w:rPr>
-        <w:t>o</w:t>
-      </w:r>
-      <w:r>
-        <w:rPr>
-          <w:rFonts w:ascii="Times New Roman" w:hAnsi="Times New Roman"/>
-          <w:i/>
-          <w:sz w:val="24"/>
-        </w:rPr>
-        <w:t xml:space="preserve"> </w:t>
-      </w:r>
-      <w:r>
-        <w:rPr>
-          <w:rFonts w:ascii="Times New Roman" w:hAnsi="Times New Roman"/>
-          <w:i/>
-          <w:sz w:val="24"/>
-        </w:rPr>
-        <w:t>e</w:t>
-      </w:r>
-      <w:r>
-        <w:rPr>
-          <w:rFonts w:ascii="Times New Roman" w:hAnsi="Times New Roman"/>
-          <w:sz w:val="24"/>
-        </w:rPr>
-        <w:t>n</w:t>
-      </w:r>
-      <w:r>
-        <w:rPr>
-          <w:rFonts w:ascii="Times New Roman" w:hAnsi="Times New Roman"/>
-          <w:i/>
-          <w:sz w:val="24"/>
-        </w:rPr>
-        <w:t>t</w:t>
-      </w:r>
-      <w:r>
-        <w:rPr>
-          <w:rFonts w:ascii="Times New Roman" w:hAnsi="Times New Roman"/>
-          <w:i/>
-          <w:sz w:val="24"/>
-        </w:rPr>
-        <w:t>i</w:t>
-      </w:r>
-      <w:r>
-        <w:rPr>
-          <w:rFonts w:ascii="Times New Roman" w:hAnsi="Times New Roman"/>
-          <w:sz w:val="24"/>
-        </w:rPr>
-        <w:t>dad</w:t>
-      </w:r>
-      <w:r>
-        <w:rPr>
-          <w:rFonts w:ascii="Times New Roman" w:hAnsi="Times New Roman"/>
-          <w:i/>
-          <w:sz w:val="24"/>
-        </w:rPr>
-        <w:t>e</w:t>
-      </w:r>
-      <w:r>
-        <w:rPr>
-          <w:rFonts w:ascii="Times New Roman" w:hAnsi="Times New Roman"/>
-          <w:i/>
-          <w:sz w:val="24"/>
-        </w:rPr>
-        <w:t>s</w:t>
-      </w:r>
-      <w:r>
-        <w:rPr>
-          <w:rFonts w:ascii="Times New Roman" w:hAnsi="Times New Roman"/>
-          <w:i/>
-          <w:sz w:val="24"/>
-        </w:rPr>
-        <w:t xml:space="preserve"> </w:t>
-      </w:r>
-      <w:r>
-        <w:rPr>
-          <w:rFonts w:ascii="Times New Roman" w:hAnsi="Times New Roman"/>
-          <w:i/>
-          <w:sz w:val="24"/>
-        </w:rPr>
-        <w:t>c</w:t>
-      </w:r>
-      <w:r>
-        <w:rPr>
-          <w:rFonts w:ascii="Times New Roman" w:hAnsi="Times New Roman"/>
-          <w:i/>
-          <w:sz w:val="24"/>
-        </w:rPr>
-        <w:t>e</w:t>
-      </w:r>
-      <w:r>
-        <w:rPr>
-          <w:rFonts w:ascii="Times New Roman" w:hAnsi="Times New Roman"/>
-          <w:sz w:val="24"/>
-        </w:rPr>
-        <w:t>n</w:t>
-      </w:r>
-      <w:r>
-        <w:rPr>
-          <w:rFonts w:ascii="Times New Roman" w:hAnsi="Times New Roman"/>
-          <w:i/>
-          <w:sz w:val="24"/>
-        </w:rPr>
-        <w:t>t</w:t>
-      </w:r>
-      <w:r>
-        <w:rPr>
-          <w:rFonts w:ascii="Times New Roman" w:hAnsi="Times New Roman"/>
-          <w:i/>
-          <w:sz w:val="24"/>
-        </w:rPr>
-        <w:t>r</w:t>
-      </w:r>
-      <w:r>
-        <w:rPr>
-          <w:rFonts w:ascii="Times New Roman" w:hAnsi="Times New Roman"/>
-          <w:sz w:val="24"/>
-        </w:rPr>
-        <w:t>a</w:t>
-      </w:r>
-      <w:r>
-        <w:rPr>
-          <w:rFonts w:ascii="Times New Roman" w:hAnsi="Times New Roman"/>
-          <w:i/>
-          <w:sz w:val="24"/>
-        </w:rPr>
-        <w:t>i</w:t>
-      </w:r>
-      <w:r>
-        <w:rPr>
-          <w:rFonts w:ascii="Times New Roman" w:hAnsi="Times New Roman"/>
-          <w:i/>
-          <w:sz w:val="24"/>
-        </w:rPr>
-        <w:t>s</w:t>
-      </w:r>
-      <w:r>
-        <w:rPr>
-          <w:rFonts w:ascii="Times New Roman" w:hAnsi="Times New Roman"/>
-          <w:sz w:val="24"/>
-        </w:rPr>
-        <w:t>.</w:t>
-      </w:r>
-      <w:r>
-        <w:rPr>
-          <w:rFonts w:ascii="Times New Roman" w:hAnsi="Times New Roman"/>
-          <w:i/>
-          <w:sz w:val="24"/>
-        </w:rPr>
-        <w:t xml:space="preserve"> </w:t>
-      </w:r>
-      <w:r>
-        <w:rPr>
-          <w:rFonts w:ascii="Times New Roman" w:hAnsi="Times New Roman"/>
-          <w:i/>
-          <w:sz w:val="24"/>
-        </w:rPr>
-        <w:t>C</w:t>
-      </w:r>
-      <w:r>
-        <w:rPr>
-          <w:rFonts w:ascii="Times New Roman" w:hAnsi="Times New Roman"/>
-          <w:sz w:val="24"/>
-        </w:rPr>
-        <w:t>ha</w:t>
-      </w:r>
-      <w:r>
-        <w:rPr>
-          <w:rFonts w:ascii="Times New Roman" w:hAnsi="Times New Roman"/>
-          <w:i/>
-          <w:sz w:val="24"/>
-        </w:rPr>
-        <w:t>v</w:t>
-      </w:r>
-      <w:r>
-        <w:rPr>
-          <w:rFonts w:ascii="Times New Roman" w:hAnsi="Times New Roman"/>
-          <w:i/>
-          <w:sz w:val="24"/>
-        </w:rPr>
-        <w:t>e</w:t>
-      </w:r>
-      <w:r>
-        <w:rPr>
-          <w:rFonts w:ascii="Times New Roman" w:hAnsi="Times New Roman"/>
-          <w:i/>
-          <w:sz w:val="24"/>
-        </w:rPr>
-        <w:t>s</w:t>
-      </w:r>
-      <w:r>
-        <w:rPr>
-          <w:rFonts w:ascii="Times New Roman" w:hAnsi="Times New Roman"/>
-          <w:i/>
-          <w:sz w:val="24"/>
-        </w:rPr>
-        <w:t xml:space="preserve"> </w:t>
-      </w:r>
-      <w:r>
-        <w:rPr>
-          <w:rFonts w:ascii="Times New Roman" w:hAnsi="Times New Roman"/>
-          <w:i/>
-          <w:sz w:val="24"/>
-        </w:rPr>
-        <w:t>e</w:t>
-      </w:r>
-      <w:r>
-        <w:rPr>
-          <w:rFonts w:ascii="Times New Roman" w:hAnsi="Times New Roman"/>
-          <w:i/>
-          <w:sz w:val="24"/>
-        </w:rPr>
-        <w:t xml:space="preserve"> </w:t>
-      </w:r>
-      <w:r>
-        <w:rPr>
-          <w:rFonts w:ascii="Times New Roman" w:hAnsi="Times New Roman"/>
-          <w:sz w:val="24"/>
-        </w:rPr>
-        <w:t>p</w:t>
-      </w:r>
-      <w:r>
-        <w:rPr>
-          <w:rFonts w:ascii="Times New Roman" w:hAnsi="Times New Roman"/>
-          <w:i/>
-          <w:sz w:val="24"/>
-        </w:rPr>
-        <w:t>o</w:t>
-      </w:r>
-      <w:r>
-        <w:rPr>
-          <w:rFonts w:ascii="Times New Roman" w:hAnsi="Times New Roman"/>
-          <w:i/>
-          <w:sz w:val="24"/>
-        </w:rPr>
-        <w:t>l</w:t>
-      </w:r>
-      <w:r>
-        <w:rPr>
-          <w:rFonts w:ascii="Times New Roman" w:hAnsi="Times New Roman"/>
-          <w:sz w:val="24"/>
-        </w:rPr>
-        <w:t>í</w:t>
-      </w:r>
-      <w:r>
-        <w:rPr>
-          <w:rFonts w:ascii="Times New Roman" w:hAnsi="Times New Roman"/>
-          <w:i/>
-          <w:sz w:val="24"/>
-        </w:rPr>
-        <w:t>t</w:t>
-      </w:r>
-      <w:r>
-        <w:rPr>
-          <w:rFonts w:ascii="Times New Roman" w:hAnsi="Times New Roman"/>
-          <w:i/>
-          <w:sz w:val="24"/>
-        </w:rPr>
-        <w:t>i</w:t>
-      </w:r>
-      <w:r>
-        <w:rPr>
-          <w:rFonts w:ascii="Times New Roman" w:hAnsi="Times New Roman"/>
-          <w:i/>
-          <w:sz w:val="24"/>
-        </w:rPr>
-        <w:t>c</w:t>
-      </w:r>
-      <w:r>
-        <w:rPr>
-          <w:rFonts w:ascii="Times New Roman" w:hAnsi="Times New Roman"/>
-          <w:sz w:val="24"/>
-        </w:rPr>
-        <w:t>a</w:t>
-      </w:r>
-      <w:r>
-        <w:rPr>
-          <w:rFonts w:ascii="Times New Roman" w:hAnsi="Times New Roman"/>
-          <w:i/>
-          <w:sz w:val="24"/>
-        </w:rPr>
-        <w:t>s</w:t>
-      </w:r>
-      <w:r>
-        <w:rPr>
-          <w:rFonts w:ascii="Times New Roman" w:hAnsi="Times New Roman"/>
-          <w:i/>
-          <w:sz w:val="24"/>
-        </w:rPr>
-        <w:t xml:space="preserve"> </w:t>
-      </w:r>
-      <w:r>
-        <w:rPr>
-          <w:rFonts w:ascii="Times New Roman" w:hAnsi="Times New Roman"/>
-          <w:sz w:val="24"/>
-        </w:rPr>
-        <w:t>d</w:t>
-      </w:r>
-      <w:r>
-        <w:rPr>
-          <w:rFonts w:ascii="Times New Roman" w:hAnsi="Times New Roman"/>
-          <w:i/>
-          <w:sz w:val="24"/>
-        </w:rPr>
-        <w:t>e</w:t>
-      </w:r>
-      <w:r>
-        <w:rPr>
-          <w:rFonts w:ascii="Times New Roman" w:hAnsi="Times New Roman"/>
-          <w:i/>
-          <w:sz w:val="24"/>
-        </w:rPr>
-        <w:t xml:space="preserve"> </w:t>
-      </w:r>
-      <w:r>
-        <w:rPr>
-          <w:rFonts w:ascii="Times New Roman" w:hAnsi="Times New Roman"/>
-          <w:i/>
-          <w:sz w:val="24"/>
-        </w:rPr>
-        <w:t>R</w:t>
-      </w:r>
-      <w:r>
-        <w:rPr>
-          <w:rFonts w:ascii="Times New Roman" w:hAnsi="Times New Roman"/>
-          <w:i/>
-          <w:sz w:val="24"/>
-        </w:rPr>
-        <w:t>o</w:t>
-      </w:r>
-      <w:r>
-        <w:rPr>
-          <w:rFonts w:ascii="Times New Roman" w:hAnsi="Times New Roman"/>
-          <w:i/>
-          <w:sz w:val="24"/>
-        </w:rPr>
-        <w:t>w</w:t>
-      </w:r>
-      <w:r>
-        <w:rPr>
-          <w:rFonts w:ascii="Times New Roman" w:hAnsi="Times New Roman"/>
-          <w:i/>
-          <w:sz w:val="24"/>
-        </w:rPr>
-        <w:t xml:space="preserve"> </w:t>
-      </w:r>
-      <w:r>
-        <w:rPr>
-          <w:rFonts w:ascii="Times New Roman" w:hAnsi="Times New Roman"/>
-          <w:i/>
-          <w:sz w:val="24"/>
-        </w:rPr>
-        <w:t>L</w:t>
-      </w:r>
-      <w:r>
-        <w:rPr>
-          <w:rFonts w:ascii="Times New Roman" w:hAnsi="Times New Roman"/>
-          <w:i/>
-          <w:sz w:val="24"/>
-        </w:rPr>
-        <w:t>e</w:t>
-      </w:r>
-      <w:r>
-        <w:rPr>
-          <w:rFonts w:ascii="Times New Roman" w:hAnsi="Times New Roman"/>
-          <w:i/>
-          <w:sz w:val="24"/>
-        </w:rPr>
-        <w:t>v</w:t>
-      </w:r>
-      <w:r>
-        <w:rPr>
-          <w:rFonts w:ascii="Times New Roman" w:hAnsi="Times New Roman"/>
-          <w:i/>
-          <w:sz w:val="24"/>
-        </w:rPr>
-        <w:t>e</w:t>
-      </w:r>
-      <w:r>
-        <w:rPr>
-          <w:rFonts w:ascii="Times New Roman" w:hAnsi="Times New Roman"/>
-          <w:i/>
-          <w:sz w:val="24"/>
-        </w:rPr>
-        <w:t>l</w:t>
-      </w:r>
-      <w:r>
-        <w:rPr>
-          <w:rFonts w:ascii="Times New Roman" w:hAnsi="Times New Roman"/>
-          <w:i/>
-          <w:sz w:val="24"/>
-        </w:rPr>
-        <w:t xml:space="preserve"> </w:t>
-      </w:r>
-      <w:r>
-        <w:rPr>
-          <w:rFonts w:ascii="Times New Roman" w:hAnsi="Times New Roman"/>
-          <w:i/>
-          <w:sz w:val="24"/>
-        </w:rPr>
-        <w:t>S</w:t>
-      </w:r>
-      <w:r>
-        <w:rPr>
-          <w:rFonts w:ascii="Times New Roman" w:hAnsi="Times New Roman"/>
-          <w:i/>
-          <w:sz w:val="24"/>
-        </w:rPr>
-        <w:t>e</w:t>
-      </w:r>
-      <w:r>
-        <w:rPr>
-          <w:rFonts w:ascii="Times New Roman" w:hAnsi="Times New Roman"/>
-          <w:i/>
-          <w:sz w:val="24"/>
-        </w:rPr>
-        <w:t>c</w:t>
-      </w:r>
-      <w:r>
-        <w:rPr>
-          <w:rFonts w:ascii="Times New Roman" w:hAnsi="Times New Roman"/>
-          <w:i/>
-          <w:sz w:val="24"/>
-        </w:rPr>
-        <w:t>u</w:t>
-      </w:r>
-      <w:r>
-        <w:rPr>
-          <w:rFonts w:ascii="Times New Roman" w:hAnsi="Times New Roman"/>
-          <w:i/>
-          <w:sz w:val="24"/>
-        </w:rPr>
-        <w:t>r</w:t>
-      </w:r>
-      <w:r>
-        <w:rPr>
-          <w:rFonts w:ascii="Times New Roman" w:hAnsi="Times New Roman"/>
-          <w:i/>
-          <w:sz w:val="24"/>
-        </w:rPr>
-        <w:t>i</w:t>
-      </w:r>
-      <w:r>
-        <w:rPr>
-          <w:rFonts w:ascii="Times New Roman" w:hAnsi="Times New Roman"/>
-          <w:i/>
-          <w:sz w:val="24"/>
-        </w:rPr>
-        <w:t>t</w:t>
-      </w:r>
-      <w:r>
-        <w:rPr>
-          <w:rFonts w:ascii="Times New Roman" w:hAnsi="Times New Roman"/>
-          <w:i/>
-          <w:sz w:val="24"/>
-        </w:rPr>
-        <w:t>y</w:t>
-      </w:r>
-      <w:r>
-        <w:rPr>
-          <w:rFonts w:ascii="Times New Roman" w:hAnsi="Times New Roman"/>
-          <w:i/>
-          <w:sz w:val="24"/>
-        </w:rPr>
-        <w:t xml:space="preserve"> </w:t>
-      </w:r>
-      <w:r>
-        <w:rPr>
-          <w:rFonts w:ascii="Times New Roman" w:hAnsi="Times New Roman"/>
-          <w:i/>
-          <w:sz w:val="24"/>
-        </w:rPr>
-        <w:t>o</w:t>
-      </w:r>
-      <w:r>
-        <w:rPr>
-          <w:rFonts w:ascii="Times New Roman" w:hAnsi="Times New Roman"/>
-          <w:i/>
-          <w:sz w:val="24"/>
-        </w:rPr>
-        <w:t>r</w:t>
-      </w:r>
-      <w:r>
-        <w:rPr>
-          <w:rFonts w:ascii="Times New Roman" w:hAnsi="Times New Roman"/>
-          <w:sz w:val="24"/>
-        </w:rPr>
-        <w:t>gan</w:t>
-      </w:r>
-      <w:r>
-        <w:rPr>
-          <w:rFonts w:ascii="Times New Roman" w:hAnsi="Times New Roman"/>
-          <w:i/>
-          <w:sz w:val="24"/>
-        </w:rPr>
-        <w:t>i</w:t>
-      </w:r>
-      <w:r>
-        <w:rPr>
-          <w:rFonts w:ascii="Times New Roman" w:hAnsi="Times New Roman"/>
-          <w:sz w:val="24"/>
-        </w:rPr>
-        <w:t>zam</w:t>
-      </w:r>
-      <w:r>
-        <w:rPr>
-          <w:rFonts w:ascii="Times New Roman" w:hAnsi="Times New Roman"/>
-          <w:i/>
-          <w:sz w:val="24"/>
-        </w:rPr>
-        <w:t xml:space="preserve"> </w:t>
-      </w:r>
-      <w:r>
-        <w:rPr>
-          <w:rFonts w:ascii="Times New Roman" w:hAnsi="Times New Roman"/>
-          <w:i/>
-          <w:sz w:val="24"/>
-        </w:rPr>
-        <w:t>i</w:t>
-      </w:r>
-      <w:r>
-        <w:rPr>
-          <w:rFonts w:ascii="Times New Roman" w:hAnsi="Times New Roman"/>
-          <w:sz w:val="24"/>
-        </w:rPr>
-        <w:t>n</w:t>
-      </w:r>
-      <w:r>
-        <w:rPr>
-          <w:rFonts w:ascii="Times New Roman" w:hAnsi="Times New Roman"/>
-          <w:i/>
-          <w:sz w:val="24"/>
-        </w:rPr>
-        <w:t>t</w:t>
-      </w:r>
-      <w:r>
-        <w:rPr>
-          <w:rFonts w:ascii="Times New Roman" w:hAnsi="Times New Roman"/>
-          <w:i/>
-          <w:sz w:val="24"/>
-        </w:rPr>
-        <w:t>e</w:t>
-      </w:r>
-      <w:r>
-        <w:rPr>
-          <w:rFonts w:ascii="Times New Roman" w:hAnsi="Times New Roman"/>
-          <w:sz w:val="24"/>
-        </w:rPr>
-        <w:t>g</w:t>
-      </w:r>
-      <w:r>
-        <w:rPr>
-          <w:rFonts w:ascii="Times New Roman" w:hAnsi="Times New Roman"/>
-          <w:i/>
-          <w:sz w:val="24"/>
-        </w:rPr>
-        <w:t>r</w:t>
-      </w:r>
-      <w:r>
-        <w:rPr>
-          <w:rFonts w:ascii="Times New Roman" w:hAnsi="Times New Roman"/>
-          <w:i/>
-          <w:sz w:val="24"/>
-        </w:rPr>
-        <w:t>i</w:t>
-      </w:r>
-      <w:r>
-        <w:rPr>
-          <w:rFonts w:ascii="Times New Roman" w:hAnsi="Times New Roman"/>
-          <w:sz w:val="24"/>
-        </w:rPr>
-        <w:t>dad</w:t>
-      </w:r>
-      <w:r>
-        <w:rPr>
-          <w:rFonts w:ascii="Times New Roman" w:hAnsi="Times New Roman"/>
-          <w:i/>
-          <w:sz w:val="24"/>
-        </w:rPr>
-        <w:t>e</w:t>
-      </w:r>
-      <w:r>
-        <w:rPr>
-          <w:rFonts w:ascii="Times New Roman" w:hAnsi="Times New Roman"/>
-          <w:i/>
-          <w:sz w:val="24"/>
-        </w:rPr>
-        <w:t xml:space="preserve"> </w:t>
-      </w:r>
-      <w:r>
-        <w:rPr>
-          <w:rFonts w:ascii="Times New Roman" w:hAnsi="Times New Roman"/>
-          <w:i/>
-          <w:sz w:val="24"/>
-        </w:rPr>
-        <w:t>e</w:t>
-      </w:r>
-      <w:r>
-        <w:rPr>
-          <w:rFonts w:ascii="Times New Roman" w:hAnsi="Times New Roman"/>
-          <w:i/>
-          <w:sz w:val="24"/>
-        </w:rPr>
-        <w:t xml:space="preserve"> </w:t>
-      </w:r>
-      <w:r>
-        <w:rPr>
-          <w:rFonts w:ascii="Times New Roman" w:hAnsi="Times New Roman"/>
-          <w:sz w:val="24"/>
-        </w:rPr>
-        <w:t>a</w:t>
-      </w:r>
-      <w:r>
-        <w:rPr>
-          <w:rFonts w:ascii="Times New Roman" w:hAnsi="Times New Roman"/>
-          <w:i/>
-          <w:sz w:val="24"/>
-        </w:rPr>
-        <w:t>c</w:t>
-      </w:r>
-      <w:r>
-        <w:rPr>
-          <w:rFonts w:ascii="Times New Roman" w:hAnsi="Times New Roman"/>
-          <w:i/>
-          <w:sz w:val="24"/>
-        </w:rPr>
-        <w:t>e</w:t>
-      </w:r>
-      <w:r>
-        <w:rPr>
-          <w:rFonts w:ascii="Times New Roman" w:hAnsi="Times New Roman"/>
-          <w:i/>
-          <w:sz w:val="24"/>
-        </w:rPr>
-        <w:t>s</w:t>
-      </w:r>
-      <w:r>
-        <w:rPr>
-          <w:rFonts w:ascii="Times New Roman" w:hAnsi="Times New Roman"/>
-          <w:i/>
-          <w:sz w:val="24"/>
-        </w:rPr>
-        <w:t>s</w:t>
-      </w:r>
-      <w:r>
-        <w:rPr>
-          <w:rFonts w:ascii="Times New Roman" w:hAnsi="Times New Roman"/>
-          <w:i/>
-          <w:sz w:val="24"/>
-        </w:rPr>
-        <w:t>o</w:t>
-      </w:r>
-      <w:r>
-        <w:rPr>
-          <w:rFonts w:ascii="Times New Roman" w:hAnsi="Times New Roman"/>
-          <w:sz w:val="24"/>
-        </w:rPr>
-        <w:t>.</w:t>
+        <w:t>O schema em supabase/migrations apresenta como entidades centrais usuarios, anuncios, marcas, modelos, versoes, fotos_anuncio, favoritos, curtidas_anuncio, mensagens, notificacoes, conversas, denuncias, seguidores e config_usuario. A descrição foi corrigida para refletir o schema atual. Chaves e políticas de Row Level Security organizam integridade e acesso. As imagens de anúncios e as imagens privadas de conversas possuem tratamentos distintos no Supabase Storage.</w:t>
       </w:r>
     </w:p>
     <w:p>
@@ -17651,56 +14542,7 @@
         <w:jc w:val="both"/>
       </w:pPr>
       <w:r>
-        <w:rPr>
-          <w:rFonts w:ascii="Times New Roman" w:hAnsi="Times New Roman"/>
-          <w:sz w:val="24"/>
-        </w:rPr>
-        <w:t xml:space="preserve">A implementação priorizou autenticação, anúncios, busca, administração e comunicação. Os módulos priorizados foram implementados, verificados e refinados conforme o escopo efetivamente disponível. A integração com o </w:t>
-      </w:r>
-      <w:r>
-        <w:rPr>
-          <w:rFonts w:ascii="Times New Roman" w:hAnsi="Times New Roman"/>
-          <w:i/>
-          <w:sz w:val="24"/>
-        </w:rPr>
-        <w:t>Chatling</w:t>
-      </w:r>
-      <w:r>
-        <w:rPr>
-          <w:rFonts w:ascii="Times New Roman" w:hAnsi="Times New Roman"/>
-          <w:sz w:val="24"/>
-        </w:rPr>
-        <w:t xml:space="preserve"> foi realizada no </w:t>
-      </w:r>
-      <w:r>
-        <w:rPr>
-          <w:rFonts w:ascii="Times New Roman" w:hAnsi="Times New Roman"/>
-          <w:i/>
-          <w:sz w:val="24"/>
-        </w:rPr>
-        <w:t>front-end</w:t>
-      </w:r>
-      <w:r>
-        <w:rPr>
-          <w:rFonts w:ascii="Times New Roman" w:hAnsi="Times New Roman"/>
-          <w:sz w:val="24"/>
-        </w:rPr>
-        <w:t xml:space="preserve"> por meio do script </w:t>
-      </w:r>
-      <w:r>
-        <w:rPr>
-          <w:rFonts w:ascii="Times New Roman" w:hAnsi="Times New Roman"/>
-          <w:i/>
-          <w:sz w:val="24"/>
-        </w:rPr>
-        <w:t>JavaScript</w:t>
-      </w:r>
-      <w:r>
-        <w:rPr>
-          <w:rFonts w:ascii="Times New Roman" w:hAnsi="Times New Roman"/>
-          <w:sz w:val="24"/>
-        </w:rPr>
-        <w:t xml:space="preserve"> do serviço.</w:t>
+        <w:t>A implementação priorizou autenticação, anúncios, busca, administração e comunicação. Os módulos priorizados foram implementados, verificados e refinados conforme o escopo efetivamente disponível. A integração com o Chatling foi realizada no front-end por meio do script JavaScript do serviço. O chat utiliza mensagens persistentes, notificações persistentes e bucket privado para novas fotos, com URL assinada para participantes autorizados.</w:t>
       </w:r>
     </w:p>
     <w:p>
@@ -18786,7 +15628,7 @@
         <w:jc w:val="both"/>
       </w:pPr>
       <w:r>
-        <w:t>Os testes foram funcionais e manuais, complementados por responsividade. Cada cenário considerou entrada, resultado esperado, resultado obtido e status. Pass indica correspondência; Fail indica divergência. O protocolo agregado possui oito cenários. Foram utilizados Firefox, Brave e Chrome em Arch Linux e Windows; ainda devem ser registrados os executores, as versões dos navegadores, as datas e horários, os casos individuais, os dados utilizados e as resoluções.</w:t>
+        <w:t>Os testes foram funcionais e manuais, complementados por responsividade e validações automatizadas de contraste e estrutura. Cada cenário considerou entrada, resultado esperado, resultado obtido e status. A validação de aceitação confirmou, em duas contas, o envio e recebimento de mensagens e fotos, mensagens não lidas, notificações persistentes, login, logout e uso em celular. Os testes finais foram realizados em Chromium e Firefox sobre Arch Linux; as evidências registram o ambiente e os resultados.</w:t>
       </w:r>
     </w:p>
     <w:p>
@@ -19404,11 +16246,7 @@
         <w:jc w:val="both"/>
       </w:pPr>
       <w:r>
-        <w:rPr>
-          <w:rFonts w:ascii="Times New Roman" w:hAnsi="Times New Roman"/>
-          <w:sz w:val="24"/>
-        </w:rPr>
-        <w:t>As limitações são testes manuais, ausência de métricas de desempenho e usabilidade, ausência de participantes externos, dependência de serviço de terceiro e falta de metadados completos. O registro consultado comprova o plano Free e seus limites públicos, mas não comprova a versão da interface, a configuração do agente, os diálogos efetivamente usados nem a retenção específica da conversa; esses itens continuam pendentes no painel e na política do provedor.</w:t>
+        <w:t>As limitações incluem testes predominantemente manuais, ausência de métricas quantitativas de desempenho e usabilidade, ausência de participantes externos e dependência de serviço de terceiro. A validação funcional realizada não equivale a uma auditoria jurídica ou a uma certificação de conformidade com a LGPD. O Chatling continua sujeito à configuração e aos limites do provedor, e estudos futuros devem ampliar a amostra de usuários e medir tempo de resposta, carga e usabilidade.</w:t>
       </w:r>
     </w:p>
     <w:p>
@@ -19448,11 +16286,7 @@
         <w:jc w:val="both"/>
       </w:pPr>
       <w:r>
-        <w:rPr>
-          <w:rFonts w:ascii="Times New Roman" w:hAnsi="Times New Roman"/>
-          <w:sz w:val="24"/>
-        </w:rPr>
-        <w:t>A modelagem definiu 25 casos de uso e 16 requisitos funcionais relacionados, com diferentes níveis de implementação no protótipo. O protocolo agrupado apresentou sete cenários satisfatórios e um com falha, 87,5% das linhas como Pass. O percentual descreve linhas agregadas e não substitui contagem individual.</w:t>
+        <w:t>A modelagem definiu 25 casos de uso e 16 requisitos funcionais relacionados, com diferentes níveis de implementação no protótipo. Os testes funcionais e a aceitação manual confirmaram os fluxos principais de autenticação, marketplace, comunicação entre contas, envio de fotos, mensagens não lidas, notificações persistentes e responsividade. Os resultados descritos correspondem ao ambiente de produção validado em 25 de outubro de 2026.</w:t>
       </w:r>
     </w:p>
     <w:p>
@@ -20729,11 +17563,7 @@
         <w:jc w:val="both"/>
       </w:pPr>
       <w:r>
-        <w:rPr>
-          <w:rFonts w:ascii="Times New Roman" w:hAnsi="Times New Roman"/>
-          <w:sz w:val="24"/>
-        </w:rPr>
-        <w:t>O resultado negativo de UC21 corrige a inconsistência entre comparação e testes: notificações não devem ser apresentadas como plenamente implementadas. RF14 permanece parcialmente implementado e deve ser retestado após correção.</w:t>
+        <w:t>A validação funcional confirmou UC21: o envio de mensagem entre contas gerou registro persistente de notificação e badge de não lidas na conta destinatária. O resultado deve ser interpretado como evidência de funcionamento no ambiente testado, e não como certificação de disponibilidade contínua do serviço.</w:t>
       </w:r>
     </w:p>
     <w:p>
@@ -21180,11 +18010,7 @@
         <w:jc w:val="both"/>
       </w:pPr>
       <w:r>
-        <w:rPr>
-          <w:rFonts w:ascii="Times New Roman" w:hAnsi="Times New Roman"/>
-          <w:sz w:val="24"/>
-        </w:rPr>
-        <w:t>A solução apresenta adequação funcional nos fluxos principais e usa autenticação, perfis, RLS, variáveis de ambiente e função protegida de exclusão. Breakpoints de 1024, 768 e 480 px foram identificados; a comprovação deve associá-los a dispositivo, resolução, navegador e resultado. Migrations, casos de uso, requisitos e GitHub favorecem manutenibilidade, mas não substituem auditoria de segurança, desempenho ou usabilidade.</w:t>
+        <w:t>A solução apresenta adequação funcional nos fluxos principais e usa autenticação, perfis, RLS, variáveis de ambiente e função protegida de exclusão. As novas fotos de conversas ficam em bucket privado, com policies que restringem upload ao proprietário do caminho e leitura aos participantes por meio de URLs assinadas. Breakpoints de 1024, 768 e 480 px foram identificados e a validação final confirmou uso em celular. Migrations, casos de uso, requisitos, evidências e GitHub favorecem manutenibilidade, mas não substituem auditoria completa de segurança, desempenho ou usabilidade.</w:t>
       </w:r>
     </w:p>
     <w:p>
@@ -21209,11 +18035,7 @@
         <w:jc w:val="both"/>
       </w:pPr>
       <w:r>
-        <w:rPr>
-          <w:rFonts w:ascii="Times New Roman" w:hAnsi="Times New Roman"/>
-          <w:sz w:val="24"/>
-        </w:rPr>
-        <w:t>Os resultados respondem afirmativamente, em caráter de protótipo acadêmico: foi possível reunir cadastro, anúncios, busca, filtros, contato e suporte conversacional mantendo ligação entre requisitos, casos de uso, tabelas e testes. A resposta é qualificada porque a entrega de notificações persistentes depende da aplicação da migration RF14/UC21 em staging/produção, Chatling depende de configuração externa ainda não documentada e a validação quantitativa ainda é insuficiente.</w:t>
+        <w:t>Os resultados respondem afirmativamente, em caráter de protótipo acadêmico: foi possível reunir cadastro, anúncios, busca, filtros, contato, mensagens entre contas, notificações persistentes, fotos privadas no chat e suporte conversacional mantendo ligação entre requisitos, casos de uso, tabelas e testes. A resposta é qualificada porque o Chatling depende de configuração externa, a validação quantitativa de usabilidade ainda é insuficiente e o sistema não deve ser apresentado como produto comercial pronto.</w:t>
       </w:r>
     </w:p>
     <w:p>
@@ -21238,11 +18060,7 @@
         <w:jc w:val="both"/>
       </w:pPr>
       <w:r>
-        <w:rPr>
-          <w:rFonts w:ascii="Times New Roman" w:hAnsi="Times New Roman"/>
-          <w:sz w:val="24"/>
-        </w:rPr>
-        <w:t>A MGMOTORSBR alcançou o objetivo de produzir um protótipo funcional de intermediação de veículos com cadastro, autenticação, anúncios, pesquisa, contato, moderação, painel administrativo e apoio conversacional. A modelagem de 25 casos de uso, 16 requisitos funcionais, banco PostgreSQL no Supabase e critérios ISO/IEC 25010 fornecem rastreabilidade para continuidade.</w:t>
+        <w:t>A MGMOTORSBR alcançou o objetivo de produzir um protótipo funcional de intermediação de veículos com cadastro, autenticação, anúncios, pesquisa, contato, moderação, painel administrativo, mensagens entre usuários, notificações persistentes, fotos privadas no chat e apoio conversacional. A modelagem de 25 casos de uso, 16 requisitos funcionais, banco PostgreSQL no Supabase, políticas de acesso e critérios ISO/IEC 25010 fornecem rastreabilidade para continuidade.</w:t>
       </w:r>
     </w:p>
     <w:p>
@@ -21252,11 +18070,7 @@
         <w:jc w:val="both"/>
       </w:pPr>
       <w:r>
-        <w:rPr>
-          <w:rFonts w:ascii="Times New Roman" w:hAnsi="Times New Roman"/>
-          <w:sz w:val="24"/>
-        </w:rPr>
-        <w:t>Os testes indicaram funcionamento satisfatório dos fluxos principais, enquanto notificações permaneceram parcialmente implementadas e não funcionais. A plataforma deve ser apresentada como protótipo acadêmico validado inicialmente, não como produto comercial pronto. A integração é tecnicamente viável, mas depende de testes rigorosos e validações externas.</w:t>
+        <w:t>Os testes indicaram funcionamento satisfatório dos fluxos principais. A comunicação entre duas contas, o envio e recebimento de fotos, as mensagens não lidas, as notificações persistentes, o login, o logout e a responsividade foram confirmados em Chromium e Firefox sobre Arch Linux, além de testes em celular. A plataforma deve ser apresentada como protótipo acadêmico validado, não como produto comercial pronto. A integração é tecnicamente viável, mas depende de acompanhamento, testes ampliados e validações externas.</w:t>
       </w:r>
     </w:p>
     <w:p>
@@ -21281,7 +18095,7 @@
         <w:jc w:val="both"/>
       </w:pPr>
       <w:r>
-        <w:t>Completar o diário de testes com executor, data, quantidade, dados, navegadores, sistemas, resoluções e evidências; aplicar a migration e retestar RF14/UC21 em staging; registrar a versão da interface, a configuração do agente, os diálogos reais e a política de dados do Chatling; confirmar as versões específicas dos navegadores e registrar interrupções ou alterações de escopo no período informado.</w:t>
+        <w:t>Completar o diário de testes com executor, data, quantidade, dados, navegadores, sistemas, resoluções e evidências; registrar a versão da interface, a configuração do agente, os diálogos reais e a política de dados do Chatling; confirmar as referências e revisar a redação final do artigo antes da entrega.</w:t>
       </w:r>
     </w:p>
     <w:p>
@@ -21306,11 +18120,7 @@
         <w:jc w:val="both"/>
       </w:pPr>
       <w:r>
-        <w:rPr>
-          <w:rFonts w:ascii="Times New Roman" w:hAnsi="Times New Roman"/>
-          <w:sz w:val="24"/>
-        </w:rPr>
-        <w:t>Recomenda-se estudo de usabilidade com cinco a oito participantes externos, tarefas cronometradas e SUS; métricas de resposta e carga; análise de segurança e RLS; aplicação e evidência da migration de notificações; documentação de diálogos do Chatling; revisão institucional da privacidade; e definição de licença compatível com distribuição.</w:t>
+        <w:t>Recomenda-se estudo de usabilidade com cinco a oito participantes externos, tarefas cronometradas e SUS; métricas de resposta e carga; análise complementar de segurança e RLS; documentação de diálogos do Chatling; revisão institucional da privacidade; e definição de licença compatível com distribuição.</w:t>
       </w:r>
     </w:p>
     <w:p>

</xml_diff>

<commit_message>
docs: map test evidence placement in thesis
</commit_message>
<xml_diff>
--- a/ArtigoMG_revisado_MGMOTORSBR.docx
+++ b/ArtigoMG_revisado_MGMOTORSBR.docx
@@ -15628,7 +15628,7 @@
         <w:jc w:val="both"/>
       </w:pPr>
       <w:r>
-        <w:t>Os testes foram funcionais e manuais, complementados por responsividade e validações automatizadas de contraste e estrutura. Cada cenário considerou entrada, resultado esperado, resultado obtido e status. A validação de aceitação confirmou, em duas contas, o envio e recebimento de mensagens e fotos, mensagens não lidas, notificações persistentes, login, logout e uso em celular. Os testes finais foram realizados em Chromium e Firefox sobre Arch Linux; as evidências registram o ambiente e os resultados.</w:t>
+        <w:t>Os testes foram funcionais e manuais, complementados por responsividade e validações automatizadas de contraste e estrutura. Para manter o documento dentro do limite de 30 páginas, as evidências devem ser concentradas em três pontos: o Quadro 6, na seção 3.8, recebe a matriz compacta de cenários, ambiente e resultado; a seção 4.2 recebe as capturas principais da interface; e a seção 4.4 recebe uma captura curta da proteção do Storage ou uma referência ao relatório de segurança. Cada captura deve ter legenda, fonte e data, sem repetir a mesma imagem em seções diferentes. Cada cenário considerou entrada, resultado esperado, resultado obtido e status. A validação de aceitação confirmou, em duas contas, o envio e recebimento de mensagens e fotos, mensagens não lidas, notificações persistentes, login, logout e uso em celular. Os testes finais foram realizados em Chromium e Firefox sobre Arch Linux; as evidências registram o ambiente e os resultados.</w:t>
       </w:r>
     </w:p>
     <w:p>
@@ -15638,11 +15638,7 @@
         <w:jc w:val="both"/>
       </w:pPr>
       <w:r>
-        <w:rPr>
-          <w:rFonts w:ascii="Times New Roman" w:hAnsi="Times New Roman"/>
-          <w:sz w:val="24"/>
-        </w:rPr>
-        <w:t>Registro mínimo de auditoria do protocolo de testes</w:t>
+        <w:t>Registro mínimo de auditoria do protocolo de testes: inserir no Quadro 6 apenas os oito a dez cenários mais representativos, agrupando login/logout, marketplace, mensagens, fotos privadas, notificações, responsividade e segurança. Não criar uma tabela separada para cada navegador; registrar Chromium e Firefox na coluna Ambiente e indicar Arch Linux ou celular na mesma linha. As capturas correspondentes devem ser colocadas somente na seção 4.2, usando subfiguras quando duas telas comprovarem um único cenário.</w:t>
       </w:r>
     </w:p>
     <w:tbl>
@@ -17588,11 +17584,7 @@
         <w:jc w:val="both"/>
       </w:pPr>
       <w:r>
-        <w:rPr>
-          <w:rFonts w:ascii="Times New Roman" w:hAnsi="Times New Roman"/>
-          <w:sz w:val="24"/>
-        </w:rPr>
-        <w:t>A Figura 5 documenta a tela inicial; a Figura 6 representa autenticação; a Figura 7 reúne busca, filtros e anúncios; a Figura 8 relaciona moderação e atendimento conversacional; e a Figura 9 reúne detalhe e publicação de anúncio. Todas possuem numeração, legenda e fonte.</w:t>
+        <w:t>A Figura 5 documenta a tela inicial e deve receber uma captura da home com busca e navegação principal. A Figura 6 deve mostrar autenticação, incluindo login ou logout. A Figura 7 deve reunir marketplace, pesquisa, filtros e detalhes de anúncio. A Figura 8 deve reunir, em subfiguras (a), (b) e (c), a conversa entre duas contas, o envio ou recebimento de foto e o badge de notificação. A Figura 9 deve mostrar publicação ou moderação. Essa distribuição evita criar novas figuras e ajuda a manter o limite de 30 páginas.</w:t>
       </w:r>
     </w:p>
     <w:p>
@@ -17942,7 +17934,7 @@
         <w:jc w:val="both"/>
       </w:pPr>
       <w:r>
-        <w:t>As Figuras 7 a 9 são representações documentais baseadas na interface; devem ser substituídas por capturas reais do ambiente de demonstração antes da entrega final.</w:t>
+        <w:t>As Figuras 5 a 9 devem ser substituídas por capturas reais do ambiente de demonstração antes da entrega final. A matriz de testes fica no Quadro 6; as telas ficam na seção 4.2; e a evidência de segurança do bucket privado deve ser citada na seção 4.4, sem inserir logs extensos no corpo do artigo. Os logs completos permanecem no diretório de evidências do projeto e podem ser apresentados à banca se solicitados.</w:t>
       </w:r>
     </w:p>
     <w:p>
@@ -18095,7 +18087,7 @@
         <w:jc w:val="both"/>
       </w:pPr>
       <w:r>
-        <w:t>Completar o diário de testes com executor, data, quantidade, dados, navegadores, sistemas, resoluções e evidências; registrar a versão da interface, a configuração do agente, os diálogos reais e a política de dados do Chatling; confirmar as referências e revisar a redação final do artigo antes da entrega.</w:t>
+        <w:t>Antes da entrega, inserir as capturas reais na seção 4.2 conforme o mapa definido, preencher o Quadro 6 com executor, data, navegador, sistema, resolução e resultado, e citar na seção 4.4 a evidência do bucket privado. Não incluir todas as telas nem logs completos no DOCX: o conjunto recomendado é de até seis imagens compostas, uma matriz compacta e uma referência ao repositório de evidências. Também devem ser registrados a versão da interface, a configuração do agente, os diálogos reais e a política de dados do Chatling.</w:t>
       </w:r>
     </w:p>
     <w:p>

</xml_diff>

<commit_message>
docs: audit references and similarity notes
</commit_message>
<xml_diff>
--- a/ArtigoMG_revisado_MGMOTORSBR.docx
+++ b/ArtigoMG_revisado_MGMOTORSBR.docx
@@ -18137,19 +18137,7 @@
         <w:jc w:val="both"/>
       </w:pPr>
       <w:r>
-        <w:rPr>
-          <w:rFonts w:ascii="Times New Roman" w:hAnsi="Times New Roman"/>
-          <w:b/>
-          <w:sz w:val="21"/>
-        </w:rPr>
-        <w:t xml:space="preserve">ABCOMM. </w:t>
-      </w:r>
-      <w:r>
-        <w:rPr>
-          <w:rFonts w:ascii="Times New Roman" w:hAnsi="Times New Roman"/>
-          <w:sz w:val="21"/>
-        </w:rPr>
-        <w:t>Faturamento do e-commerce no Brasil: dados anuais de 2025. Disponível em: https://dados.abcomm.org/. Acesso em: 08 out. 2026.</w:t>
+        <w:t>ABCOMM. Faturamento do Ecommerce no Brasil. Disponível em: https://dados.abcomm.org/. Acesso em: 25 out. 2026.</w:t>
       </w:r>
     </w:p>
     <w:p>
@@ -18159,19 +18147,7 @@
         <w:jc w:val="both"/>
       </w:pPr>
       <w:r>
-        <w:rPr>
-          <w:rFonts w:ascii="Times New Roman" w:hAnsi="Times New Roman"/>
-          <w:b/>
-          <w:sz w:val="21"/>
-        </w:rPr>
-        <w:t xml:space="preserve">ADAMOPOULOU, E.; MOUSSIADES, L. </w:t>
-      </w:r>
-      <w:r>
-        <w:rPr>
-          <w:rFonts w:ascii="Times New Roman" w:hAnsi="Times New Roman"/>
-          <w:sz w:val="21"/>
-        </w:rPr>
-        <w:t>An overview of chatbot technology. In: MAGLOGIANNIS, I.; ILIADIS, L.; PIMENIDIS, E. (eds.). Artificial Intelligence Applications and Innovations. AIAI 2020. Cham: Springer, 2020. Disponível em: https://link.springer.com/chapter/10.1007/978-3-030-49186-4_31. Acesso em: 08 out. 2026.</w:t>
+        <w:t>ADAMOPOULOU, E.; MOUSSIADES, L. An overview of chatbot technology. In: MAGLOGIANNIS, I.; ILIADIS, L.; PIMENIDIS, E. (eds.). Artificial Intelligence Applications and Innovations. AIAI 2020. Cham: Springer, 2020. Disponível em: https://link.springer.com/chapter/10.1007/978-3-030-49186-4_31. Acesso em: 25 out. 2026.</w:t>
       </w:r>
     </w:p>
     <w:p>
@@ -18203,19 +18179,7 @@
         <w:jc w:val="both"/>
       </w:pPr>
       <w:r>
-        <w:rPr>
-          <w:rFonts w:ascii="Times New Roman" w:hAnsi="Times New Roman"/>
-          <w:b/>
-          <w:sz w:val="21"/>
-        </w:rPr>
-        <w:t xml:space="preserve">BRASIL. </w:t>
-      </w:r>
-      <w:r>
-        <w:rPr>
-          <w:rFonts w:ascii="Times New Roman" w:hAnsi="Times New Roman"/>
-          <w:sz w:val="21"/>
-        </w:rPr>
-        <w:t>Lei nº 13.709, de 14 de agosto de 2018. Lei Geral de Proteção de Dados Pessoais. Disponível em: https://www.planalto.gov.br/ccivil_03/_ato2015-2018/2018/lei/l13709.htm. Acesso em: 08 out. 2026.</w:t>
+        <w:t>BRASIL. Lei nº 13.709, de 14 de agosto de 2018. Lei Geral de Proteção de Dados Pessoais. Disponível em: https://www.planalto.gov.br/ccivil_03/_ato2015-2018/2018/lei/l13709.htm. Acesso em: 25 out. 2026.</w:t>
       </w:r>
     </w:p>
     <w:p>
@@ -18225,19 +18189,7 @@
         <w:jc w:val="both"/>
       </w:pPr>
       <w:r>
-        <w:rPr>
-          <w:rFonts w:ascii="Times New Roman" w:hAnsi="Times New Roman"/>
-          <w:b/>
-          <w:sz w:val="21"/>
-        </w:rPr>
-        <w:t xml:space="preserve">CARVALHO SOBRINHO, C. M.; OLIVEIRA FILHO, E. W. de. </w:t>
-      </w:r>
-      <w:r>
-        <w:rPr>
-          <w:rFonts w:ascii="Times New Roman" w:hAnsi="Times New Roman"/>
-          <w:sz w:val="21"/>
-        </w:rPr>
-        <w:t>A responsabilidade civil das plataformas digitais de intermediação na compra e venda de veículos à luz do Código de Defesa do Consumidor e do Marco Civil da Internet. Revista JRG, v. 8, n. 19, 2025. Disponível em: https://revistajrg.com/index.php/jrg/article/view/2758. Acesso em: 08 out. 2026.</w:t>
+        <w:t>CARVALHO SOBRINHO, C. M.; OLIVEIRA FILHO, E. W. de. A responsabilidade civil das plataformas digitais de intermediação na compra e venda de veículos à luz do Código de Defesa do Consumidor e do Marco Civil da Internet. Revista JRG de Estudos Acadêmicos, v. 8, n. 19, e082758, 2025. DOI: 10.55892/jrg.v8i19.2758. Disponível em: https://revistajrg.com/index.php/jrg/article/view/2758. Acesso em: 25 out. 2026.</w:t>
       </w:r>
     </w:p>
     <w:p>
@@ -18247,19 +18199,7 @@
         <w:jc w:val="both"/>
       </w:pPr>
       <w:r>
-        <w:rPr>
-          <w:rFonts w:ascii="Times New Roman" w:hAnsi="Times New Roman"/>
-          <w:b/>
-          <w:sz w:val="21"/>
-        </w:rPr>
-        <w:t xml:space="preserve">FENAUTO. </w:t>
-      </w:r>
-      <w:r>
-        <w:rPr>
-          <w:rFonts w:ascii="Times New Roman" w:hAnsi="Times New Roman"/>
-          <w:sz w:val="21"/>
-        </w:rPr>
-        <w:t>Mercado de veículos usados bate recorde histórico de vendas. 06 jan. 2026. Disponível em: https://www.fenauto.org.br/news/mercado-de-veiculos-usados-bate-recorde-historico-de-vendas. Acesso em: 08 out. 2026.</w:t>
+        <w:t>FENAUTO. Mercado de veículos usados bate recorde histórico de vendas. 06 jan. 2026. Disponível em: https://www.fenauto.org.br/news/mercado-de-veiculos-usados-bate-recorde-historico-de-vendas. Acesso em: 25 out. 2026.</w:t>
       </w:r>
     </w:p>
     <w:p>
@@ -18269,19 +18209,7 @@
         <w:jc w:val="both"/>
       </w:pPr>
       <w:r>
-        <w:rPr>
-          <w:rFonts w:ascii="Times New Roman" w:hAnsi="Times New Roman"/>
-          <w:b/>
-          <w:sz w:val="21"/>
-        </w:rPr>
-        <w:t xml:space="preserve">IEEE. </w:t>
-      </w:r>
-      <w:r>
-        <w:rPr>
-          <w:rFonts w:ascii="Times New Roman" w:hAnsi="Times New Roman"/>
-          <w:sz w:val="21"/>
-        </w:rPr>
-        <w:t>IEEE/ISO/IEC 29148-2018: Systems and software engineering — Requirements engineering. Disponível em: https://standards.ieee.org/standard/29148-2018.html. Acesso em: 08 out. 2026.</w:t>
+        <w:t>IEEE. IEEE/ISO/IEC 29148:2018: Systems and software engineering — Life cycle processes — Requirements engineering. Disponível em: https://standards.ieee.org/standard/29148-2018.html. Acesso em: 25 out. 2026.</w:t>
       </w:r>
     </w:p>
     <w:p>
@@ -18291,19 +18219,7 @@
         <w:jc w:val="both"/>
       </w:pPr>
       <w:r>
-        <w:rPr>
-          <w:rFonts w:ascii="Times New Roman" w:hAnsi="Times New Roman"/>
-          <w:b/>
-          <w:sz w:val="21"/>
-        </w:rPr>
-        <w:t xml:space="preserve">ISO. </w:t>
-      </w:r>
-      <w:r>
-        <w:rPr>
-          <w:rFonts w:ascii="Times New Roman" w:hAnsi="Times New Roman"/>
-          <w:sz w:val="21"/>
-        </w:rPr>
-        <w:t>ISO/IEC 25010:2023: Systems and software Quality Requirements and Evaluation. Disponível em: https://www.iso.org/obp/ui/#iso:std:iso-iec-25010:en. Acesso em: 08 out. 2026.</w:t>
+        <w:t>ISO. ISO/IEC 25010:2023: Systems and software engineering — Systems and software Quality Requirements and Evaluation (SQuaRE) — Product quality model. Disponível em: https://www.iso.org/standard/78176.html. Acesso em: 25 out. 2026.</w:t>
       </w:r>
     </w:p>
     <w:p>
@@ -18313,19 +18229,7 @@
         <w:jc w:val="both"/>
       </w:pPr>
       <w:r>
-        <w:rPr>
-          <w:rFonts w:ascii="Times New Roman" w:hAnsi="Times New Roman"/>
-          <w:b/>
-          <w:sz w:val="21"/>
-        </w:rPr>
-        <w:t xml:space="preserve">MOBIAUTO. </w:t>
-      </w:r>
-      <w:r>
-        <w:rPr>
-          <w:rFonts w:ascii="Times New Roman" w:hAnsi="Times New Roman"/>
-          <w:sz w:val="21"/>
-        </w:rPr>
-        <w:t>Mobiauto: compra e venda de carros novos e usados. Disponível em: https://www.mobiauto.com.br/. Acesso em: 08 out. 2026.</w:t>
+        <w:t>MOBIAUTO. Mobiauto: compra e venda de carros novos e usados. Disponível em: https://www.mobiauto.com.br/. Acesso em: 25 out. 2026.</w:t>
       </w:r>
     </w:p>
     <w:p>
@@ -18335,19 +18239,7 @@
         <w:jc w:val="both"/>
       </w:pPr>
       <w:r>
-        <w:rPr>
-          <w:rFonts w:ascii="Times New Roman" w:hAnsi="Times New Roman"/>
-          <w:b/>
-          <w:sz w:val="21"/>
-        </w:rPr>
-        <w:t xml:space="preserve">OLX. </w:t>
-      </w:r>
-      <w:r>
-        <w:rPr>
-          <w:rFonts w:ascii="Times New Roman" w:hAnsi="Times New Roman"/>
-          <w:sz w:val="21"/>
-        </w:rPr>
-        <w:t>Autos e peças. Disponível em: https://www.olx.com.br/autos-e-pecas. Acesso em: 08 out. 2026.</w:t>
+        <w:t>OLX. Autos. Disponível em: https://www.olx.com.br/autos-e-pecas. Acesso em: 25 out. 2026.</w:t>
       </w:r>
     </w:p>
     <w:p>
@@ -18357,19 +18249,7 @@
         <w:jc w:val="both"/>
       </w:pPr>
       <w:r>
-        <w:rPr>
-          <w:rFonts w:ascii="Times New Roman" w:hAnsi="Times New Roman"/>
-          <w:b/>
-          <w:sz w:val="21"/>
-        </w:rPr>
-        <w:t xml:space="preserve">PEREIRA, G. da S.; PINTO, G. S. </w:t>
-      </w:r>
-      <w:r>
-        <w:rPr>
-          <w:rFonts w:ascii="Times New Roman" w:hAnsi="Times New Roman"/>
-          <w:sz w:val="21"/>
-        </w:rPr>
-        <w:t>A importância do e-commerce no processo de comercialização de produtos, mercadorias e serviços de micro e pequenas empresas. Revista Interface Tecnológica, v. 18, n. 2, p. 316–328, 2021. Disponível em: https://revista.fatectq.edu.br/interfacetecnologica/article/view/1327. Acesso em: 08 out. 2026.</w:t>
+        <w:t>PEREIRA, G. da S.; PINTO, G. S. A importância do e-commerce no processo de comercialização de produtos, mercadorias e serviços de micro e pequenas empresas. Revista Interface Tecnológica, v. 18, n. 2, p. 316–328, 2021. DOI: 10.31510/infa.v18i2.1327. Disponível em: https://revista.fatectq.edu.br/interfacetecnologica/article/view/1327. Acesso em: 25 out. 2026.</w:t>
       </w:r>
     </w:p>
     <w:p>
@@ -18379,19 +18259,7 @@
         <w:jc w:val="both"/>
       </w:pPr>
       <w:r>
-        <w:rPr>
-          <w:rFonts w:ascii="Times New Roman" w:hAnsi="Times New Roman"/>
-          <w:b/>
-          <w:sz w:val="21"/>
-        </w:rPr>
-        <w:t xml:space="preserve">WEBMOTORS. </w:t>
-      </w:r>
-      <w:r>
-        <w:rPr>
-          <w:rFonts w:ascii="Times New Roman" w:hAnsi="Times New Roman"/>
-          <w:sz w:val="21"/>
-        </w:rPr>
-        <w:t>Webmotors: compra e venda de carros, motos e caminhões. Disponível em: https://www.webmotors.com.br/. Acesso em: 08 out. 2026.</w:t>
+        <w:t>WEBMOTORS. Webmotors: compre, venda e financie carros ou motos novos, usados e seminovos. Disponível em: https://www.webmotors.com.br/. Acesso em: 25 out. 2026.</w:t>
       </w:r>
     </w:p>
     <w:sectPr>

</xml_diff>

<commit_message>
docs: align site audit and article with current state
</commit_message>
<xml_diff>
--- a/ArtigoMG_revisado_MGMOTORSBR.docx
+++ b/ArtigoMG_revisado_MGMOTORSBR.docx
@@ -110,7 +110,7 @@
         <w:jc w:val="both"/>
       </w:pPr>
       <w:r>
-        <w:t>O comércio eletrônico brasileiro vem ampliando sua relevância como canal de pesquisa, comparação e negociação. Este trabalho apresenta o desenvolvimento da MGMOTORSBR, plataforma digital de intermediação de veículos construída com HTML5, CSS3, JavaScript e PostgreSQL gerenciado pelo Supabase. A solução foi delimitada à divulgação de anúncios, pesquisa e filtragem de veículos, contato entre usuários, notificações persistentes e suporte conversacional por inteligência artificial, sem processamento de pagamento ou transferência de propriedade. O percurso metodológico compreendeu levantamento de referências, modelagem de requisitos e casos de uso, projeto do banco de dados, implementação incremental e testes manuais em contas distintas. Os resultados indicaram funcionamento satisfatório dos principais fluxos de cadastro, pesquisa, anúncios, contato, mensagens, envio de fotos, notificações, moderação e navegação responsiva. A comunicação entre contas e as notificações persistentes foram validadas em produção. As fotos novas do chat utilizam bucket privado e URLs assinadas, com controle de acesso por participante. O Chatling foi incorporado como serviço externo, sujeito aos limites do plano Free. O trabalho contribui como protótipo acadêmico funcional e delimita próximos passos de validação de usabilidade, desempenho e proteção de dados.</w:t>
+        <w:t>O comércio eletrônico brasileiro vem ampliando sua relevância como canal de pesquisa, comparação e negociação. Este trabalho apresenta o desenvolvimento da MGMOTORSBR, plataforma digital de intermediação de veículos construída com HTML5, CSS3, JavaScript e PostgreSQL gerenciado pelo Supabase. A solução foi delimitada à divulgação de anúncios, pesquisa e filtragem de veículos, contato entre usuários, notificações persistentes e suporte conversacional por inteligência artificial, sem processamento de pagamento ou transferência de propriedade. O percurso metodológico compreendeu levantamento de referências, modelagem de requisitos e casos de uso, projeto do banco de dados, implementação incremental e testes manuais em contas distintas. Os resultados indicaram funcionamento satisfatório dos principais fluxos de cadastro, pesquisa, filtros avançados, anúncios, edição, categorias, venda, compartilhamento, contato, mensagens, envio de fotos, notificações, moderação e navegação responsiva. A comunicação entre contas e as notificações persistentes foram validadas em produção. As fotos novas do chat utilizam bucket privado e URLs assinadas, com controle de acesso por participante. O Chatling foi incorporado como serviço externo, sujeito aos limites do plano Free. O trabalho contribui como protótipo acadêmico funcional e delimita próximos passos de validação de usabilidade, desempenho e proteção de dados.</w:t>
       </w:r>
     </w:p>
     <w:p>
@@ -284,11 +284,7 @@
         <w:jc w:val="both"/>
       </w:pPr>
       <w:r>
-        <w:rPr>
-          <w:rFonts w:ascii="Times New Roman" w:hAnsi="Times New Roman"/>
-          <w:sz w:val="24"/>
-        </w:rPr>
-        <w:t>O objetivo geral é desenvolver e avaliar um protótipo acadêmico funcional. Os objetivos específicos são implementar cadastro e gerenciamento de anúncios; pesquisa, filtragem e ordenação; modelar dados e casos de uso; integrar o assistente conversacional; verificar fluxos por testes; e discutir limites técnicos, metodológicos e éticos.</w:t>
+        <w:t>O objetivo geral é desenvolver e avaliar um protótipo acadêmico funcional. Os objetivos específicos são implementar cadastro e gerenciamento de anúncios, incluindo edição e marcação como vendido; pesquisa, filtragem e ordenação; gerenciamento administrativo de categorias, compartilhamento e contato pelo site; modelar dados e casos de uso; integrar o assistente conversacional; verificar fluxos por testes; e discutir limites técnicos, metodológicos e éticos.</w:t>
       </w:r>
     </w:p>
     <w:p>
@@ -1108,7 +1104,7 @@
           </w:tcPr>
           <w:p>
             <w:r>
-              <w:t>Parcial (RF02 – UC04, UC22)</w:t>
+              <w:t>Sim (RF02 – UC04, UC22)</w:t>
             </w:r>
           </w:p>
         </w:tc>
@@ -1236,7 +1232,7 @@
           </w:tcPr>
           <w:p>
             <w:r>
-              <w:t>Não (RF02 – UC04, UC22)</w:t>
+              <w:t>Sim (RF02 – UC04, UC22)</w:t>
             </w:r>
           </w:p>
         </w:tc>
@@ -1505,7 +1501,7 @@
           </w:tcPr>
           <w:p>
             <w:r>
-              <w:t>Parcial (RF11 – UC15)</w:t>
+              <w:t>Sim (RF11 – UC15)</w:t>
             </w:r>
           </w:p>
         </w:tc>
@@ -2346,7 +2342,7 @@
           </w:tcPr>
           <w:p>
             <w:r>
-              <w:t>Não (RF16 – UC25)</w:t>
+              <w:t>Sim (RF16 – UC25)</w:t>
             </w:r>
           </w:p>
         </w:tc>
@@ -3187,7 +3183,7 @@
           </w:tcPr>
           <w:p>
             <w:r>
-              <w:t>Não (RF07 – UC20)</w:t>
+              <w:t>Sim (RF07 – UC20)</w:t>
             </w:r>
           </w:p>
         </w:tc>
@@ -3708,7 +3704,7 @@
           </w:tcPr>
           <w:p>
             <w:r>
-              <w:t>Não (RF11 – UC15)</w:t>
+              <w:t>Sim (RF11 – UC15)</w:t>
             </w:r>
           </w:p>
         </w:tc>
@@ -3959,25 +3955,8 @@
             </w:tcMar>
           </w:tcPr>
           <w:p>
-            <w:pPr>
-              <w:spacing w:before="0" w:after="0" w:line="240" w:lineRule="auto"/>
-              <w:ind w:firstLine="0"/>
-              <w:jc w:val="left"/>
-            </w:pPr>
-            <w:r>
-              <w:rPr>
-                <w:rFonts w:ascii="Times New Roman" w:hAnsi="Times New Roman"/>
-                <w:b w:val="0"/>
-                <w:sz w:val="17"/>
-              </w:rPr>
-            </w:r>
-            <w:r>
-              <w:rPr>
-                <w:rFonts w:ascii="Times New Roman" w:hAnsi="Times New Roman"/>
-                <w:b w:val="0"/>
-                <w:sz w:val="17"/>
-              </w:rPr>
-              <w:t>Parcialmente implementado; não funcional no teste (RF14 – UC21)</w:t>
+            <w:r>
+              <w:t>Implementado; aceite manual PASS (RF14 – UC21)</w:t>
             </w:r>
           </w:p>
         </w:tc>
@@ -4101,7 +4080,7 @@
           </w:tcPr>
           <w:p>
             <w:r>
-              <w:t>Não (RF15 – UC24)</w:t>
+              <w:t>Sim (RF15 – UC24)</w:t>
             </w:r>
           </w:p>
         </w:tc>
@@ -4356,7 +4335,7 @@
         <w:jc w:val="both"/>
       </w:pPr>
       <w:r>
-        <w:t>Nos testes e no desenvolvimento foram utilizados Arch Linux e Windows, com Firefox, Brave e Chrome. A validação final registrada pelos autores foi realizada em Chromium e Firefox sobre Arch Linux, além de testes em dispositivo móvel. Foram confirmados login, logout, mensagens entre duas contas, envio e recebimento de fotos, mensagens não lidas, notificações persistentes, atualização das conversas e funcionamento responsivo. A versão específica dos navegadores e as resoluções devem ser mantidas no diário de testes quando a banca solicitar reprodução detalhada.</w:t>
+        <w:t>Nos testes e no desenvolvimento foram utilizados Arch Linux e Windows, com Firefox, Brave e Chrome. A validação final registrada pelos autores foi realizada em Chromium e Firefox sobre Arch Linux, além de testes em dispositivo móvel. Foram confirmados login, logout, filtros avançados, edição, categorias, venda, compartilhamento, formulário de contato, mensagens entre duas contas, envio e recebimento de fotos, mensagens não lidas, notificações persistentes, atualização das conversas e funcionamento responsivo. A versão específica dos navegadores e as resoluções devem ser mantidas no diário de testes quando a banca solicitar reprodução detalhada.</w:t>
       </w:r>
     </w:p>
     <w:p>
@@ -14542,7 +14521,7 @@
         <w:jc w:val="both"/>
       </w:pPr>
       <w:r>
-        <w:t>A implementação priorizou autenticação, anúncios, busca, administração e comunicação. Os módulos priorizados foram implementados, verificados e refinados conforme o escopo efetivamente disponível. A integração com o Chatling foi realizada no front-end por meio do script JavaScript do serviço. O chat utiliza mensagens persistentes, notificações persistentes e bucket privado para novas fotos, com URL assinada para participantes autorizados.</w:t>
+        <w:t>A implementação priorizou autenticação, anúncios, busca com filtros avançados, edição, gerenciamento administrativo, marcação de venda, compartilhamento, contato e comunicação. Os módulos priorizados foram implementados, verificados e refinados conforme o escopo efetivamente disponível. A integração com o Chatling foi realizada no front-end por meio do script JavaScript do serviço. Os fluxos de comunicação utilizam mensagens persistentes, notificações persistentes e bucket privado para novas fotos, com URL assinada para participantes autorizados.</w:t>
       </w:r>
     </w:p>
     <w:p>
@@ -15628,7 +15607,7 @@
         <w:jc w:val="both"/>
       </w:pPr>
       <w:r>
-        <w:t>Os testes foram funcionais e manuais, complementados por responsividade e validações automatizadas de contraste e estrutura. Para manter o documento dentro do limite de 30 páginas, as evidências devem ser concentradas em três pontos: o Quadro 6, na seção 3.8, recebe a matriz compacta de cenários, ambiente e resultado; a seção 4.2 recebe as capturas principais da interface; e a seção 4.4 recebe uma captura curta da proteção do Storage ou uma referência ao relatório de segurança. Cada captura deve ter legenda, fonte e data, sem repetir a mesma imagem em seções diferentes. Cada cenário considerou entrada, resultado esperado, resultado obtido e status. A validação de aceitação confirmou, em duas contas, o envio e recebimento de mensagens e fotos, mensagens não lidas, notificações persistentes, login, logout e uso em celular. Os testes finais foram realizados em Chromium e Firefox sobre Arch Linux; as evidências registram o ambiente e os resultados.</w:t>
+        <w:t>Os testes foram funcionais e manuais, complementados por responsividade e validações automatizadas de contraste e estrutura. Para manter o documento dentro do limite de 30 páginas, as evidências devem ser concentradas em três pontos: o Quadro 6, na seção 3.8, recebe a matriz compacta de cenários, ambiente e resultado; a seção 4.2 recebe as capturas principais da interface; e a seção 4.4 recebe uma captura curta da proteção do Storage ou uma referência ao relatório de segurança. Cada captura deve ter legenda, fonte e data, sem repetir a mesma imagem em seções diferentes. Cada cenário considerou entrada, resultado esperado, resultado obtido e status. A validação de aceitação confirmou, em duas contas, o envio e recebimento de mensagens e fotos, mensagens não lidas, notificações persistentes, login, logout e uso em celular. Os testes finais foram realizados em Chromium e Firefox sobre Arch Linux; as evidências registram o ambiente e os resultados. O aceite de 25/10/2026 está registrado em evidencias/aceite-marketplace-20261025.md.</w:t>
       </w:r>
     </w:p>
     <w:p>
@@ -16282,7 +16261,7 @@
         <w:jc w:val="both"/>
       </w:pPr>
       <w:r>
-        <w:t>A modelagem definiu 25 casos de uso e 16 requisitos funcionais relacionados, com diferentes níveis de implementação no protótipo. Os testes funcionais e a aceitação manual confirmaram os fluxos principais de autenticação, marketplace, comunicação entre contas, envio de fotos, mensagens não lidas, notificações persistentes e responsividade. Os resultados descritos correspondem ao ambiente de produção validado em 25 de outubro de 2026.</w:t>
+        <w:t>A modelagem definiu 25 casos de uso e 16 requisitos funcionais relacionados, com diferentes níveis de implementação no protótipo. Os testes funcionais e a aceitação manual confirmaram os fluxos principais de autenticação, marketplace, filtros avançados, edição, categorias, venda, compartilhamento, formulário de contato, comunicação entre contas, envio de fotos, mensagens não lidas, notificações persistentes e responsividade. Os resultados descritos correspondem ao ambiente de produção validado em 25 de outubro de 2026.</w:t>
       </w:r>
     </w:p>
     <w:p>
@@ -16634,7 +16613,7 @@
           </w:tcPr>
           <w:p>
             <w:r>
-              <w:t>Campos disponíveis.</w:t>
+              <w:t>Filtros de tipo, marca, modelo, preço, estado, ano, quilometragem, combustível, câmbio e cor; ordenação e paginação.</w:t>
             </w:r>
           </w:p>
         </w:tc>
@@ -16644,7 +16623,7 @@
           </w:tcPr>
           <w:p>
             <w:r>
-              <w:t>Retornar conforme critérios.</w:t>
+              <w:t>Resultados retornam conforme os critérios combinados.</w:t>
             </w:r>
           </w:p>
         </w:tc>
@@ -16654,7 +16633,7 @@
           </w:tcPr>
           <w:p>
             <w:r>
-              <w:t>Filtros limitados; ordenação concluída.</w:t>
+              <w:t>Filtros avançados e ordenação concluídos; aceite manual PASS.</w:t>
             </w:r>
           </w:p>
         </w:tc>
@@ -16664,7 +16643,7 @@
           </w:tcPr>
           <w:p>
             <w:r>
-              <w:t>PASS parcial</w:t>
+              <w:t>PASS</w:t>
             </w:r>
           </w:p>
         </w:tc>
@@ -16830,7 +16809,7 @@
           </w:tcPr>
           <w:p>
             <w:r>
-              <w:t>Excluir e gerenciar anúncios.</w:t>
+              <w:t>Excluir, editar e gerenciar anúncios.</w:t>
             </w:r>
           </w:p>
         </w:tc>
@@ -16840,7 +16819,7 @@
           </w:tcPr>
           <w:p>
             <w:r>
-              <w:t>Exclusão OK; edição ausente; aba pausados corrigida.</w:t>
+              <w:t>Exclusão, edição e gerenciamento concluídos; aceite manual PASS.</w:t>
             </w:r>
           </w:p>
         </w:tc>
@@ -16850,7 +16829,7 @@
           </w:tcPr>
           <w:p>
             <w:r>
-              <w:t>PASS parcial</w:t>
+              <w:t>PASS</w:t>
             </w:r>
           </w:p>
         </w:tc>
@@ -16964,7 +16943,7 @@
           </w:tcPr>
           <w:p>
             <w:r>
-              <w:t>Denúncia OK; aprovação agora verifica erros.</w:t>
+              <w:t>Denúncia e moderação concluídas; aprovação verifica erros.</w:t>
             </w:r>
           </w:p>
         </w:tc>
@@ -16974,7 +16953,7 @@
           </w:tcPr>
           <w:p>
             <w:r>
-              <w:t>PASS parcial</w:t>
+              <w:t>PASS</w:t>
             </w:r>
           </w:p>
         </w:tc>
@@ -17036,7 +17015,7 @@
           </w:tcPr>
           <w:p>
             <w:r>
-              <w:t>PASS parcial</w:t>
+              <w:t>PASS</w:t>
             </w:r>
           </w:p>
         </w:tc>
@@ -17150,7 +17129,7 @@
           </w:tcPr>
           <w:p>
             <w:r>
-              <w:t>Não existe; contato disponível por WhatsApp.</w:t>
+              <w:t>Formulário persistente em caixa administrativa; aceite manual PASS.</w:t>
             </w:r>
           </w:p>
         </w:tc>
@@ -17160,7 +17139,7 @@
           </w:tcPr>
           <w:p>
             <w:r>
-              <w:t>FAIL / não implementado</w:t>
+              <w:t>PASS</w:t>
             </w:r>
           </w:p>
         </w:tc>
@@ -17212,7 +17191,7 @@
           </w:tcPr>
           <w:p>
             <w:r>
-              <w:t>Não entregues; parcialmente implementado.</w:t>
+              <w:t>Registro persistente e badge de não lidas confirmados entre contas.</w:t>
             </w:r>
           </w:p>
         </w:tc>
@@ -17222,7 +17201,7 @@
           </w:tcPr>
           <w:p>
             <w:r>
-              <w:t>FAIL</w:t>
+              <w:t>PASS</w:t>
             </w:r>
           </w:p>
         </w:tc>
@@ -17274,7 +17253,7 @@
           </w:tcPr>
           <w:p>
             <w:r>
-              <w:t>Não existe.</w:t>
+              <w:t>Fluxo implementado e aceito manualmente.</w:t>
             </w:r>
           </w:p>
         </w:tc>
@@ -17284,7 +17263,7 @@
           </w:tcPr>
           <w:p>
             <w:r>
-              <w:t>FAIL / não implementado</w:t>
+              <w:t>PASS</w:t>
             </w:r>
           </w:p>
         </w:tc>
@@ -17316,7 +17295,7 @@
           </w:tcPr>
           <w:p>
             <w:r>
-              <w:t>Anúncio ativo.</w:t>
+              <w:t>Anúncio ativo do proprietário.</w:t>
             </w:r>
           </w:p>
         </w:tc>
@@ -17336,7 +17315,7 @@
           </w:tcPr>
           <w:p>
             <w:r>
-              <w:t>Não existe.</w:t>
+              <w:t>RPC protegida e aceite manual PASS.</w:t>
             </w:r>
           </w:p>
         </w:tc>
@@ -17346,7 +17325,7 @@
           </w:tcPr>
           <w:p>
             <w:r>
-              <w:t>FAIL / não implementado</w:t>
+              <w:t>PASS</w:t>
             </w:r>
           </w:p>
         </w:tc>
@@ -17388,7 +17367,7 @@
           </w:tcPr>
           <w:p>
             <w:r>
-              <w:t>Compartilhar link ou rede social.</w:t>
+              <w:t>Compartilhar link.</w:t>
             </w:r>
           </w:p>
         </w:tc>
@@ -17398,7 +17377,7 @@
           </w:tcPr>
           <w:p>
             <w:r>
-              <w:t>Não existe.</w:t>
+              <w:t>Web Share e cópia de link; aceite manual PASS.</w:t>
             </w:r>
           </w:p>
         </w:tc>
@@ -17408,7 +17387,7 @@
           </w:tcPr>
           <w:p>
             <w:r>
-              <w:t>FAIL / não implementado</w:t>
+              <w:t>PASS</w:t>
             </w:r>
           </w:p>
         </w:tc>
@@ -17450,7 +17429,7 @@
           </w:tcPr>
           <w:p>
             <w:r>
-              <w:t>Gerenciar categorias.</w:t>
+              <w:t>Gerenciar marcas e modelos.</w:t>
             </w:r>
           </w:p>
         </w:tc>
@@ -17460,7 +17439,7 @@
           </w:tcPr>
           <w:p>
             <w:r>
-              <w:t>Sem CRUD.</w:t>
+              <w:t>CRUD implementado e aceite manual PASS.</w:t>
             </w:r>
           </w:p>
         </w:tc>
@@ -17470,7 +17449,7 @@
           </w:tcPr>
           <w:p>
             <w:r>
-              <w:t>FAIL parcial</w:t>
+              <w:t>PASS</w:t>
             </w:r>
           </w:p>
         </w:tc>
@@ -17584,7 +17563,7 @@
         <w:jc w:val="both"/>
       </w:pPr>
       <w:r>
-        <w:t>A Figura 5 documenta a tela inicial e deve receber uma captura da home com busca e navegação principal. A Figura 6 deve mostrar autenticação, incluindo login ou logout. A Figura 7 deve reunir marketplace, pesquisa, filtros e detalhes de anúncio. A Figura 8 deve reunir, em subfiguras (a), (b) e (c), a conversa entre duas contas, o envio ou recebimento de foto e o badge de notificação. A Figura 9 deve mostrar publicação ou moderação. Essa distribuição evita criar novas figuras e ajuda a manter o limite de 30 páginas.</w:t>
+        <w:t>A Figura 5 documenta a tela inicial e deve receber uma captura da home com busca e navegação principal. A Figura 6 deve mostrar autenticação, incluindo login ou logout. A Figura 7 deve reunir marketplace, pesquisa, filtros básicos e avançados e detalhes de anúncio. A Figura 8 deve reunir, em subfiguras (a), (b) e (c), a conversa entre duas contas, o envio ou recebimento de foto e o badge de notificação. A Figura 9 deve mostrar publicação, edição, marcação como vendido, gerenciamento administrativo ou moderação. Essa distribuição evita criar novas figuras e ajuda a manter o limite de 30 páginas.</w:t>
       </w:r>
     </w:p>
     <w:p>
@@ -18027,7 +18006,7 @@
         <w:jc w:val="both"/>
       </w:pPr>
       <w:r>
-        <w:t>Os resultados respondem afirmativamente, em caráter de protótipo acadêmico: foi possível reunir cadastro, anúncios, busca, filtros, contato, mensagens entre contas, notificações persistentes, fotos privadas no chat e suporte conversacional mantendo ligação entre requisitos, casos de uso, tabelas e testes. A resposta é qualificada porque o Chatling depende de configuração externa, a validação quantitativa de usabilidade ainda é insuficiente e o sistema não deve ser apresentado como produto comercial pronto.</w:t>
+        <w:t>Os resultados respondem afirmativamente, em caráter de protótipo acadêmico: foi possível reunir cadastro, anúncios, filtros avançados, edição, categorias, venda, compartilhamento, contato, mensagens entre contas, notificações persistentes, fotos privadas no chat e suporte conversacional mantendo ligação entre requisitos, casos de uso, tabelas e testes. A resposta é qualificada porque o Chatling depende de configuração externa, a validação quantitativa de usabilidade ainda é insuficiente e o sistema não deve ser apresentado como produto comercial pronto.</w:t>
       </w:r>
     </w:p>
     <w:p>
@@ -18062,7 +18041,7 @@
         <w:jc w:val="both"/>
       </w:pPr>
       <w:r>
-        <w:t>Os testes indicaram funcionamento satisfatório dos fluxos principais. A comunicação entre duas contas, o envio e recebimento de fotos, as mensagens não lidas, as notificações persistentes, o login, o logout e a responsividade foram confirmados em Chromium e Firefox sobre Arch Linux, além de testes em celular. A plataforma deve ser apresentada como protótipo acadêmico validado, não como produto comercial pronto. A integração é tecnicamente viável, mas depende de acompanhamento, testes ampliados e validações externas.</w:t>
+        <w:t>Os testes indicaram funcionamento satisfatório dos fluxos principais. A comunicação entre duas contas, o envio e recebimento de fotos, as mensagens não lidas, as notificações persistentes, o login, o logout, os filtros avançados, a edição, as categorias, a venda, o compartilhamento, o formulário de contato e a responsividade foram confirmados em Chromium e Firefox sobre Arch Linux, além de testes em celular. A plataforma deve ser apresentada como protótipo acadêmico validado, não como produto comercial pronto. A integração é tecnicamente viável, mas depende de acompanhamento, testes ampliados e validações externas.</w:t>
       </w:r>
     </w:p>
     <w:p>
@@ -18087,7 +18066,7 @@
         <w:jc w:val="both"/>
       </w:pPr>
       <w:r>
-        <w:t>Antes da entrega, inserir as capturas reais na seção 4.2 conforme o mapa definido, preencher o Quadro 6 com executor, data, navegador, sistema, resolução e resultado, e citar na seção 4.4 a evidência do bucket privado. Não incluir todas as telas nem logs completos no DOCX: o conjunto recomendado é de até seis imagens compostas, uma matriz compacta e uma referência ao repositório de evidências. Também devem ser registrados a versão da interface, a configuração do agente, os diálogos reais e a política de dados do Chatling.</w:t>
+        <w:t>Antes da entrega, inserir as capturas reais na seção 4.2 conforme o mapa definido, preencher o Quadro 6 com executor, data, navegador, sistema, resolução e resultado, mantendo a referência ao aceite de 25/10/2026, e citar na seção 4.4 a evidência do bucket privado. Não incluir todas as telas nem logs completos no DOCX: o conjunto recomendado é de até seis imagens compostas, uma matriz compacta e uma referência ao repositório de evidências. Também devem ser registrados a versão da interface, a configuração do agente, os diálogos reais e a política de dados do Chatling.</w:t>
       </w:r>
     </w:p>
     <w:p>

</xml_diff>

<commit_message>
docs: revise article from pre-defense feedback
</commit_message>
<xml_diff>
--- a/ArtigoMG_revisado_MGMOTORSBR.docx
+++ b/ArtigoMG_revisado_MGMOTORSBR.docx
@@ -110,7 +110,34 @@
         <w:jc w:val="both"/>
       </w:pPr>
       <w:r>
-        <w:t>O comércio eletrônico brasileiro vem ampliando sua relevância como canal de pesquisa, comparação e negociação. Este trabalho apresenta o desenvolvimento da MGMOTORSBR, plataforma digital de intermediação de veículos construída com HTML5, CSS3, JavaScript e PostgreSQL gerenciado pelo Supabase. A solução foi delimitada à divulgação de anúncios, pesquisa e filtragem de veículos, contato entre usuários, notificações persistentes e suporte conversacional por inteligência artificial, sem processamento de pagamento ou transferência de propriedade. O percurso metodológico compreendeu levantamento de referências, modelagem de requisitos e casos de uso, projeto do banco de dados, implementação incremental e testes manuais em contas distintas. Os resultados indicaram funcionamento satisfatório dos principais fluxos de cadastro, pesquisa, filtros avançados, anúncios, edição, categorias, venda, compartilhamento, contato, mensagens, envio de fotos, notificações, moderação e navegação responsiva. A comunicação entre contas e as notificações persistentes foram validadas em produção. As fotos novas do chat utilizam bucket privado e URLs assinadas, com controle de acesso por participante. O Chatling foi incorporado como serviço externo, sujeito aos limites do plano Free. O trabalho contribui como protótipo acadêmico funcional e delimita próximos passos de validação de usabilidade, desempenho e proteção de dados.</w:t>
+        <w:rPr>
+          <w:i w:val="0"/>
+        </w:rPr>
+        <w:t xml:space="preserve">O comércio eletrônico brasileiro vem ampliando sua relevância como canal de pesquisa, comparação e negociação. Este trabalho apresenta o desenvolvimento da MGMOTORSBR, plataforma digital de intermediação de veículos construída com HTML5, CSS3, </w:t>
+      </w:r>
+      <w:r>
+        <w:rPr>
+          <w:i/>
+        </w:rPr>
+        <w:t>JavaScript</w:t>
+      </w:r>
+      <w:r>
+        <w:rPr>
+          <w:i w:val="0"/>
+        </w:rPr>
+        <w:t xml:space="preserve"> e PostgreSQL gerenciado pelo Supabase. A solução foi delimitada à divulgação de anúncios, pesquisa e filtragem de veículos, contato entre usuários, notificações persistentes e suporte conversacional por inteligência artificial, sem processamento de pagamento ou transferência de propriedade. O percurso metodológico compreendeu levantamento de referências, modelagem de requisitos e casos de uso, projeto do banco de dados, implementação incremental e testes manuais em contas distintas. Os resultados indicaram funcionamento satisfatório dos principais fluxos de cadastro, pesquisa, filtros avançados, anúncios, edição, categorias, venda, compartilhamento, contato, mensagens, envio de fotos, notificações, moderação e navegação responsiva. A comunicação entre contas e as notificações persistentes foram validadas em produção. As fotos novas do chat utilizam bucket privado e URLs assinadas, com controle de acesso por participante. O </w:t>
+      </w:r>
+      <w:r>
+        <w:rPr>
+          <w:i/>
+        </w:rPr>
+        <w:t>Chatling</w:t>
+      </w:r>
+      <w:r>
+        <w:rPr>
+          <w:i w:val="0"/>
+        </w:rPr>
+        <w:t xml:space="preserve"> foi incorporado como serviço externo, sujeito aos limites do plano Free. O trabalho contribui como protótipo acadêmico funcional e delimita próximos passos de validação de usabilidade, desempenho e proteção de dados.</w:t>
       </w:r>
     </w:p>
     <w:p>
@@ -242,11 +269,7 @@
         <w:jc w:val="both"/>
       </w:pPr>
       <w:r>
-        <w:rPr>
-          <w:rFonts w:ascii="Times New Roman" w:hAnsi="Times New Roman"/>
-          <w:sz w:val="24"/>
-        </w:rPr>
-        <w:t>OLX e Webmotors reúnem anúncios, filtros, informações técnicas e canais de contato, constituindo referências para a comparação funcional (OLX, 2026; WEBMOTORS, 2026). A MGMOTORSBR não pretende afirmar superioridade comercial nem realizar avaliação exaustiva de concorrentes.</w:t>
+        <w:t>OLX e Webmotors reúnem anúncios, filtros, informações técnicas e canais de contato, constituindo referências para a comparação funcional (OLX, s. d.; WEBMOTORS, s. d.). A MGMOTORSBR não pretende afirmar superioridade comercial nem realizar avaliação exaustiva de concorrentes.</w:t>
       </w:r>
     </w:p>
     <w:p>
@@ -310,11 +333,21 @@
       </w:pPr>
       <w:r>
         <w:rPr>
-          <w:rFonts w:ascii="Times New Roman" w:hAnsi="Times New Roman"/>
-          <w:b/>
-          <w:sz w:val="24"/>
+          <w:i w:val="0"/>
         </w:rPr>
-        <w:t>2.1 Comércio eletrônico, marketplaces e plataformas digitais</w:t>
+        <w:t xml:space="preserve">2.1 Comércio eletrônico, </w:t>
+      </w:r>
+      <w:r>
+        <w:rPr>
+          <w:i/>
+        </w:rPr>
+        <w:t>marketplace</w:t>
+      </w:r>
+      <w:r>
+        <w:rPr>
+          <w:i w:val="0"/>
+        </w:rPr>
+        <w:t>s e plataformas digitais</w:t>
       </w:r>
     </w:p>
     <w:p>
@@ -325,10 +358,21 @@
       </w:pPr>
       <w:r>
         <w:rPr>
-          <w:rFonts w:ascii="Times New Roman" w:hAnsi="Times New Roman"/>
-          <w:sz w:val="24"/>
+          <w:i w:val="0"/>
         </w:rPr>
-        <w:t>O comércio eletrônico compreende operações de compra, venda, pesquisa, comunicação e prestação de serviços por meios digitais. Em um marketplace, a plataforma organiza publicação, descoberta, comparação e contato. Pereira e Pinto (2021) observam que a presença digital pode ampliar alcance e influenciar confiança.</w:t>
+        <w:t xml:space="preserve">O comércio eletrônico compreende operações de compra, venda, pesquisa, comunicação e prestação de serviços por meios digitais. Em um </w:t>
+      </w:r>
+      <w:r>
+        <w:rPr>
+          <w:i/>
+        </w:rPr>
+        <w:t>marketplace</w:t>
+      </w:r>
+      <w:r>
+        <w:rPr>
+          <w:i w:val="0"/>
+        </w:rPr>
+        <w:t>, a plataforma organiza publicação, descoberta, comparação e contato. Pereira e Pinto (2021) observam que a presença digital pode ampliar alcance e influenciar confiança.</w:t>
       </w:r>
     </w:p>
     <w:p>
@@ -396,7 +440,22 @@
         <w:jc w:val="both"/>
       </w:pPr>
       <w:r>
-        <w:t>Sistemas automobilísticos organizam características técnicas, preço, localização, fotos, anunciante e interações. A MGMOTORSBR usa arquitetura em que o front-end apresenta e valida dados, o Supabase fornece persistência, autenticação e armazenamento, e o serviço de IA acrescenta interação nos fluxos priorizados. Essa separação permite discutir qualidade segundo a ISO/IEC 25010 (ISO, 2023).</w:t>
+        <w:rPr>
+          <w:i w:val="0"/>
+        </w:rPr>
+        <w:t xml:space="preserve">Sistemas automobilísticos organizam características técnicas, preço, localização, fotos, anunciante e interações. A MGMOTORSBR usa arquitetura em que o </w:t>
+      </w:r>
+      <w:r>
+        <w:rPr>
+          <w:i/>
+        </w:rPr>
+        <w:t>front-end</w:t>
+      </w:r>
+      <w:r>
+        <w:rPr>
+          <w:i w:val="0"/>
+        </w:rPr>
+        <w:t xml:space="preserve"> apresenta e valida dados, o Supabase fornece persistência, autenticação e armazenamento, e o serviço de IA acrescenta interação nos fluxos priorizados. Essa separação permite discutir qualidade segundo a ISO/IEC 25010 (ISO, 2023).</w:t>
       </w:r>
     </w:p>
     <w:p>
@@ -407,10 +466,81 @@
       </w:pPr>
       <w:r>
         <w:rPr>
-          <w:rFonts w:ascii="Times New Roman" w:hAnsi="Times New Roman"/>
-          <w:sz w:val="24"/>
+          <w:i w:val="0"/>
         </w:rPr>
-        <w:t>O Chatling foi incorporado ao front-end por meio do script JavaScript fornecido pelo serviço, com o identificador 6944231868. A integração utiliza o plano Free, que disponibiliza 200 créditos de IA por mês, um agente, um assento, 500.000 caracteres na base de conhecimento e 25 créditos de e-mail por mês. O plano também limita a dois AI Actions por agente, um workflow por agente, upload individual de arquivo a 1 MB e mantém personalização limitada e a marca “Powered by Chatling”. Os créditos são mensais e o consumo varia conforme o modelo de IA. A versão específica da interface e a configuração detalhada do agente ainda dependem do painel do provedor.</w:t>
+        <w:t xml:space="preserve">O </w:t>
+      </w:r>
+      <w:r>
+        <w:rPr>
+          <w:i/>
+        </w:rPr>
+        <w:t>Chatling</w:t>
+      </w:r>
+      <w:r>
+        <w:rPr>
+          <w:i w:val="0"/>
+        </w:rPr>
+        <w:t xml:space="preserve"> foi incorporado ao </w:t>
+      </w:r>
+      <w:r>
+        <w:rPr>
+          <w:i/>
+        </w:rPr>
+        <w:t>front-end</w:t>
+      </w:r>
+      <w:r>
+        <w:rPr>
+          <w:i w:val="0"/>
+        </w:rPr>
+        <w:t xml:space="preserve"> por meio do script </w:t>
+      </w:r>
+      <w:r>
+        <w:rPr>
+          <w:i/>
+        </w:rPr>
+        <w:t>JavaScript</w:t>
+      </w:r>
+      <w:r>
+        <w:rPr>
+          <w:i w:val="0"/>
+        </w:rPr>
+        <w:t xml:space="preserve"> fornecido pelo serviço, com o identificador 6944231868. A integração utiliza o plano Free, que disponibiliza 200 créditos de IA por mês, um agente, um assento, 500.000 caracteres na base de conhecimento e 25 créditos de e-mail por mês. O plano também limita a dois AI Actions por agente, um workflow por agente, </w:t>
+      </w:r>
+      <w:r>
+        <w:rPr>
+          <w:i/>
+        </w:rPr>
+        <w:t>upload</w:t>
+      </w:r>
+      <w:r>
+        <w:rPr>
+          <w:i w:val="0"/>
+        </w:rPr>
+        <w:t xml:space="preserve"> individual de arquivo a 1 MB e mantém personalização limitada e a marca “Powered by </w:t>
+      </w:r>
+      <w:r>
+        <w:rPr>
+          <w:i/>
+        </w:rPr>
+        <w:t>Chatling</w:t>
+      </w:r>
+      <w:r>
+        <w:rPr>
+          <w:i w:val="0"/>
+        </w:rPr>
+        <w:t>”. Os créditos são mensais e o consumo varia conforme o modelo de IA. A versão específica da interface e a configuração detalhada do agente ainda dependem do painel do provedor. Os limites do plano foram conferidos na página oficial de preços (</w:t>
+      </w:r>
+      <w:r>
+        <w:rPr>
+          <w:i/>
+        </w:rPr>
+        <w:t>CHATLING</w:t>
+      </w:r>
+      <w:r>
+        <w:rPr>
+          <w:i w:val="0"/>
+        </w:rPr>
+        <w:t>, 2026).</w:t>
       </w:r>
     </w:p>
     <w:p>
@@ -465,40 +595,21 @@
       </w:pPr>
       <w:r>
         <w:rPr>
-          <w:rFonts w:ascii="Times New Roman" w:hAnsi="Times New Roman"/>
-          <w:sz w:val="24"/>
+          <w:i w:val="0"/>
         </w:rPr>
         <w:t xml:space="preserve">A MGMOTORSBR trata dados de cadastro, contato, anúncios, mensagens e imagens. A LGPD exige transparência sobre finalidades, bases legais, canais, retenção e direitos dos titulares (BRASIL, 2018). O protótipo adota autenticação, controle de acesso, políticas de </w:t>
       </w:r>
       <w:r>
         <w:rPr>
-          <w:rFonts w:ascii="Times New Roman" w:hAnsi="Times New Roman"/>
           <w:i/>
-          <w:sz w:val="24"/>
         </w:rPr>
         <w:t>Row Level Security</w:t>
       </w:r>
       <w:r>
         <w:rPr>
-          <w:rFonts w:ascii="Times New Roman" w:hAnsi="Times New Roman"/>
-          <w:sz w:val="24"/>
+          <w:i w:val="0"/>
         </w:rPr>
-        <w:t xml:space="preserve"> (</w:t>
-      </w:r>
-      <w:r>
-        <w:rPr>
-          <w:rFonts w:ascii="Times New Roman" w:hAnsi="Times New Roman"/>
-          <w:i/>
-          <w:sz w:val="24"/>
-        </w:rPr>
-        <w:t>RLS</w:t>
-      </w:r>
-      <w:r>
-        <w:rPr>
-          <w:rFonts w:ascii="Times New Roman" w:hAnsi="Times New Roman"/>
-          <w:sz w:val="24"/>
-        </w:rPr>
-        <w:t>) e validação, mas não afirma conformidade jurídica integral.</w:t>
+        <w:t xml:space="preserve"> (RLS) e validação, mas não afirma conformidade jurídica integral.</w:t>
       </w:r>
     </w:p>
     <w:p>
@@ -523,11 +634,7 @@
         <w:jc w:val="both"/>
       </w:pPr>
       <w:r>
-        <w:rPr>
-          <w:rFonts w:ascii="Times New Roman" w:hAnsi="Times New Roman"/>
-          <w:sz w:val="24"/>
-        </w:rPr>
-        <w:t>A literatura discute comércio eletrônico, inteligência artificial, responsabilidade de plataformas e chatbots. Carvalho Sobrinho e Oliveira Filho (2025) ressaltam responsabilidades da intermediação digital. OLX Autos, Webmotors e Mobiauto foram observadas como referências públicas. A MGMOTORSBR é posicionada como protótipo acadêmico aplicado, com combinação de anúncios, filtros, comunicação, moderação e apoio conversacional em pequena escala.</w:t>
+        <w:t>A literatura discute comércio eletrônico, inteligência artificial, responsabilidade de plataformas e chatbots. Carvalho Sobrinho e Oliveira Filho (2025) ressaltam responsabilidades da intermediação digital. OLX Autos, Webmotors e Mobiauto foram observadas como referências públicas (OLX, s. d.; WEBMOTORS, s. d.; MOBIAUTO, s. d.). A MGMOTORSBR é posicionada como protótipo acadêmico aplicado, com combinação de anúncios, filtros, comunicação, moderação e apoio conversacional em pequena escala.</w:t>
       </w:r>
     </w:p>
     <w:p>
@@ -4296,11 +4403,7 @@
         <w:jc w:val="both"/>
       </w:pPr>
       <w:r>
-        <w:rPr>
-          <w:rFonts w:ascii="Times New Roman" w:hAnsi="Times New Roman"/>
-          <w:sz w:val="24"/>
-        </w:rPr>
-        <w:t>O projeto foi desenvolvido no Instituto Federal do Paraná, Centro de Referência IFPR-Biopark, por estudantes autores e professores orientadores, entre fevereiro de 2025 e agosto de 2026, em atividades presenciais e remotas. A versão final deve registrar interrupções, mudanças de escopo e marcos curriculares, pois o artigo original não os detalhava.</w:t>
+        <w:t>O projeto foi desenvolvido no Instituto Federal do Paraná, Centro de Referência IFPR-Biopark, por estudantes autores e professores orientadores, entre fevereiro de 2025 e agosto de 2026, em atividades presenciais e remotas. O documento não registra interrupções ou marcos curriculares específicos; essa ausência é uma limitação do registro metodológico.</w:t>
       </w:r>
     </w:p>
     <w:p>
@@ -4325,7 +4428,58 @@
         <w:jc w:val="both"/>
       </w:pPr>
       <w:r>
-        <w:t>O front-end utiliza HTML5, CSS3 e JavaScript sem framework. O Supabase Free fornece PostgreSQL, autenticação, Storage e endpoints; o cliente é @supabase/supabase-js 2.45.4. As fotos novas das conversas são armazenadas no bucket privado FOTOS-MENSAGENS e acessadas por URLs assinadas, enquanto as fotos antigas permanecem compatíveis. O ambiente de desenvolvimento utilizou Node.js 26.12.0 e Visual Studio Code 1.142.0. Git e GitHub foram usados para versionamento e o site está publicado no Vercel, no endereço oficial https://mgmotorss.vercel.app/MG-INICIO/inicio.html. Repositório: https://github.com/murilotecoteco/MGMOTORSBR.</w:t>
+        <w:rPr>
+          <w:i w:val="0"/>
+        </w:rPr>
+        <w:t xml:space="preserve">O </w:t>
+      </w:r>
+      <w:r>
+        <w:rPr>
+          <w:i/>
+        </w:rPr>
+        <w:t>front-end</w:t>
+      </w:r>
+      <w:r>
+        <w:rPr>
+          <w:i w:val="0"/>
+        </w:rPr>
+        <w:t xml:space="preserve"> utiliza HTML5, CSS3 e </w:t>
+      </w:r>
+      <w:r>
+        <w:rPr>
+          <w:i/>
+        </w:rPr>
+        <w:t>JavaScript</w:t>
+      </w:r>
+      <w:r>
+        <w:rPr>
+          <w:i w:val="0"/>
+        </w:rPr>
+        <w:t xml:space="preserve"> sem framework. O Supabase Free fornece PostgreSQL, autenticação, </w:t>
+      </w:r>
+      <w:r>
+        <w:rPr>
+          <w:i/>
+        </w:rPr>
+        <w:t>Storage</w:t>
+      </w:r>
+      <w:r>
+        <w:rPr>
+          <w:i w:val="0"/>
+        </w:rPr>
+        <w:t xml:space="preserve"> e </w:t>
+      </w:r>
+      <w:r>
+        <w:rPr>
+          <w:i/>
+        </w:rPr>
+        <w:t>endpoint</w:t>
+      </w:r>
+      <w:r>
+        <w:rPr>
+          <w:i w:val="0"/>
+        </w:rPr>
+        <w:t>s; o cliente é @supabase/supabase-js 2.45.4. As fotos novas das conversas são armazenadas no bucket privado FOTOS-MENSAGENS e acessadas por URLs assinadas, enquanto as fotos antigas permanecem compatíveis. O ambiente de desenvolvimento utilizou Node.js 26.12.0 e Visual Studio Code 1.142.0. A versão do PostgreSQL provisionado pelo Supabase, a versão da CLI do Supabase e as extensões do VS Code não foram registradas. Git e GitHub foram usados para versionamento e o site está publicado no Vercel, no endereço oficial https://mgmotorss.vercel.app/MG-INICIO/inicio.html. Repositório: https://github.com/murilotecoteco/MGMOTORSBR. O README informa que nenhuma licença foi aplicada ao projeto educacional.</w:t>
       </w:r>
     </w:p>
     <w:p>
@@ -4335,7 +4489,7 @@
         <w:jc w:val="both"/>
       </w:pPr>
       <w:r>
-        <w:t>Nos testes e no desenvolvimento foram utilizados Arch Linux e Windows, com Firefox, Brave e Chrome. A validação final registrada pelos autores foi realizada em Chromium e Firefox sobre Arch Linux, além de testes em dispositivo móvel. Foram confirmados login, logout, filtros avançados, edição, categorias, venda, compartilhamento, formulário de contato, mensagens entre duas contas, envio e recebimento de fotos, mensagens não lidas, notificações persistentes, atualização das conversas e funcionamento responsivo. A versão específica dos navegadores e as resoluções devem ser mantidas no diário de testes quando a banca solicitar reprodução detalhada.</w:t>
+        <w:t>Nos testes e no desenvolvimento foram utilizados Arch Linux e Windows. A validação final registrada pelos autores foi realizada em Chromium e Firefox sobre Arch Linux, além de testes em dispositivo móvel. Foram confirmados login, logout, filtros avançados, edição, categorias, venda, compartilhamento, formulário de contato, mensagens entre duas contas, envio e recebimento de fotos, mensagens não lidas, notificações persistentes, atualização das conversas e funcionamento responsivo. O aceite não registrou as versões exatas dos navegadores, o modelo do dispositivo móvel nem as resoluções utilizadas.</w:t>
       </w:r>
     </w:p>
     <w:p>
@@ -9336,7 +9490,34 @@
         <w:jc w:val="both"/>
       </w:pPr>
       <w:r>
-        <w:t>O schema em supabase/migrations apresenta como entidades centrais usuarios, anuncios, marcas, modelos, versoes, fotos_anuncio, favoritos, curtidas_anuncio, mensagens, notificacoes, conversas, denuncias, seguidores e config_usuario. A descrição foi corrigida para refletir o schema atual. Chaves e políticas de Row Level Security organizam integridade e acesso. As imagens de anúncios e as imagens privadas de conversas possuem tratamentos distintos no Supabase Storage.</w:t>
+        <w:rPr>
+          <w:i w:val="0"/>
+        </w:rPr>
+        <w:t xml:space="preserve">O schema em supabase/migrations apresenta como entidades centrais usuarios, anuncios, marcas, modelos, versoes, fotos_anuncio, favoritos, curtidas_anuncio, mensagens, notificacoes, conversas, denuncias, seguidores e config_usuario. A descrição foi corrigida para refletir o schema atual. Chaves e políticas de </w:t>
+      </w:r>
+      <w:r>
+        <w:rPr>
+          <w:i/>
+        </w:rPr>
+        <w:t>Row Level Security</w:t>
+      </w:r>
+      <w:r>
+        <w:rPr>
+          <w:i w:val="0"/>
+        </w:rPr>
+        <w:t xml:space="preserve"> organizam integridade e acesso. As imagens de anúncios e as imagens privadas de conversas possuem tratamentos distintos no Supabase </w:t>
+      </w:r>
+      <w:r>
+        <w:rPr>
+          <w:i/>
+        </w:rPr>
+        <w:t>Storage</w:t>
+      </w:r>
+      <w:r>
+        <w:rPr>
+          <w:i w:val="0"/>
+        </w:rPr>
+        <w:t>.</w:t>
       </w:r>
     </w:p>
     <w:p>
@@ -9415,1057 +9596,21 @@
       </w:pPr>
       <w:r>
         <w:rPr>
-          <w:rFonts w:ascii="Times New Roman" w:hAnsi="Times New Roman"/>
+          <w:i w:val="0"/>
+        </w:rPr>
+        <w:t xml:space="preserve">A Figura 2 mostra responsabilidades; a Figura 3 explicita entidades persistidas, chaves e cardinalidades. Imagens são armazenadas no Supabase </w:t>
+      </w:r>
+      <w:r>
+        <w:rPr>
           <w:i/>
-          <w:sz w:val="24"/>
         </w:rPr>
-        <w:t>A</w:t>
+        <w:t>Storage</w:t>
       </w:r>
       <w:r>
         <w:rPr>
-          <w:rFonts w:ascii="Times New Roman" w:hAnsi="Times New Roman"/>
-          <w:sz w:val="24"/>
+          <w:i w:val="0"/>
         </w:rPr>
-        <w:t xml:space="preserve"> Fi</w:t>
-      </w:r>
-      <w:r>
-        <w:rPr>
-          <w:rFonts w:ascii="Times New Roman" w:hAnsi="Times New Roman"/>
-          <w:i/>
-          <w:sz w:val="24"/>
-        </w:rPr>
-        <w:t>g</w:t>
-      </w:r>
-      <w:r>
-        <w:rPr>
-          <w:rFonts w:ascii="Times New Roman" w:hAnsi="Times New Roman"/>
-          <w:sz w:val="24"/>
-        </w:rPr>
-        <w:t>u</w:t>
-      </w:r>
-      <w:r>
-        <w:rPr>
-          <w:rFonts w:ascii="Times New Roman" w:hAnsi="Times New Roman"/>
-          <w:i/>
-          <w:sz w:val="24"/>
-        </w:rPr>
-        <w:t>r</w:t>
-      </w:r>
-      <w:r>
-        <w:rPr>
-          <w:rFonts w:ascii="Times New Roman" w:hAnsi="Times New Roman"/>
-          <w:i/>
-          <w:sz w:val="24"/>
-        </w:rPr>
-        <w:t>a</w:t>
-      </w:r>
-      <w:r>
-        <w:rPr>
-          <w:rFonts w:ascii="Times New Roman" w:hAnsi="Times New Roman"/>
-          <w:sz w:val="24"/>
-        </w:rPr>
-        <w:t xml:space="preserve"> 2 m</w:t>
-      </w:r>
-      <w:r>
-        <w:rPr>
-          <w:rFonts w:ascii="Times New Roman" w:hAnsi="Times New Roman"/>
-          <w:i/>
-          <w:sz w:val="24"/>
-        </w:rPr>
-        <w:t>o</w:t>
-      </w:r>
-      <w:r>
-        <w:rPr>
-          <w:rFonts w:ascii="Times New Roman" w:hAnsi="Times New Roman"/>
-          <w:i/>
-          <w:sz w:val="24"/>
-        </w:rPr>
-        <w:t>s</w:t>
-      </w:r>
-      <w:r>
-        <w:rPr>
-          <w:rFonts w:ascii="Times New Roman" w:hAnsi="Times New Roman"/>
-          <w:i/>
-          <w:sz w:val="24"/>
-        </w:rPr>
-        <w:t>t</w:t>
-      </w:r>
-      <w:r>
-        <w:rPr>
-          <w:rFonts w:ascii="Times New Roman" w:hAnsi="Times New Roman"/>
-          <w:i/>
-          <w:sz w:val="24"/>
-        </w:rPr>
-        <w:t>r</w:t>
-      </w:r>
-      <w:r>
-        <w:rPr>
-          <w:rFonts w:ascii="Times New Roman" w:hAnsi="Times New Roman"/>
-          <w:i/>
-          <w:sz w:val="24"/>
-        </w:rPr>
-        <w:t>a</w:t>
-      </w:r>
-      <w:r>
-        <w:rPr>
-          <w:rFonts w:ascii="Times New Roman" w:hAnsi="Times New Roman"/>
-          <w:sz w:val="24"/>
-        </w:rPr>
-        <w:t xml:space="preserve"> </w:t>
-      </w:r>
-      <w:r>
-        <w:rPr>
-          <w:rFonts w:ascii="Times New Roman" w:hAnsi="Times New Roman"/>
-          <w:i/>
-          <w:sz w:val="24"/>
-        </w:rPr>
-        <w:t>r</w:t>
-      </w:r>
-      <w:r>
-        <w:rPr>
-          <w:rFonts w:ascii="Times New Roman" w:hAnsi="Times New Roman"/>
-          <w:i/>
-          <w:sz w:val="24"/>
-        </w:rPr>
-        <w:t>e</w:t>
-      </w:r>
-      <w:r>
-        <w:rPr>
-          <w:rFonts w:ascii="Times New Roman" w:hAnsi="Times New Roman"/>
-          <w:i/>
-          <w:sz w:val="24"/>
-        </w:rPr>
-        <w:t>s</w:t>
-      </w:r>
-      <w:r>
-        <w:rPr>
-          <w:rFonts w:ascii="Times New Roman" w:hAnsi="Times New Roman"/>
-          <w:sz w:val="24"/>
-        </w:rPr>
-        <w:t>p</w:t>
-      </w:r>
-      <w:r>
-        <w:rPr>
-          <w:rFonts w:ascii="Times New Roman" w:hAnsi="Times New Roman"/>
-          <w:i/>
-          <w:sz w:val="24"/>
-        </w:rPr>
-        <w:t>o</w:t>
-      </w:r>
-      <w:r>
-        <w:rPr>
-          <w:rFonts w:ascii="Times New Roman" w:hAnsi="Times New Roman"/>
-          <w:sz w:val="24"/>
-        </w:rPr>
-        <w:t>n</w:t>
-      </w:r>
-      <w:r>
-        <w:rPr>
-          <w:rFonts w:ascii="Times New Roman" w:hAnsi="Times New Roman"/>
-          <w:i/>
-          <w:sz w:val="24"/>
-        </w:rPr>
-        <w:t>s</w:t>
-      </w:r>
-      <w:r>
-        <w:rPr>
-          <w:rFonts w:ascii="Times New Roman" w:hAnsi="Times New Roman"/>
-          <w:i/>
-          <w:sz w:val="24"/>
-        </w:rPr>
-        <w:t>a</w:t>
-      </w:r>
-      <w:r>
-        <w:rPr>
-          <w:rFonts w:ascii="Times New Roman" w:hAnsi="Times New Roman"/>
-          <w:sz w:val="24"/>
-        </w:rPr>
-        <w:t>bilid</w:t>
-      </w:r>
-      <w:r>
-        <w:rPr>
-          <w:rFonts w:ascii="Times New Roman" w:hAnsi="Times New Roman"/>
-          <w:i/>
-          <w:sz w:val="24"/>
-        </w:rPr>
-        <w:t>a</w:t>
-      </w:r>
-      <w:r>
-        <w:rPr>
-          <w:rFonts w:ascii="Times New Roman" w:hAnsi="Times New Roman"/>
-          <w:sz w:val="24"/>
-        </w:rPr>
-        <w:t>d</w:t>
-      </w:r>
-      <w:r>
-        <w:rPr>
-          <w:rFonts w:ascii="Times New Roman" w:hAnsi="Times New Roman"/>
-          <w:i/>
-          <w:sz w:val="24"/>
-        </w:rPr>
-        <w:t>e</w:t>
-      </w:r>
-      <w:r>
-        <w:rPr>
-          <w:rFonts w:ascii="Times New Roman" w:hAnsi="Times New Roman"/>
-          <w:i/>
-          <w:sz w:val="24"/>
-        </w:rPr>
-        <w:t>s</w:t>
-      </w:r>
-      <w:r>
-        <w:rPr>
-          <w:rFonts w:ascii="Times New Roman" w:hAnsi="Times New Roman"/>
-          <w:sz w:val="24"/>
-        </w:rPr>
-        <w:t xml:space="preserve">; </w:t>
-      </w:r>
-      <w:r>
-        <w:rPr>
-          <w:rFonts w:ascii="Times New Roman" w:hAnsi="Times New Roman"/>
-          <w:i/>
-          <w:sz w:val="24"/>
-        </w:rPr>
-        <w:t>a</w:t>
-      </w:r>
-      <w:r>
-        <w:rPr>
-          <w:rFonts w:ascii="Times New Roman" w:hAnsi="Times New Roman"/>
-          <w:sz w:val="24"/>
-        </w:rPr>
-        <w:t xml:space="preserve"> Fi</w:t>
-      </w:r>
-      <w:r>
-        <w:rPr>
-          <w:rFonts w:ascii="Times New Roman" w:hAnsi="Times New Roman"/>
-          <w:i/>
-          <w:sz w:val="24"/>
-        </w:rPr>
-        <w:t>g</w:t>
-      </w:r>
-      <w:r>
-        <w:rPr>
-          <w:rFonts w:ascii="Times New Roman" w:hAnsi="Times New Roman"/>
-          <w:sz w:val="24"/>
-        </w:rPr>
-        <w:t>u</w:t>
-      </w:r>
-      <w:r>
-        <w:rPr>
-          <w:rFonts w:ascii="Times New Roman" w:hAnsi="Times New Roman"/>
-          <w:i/>
-          <w:sz w:val="24"/>
-        </w:rPr>
-        <w:t>r</w:t>
-      </w:r>
-      <w:r>
-        <w:rPr>
-          <w:rFonts w:ascii="Times New Roman" w:hAnsi="Times New Roman"/>
-          <w:i/>
-          <w:sz w:val="24"/>
-        </w:rPr>
-        <w:t>a</w:t>
-      </w:r>
-      <w:r>
-        <w:rPr>
-          <w:rFonts w:ascii="Times New Roman" w:hAnsi="Times New Roman"/>
-          <w:sz w:val="24"/>
-        </w:rPr>
-        <w:t xml:space="preserve"> 3 </w:t>
-      </w:r>
-      <w:r>
-        <w:rPr>
-          <w:rFonts w:ascii="Times New Roman" w:hAnsi="Times New Roman"/>
-          <w:i/>
-          <w:sz w:val="24"/>
-        </w:rPr>
-        <w:t>e</w:t>
-      </w:r>
-      <w:r>
-        <w:rPr>
-          <w:rFonts w:ascii="Times New Roman" w:hAnsi="Times New Roman"/>
-          <w:sz w:val="24"/>
-        </w:rPr>
-        <w:t>xplici</w:t>
-      </w:r>
-      <w:r>
-        <w:rPr>
-          <w:rFonts w:ascii="Times New Roman" w:hAnsi="Times New Roman"/>
-          <w:i/>
-          <w:sz w:val="24"/>
-        </w:rPr>
-        <w:t>t</w:t>
-      </w:r>
-      <w:r>
-        <w:rPr>
-          <w:rFonts w:ascii="Times New Roman" w:hAnsi="Times New Roman"/>
-          <w:i/>
-          <w:sz w:val="24"/>
-        </w:rPr>
-        <w:t>a</w:t>
-      </w:r>
-      <w:r>
-        <w:rPr>
-          <w:rFonts w:ascii="Times New Roman" w:hAnsi="Times New Roman"/>
-          <w:sz w:val="24"/>
-        </w:rPr>
-        <w:t xml:space="preserve"> </w:t>
-      </w:r>
-      <w:r>
-        <w:rPr>
-          <w:rFonts w:ascii="Times New Roman" w:hAnsi="Times New Roman"/>
-          <w:i/>
-          <w:sz w:val="24"/>
-        </w:rPr>
-        <w:t>e</w:t>
-      </w:r>
-      <w:r>
-        <w:rPr>
-          <w:rFonts w:ascii="Times New Roman" w:hAnsi="Times New Roman"/>
-          <w:sz w:val="24"/>
-        </w:rPr>
-        <w:t>n</w:t>
-      </w:r>
-      <w:r>
-        <w:rPr>
-          <w:rFonts w:ascii="Times New Roman" w:hAnsi="Times New Roman"/>
-          <w:i/>
-          <w:sz w:val="24"/>
-        </w:rPr>
-        <w:t>t</w:t>
-      </w:r>
-      <w:r>
-        <w:rPr>
-          <w:rFonts w:ascii="Times New Roman" w:hAnsi="Times New Roman"/>
-          <w:sz w:val="24"/>
-        </w:rPr>
-        <w:t>id</w:t>
-      </w:r>
-      <w:r>
-        <w:rPr>
-          <w:rFonts w:ascii="Times New Roman" w:hAnsi="Times New Roman"/>
-          <w:i/>
-          <w:sz w:val="24"/>
-        </w:rPr>
-        <w:t>a</w:t>
-      </w:r>
-      <w:r>
-        <w:rPr>
-          <w:rFonts w:ascii="Times New Roman" w:hAnsi="Times New Roman"/>
-          <w:sz w:val="24"/>
-        </w:rPr>
-        <w:t>d</w:t>
-      </w:r>
-      <w:r>
-        <w:rPr>
-          <w:rFonts w:ascii="Times New Roman" w:hAnsi="Times New Roman"/>
-          <w:i/>
-          <w:sz w:val="24"/>
-        </w:rPr>
-        <w:t>e</w:t>
-      </w:r>
-      <w:r>
-        <w:rPr>
-          <w:rFonts w:ascii="Times New Roman" w:hAnsi="Times New Roman"/>
-          <w:i/>
-          <w:sz w:val="24"/>
-        </w:rPr>
-        <w:t>s</w:t>
-      </w:r>
-      <w:r>
-        <w:rPr>
-          <w:rFonts w:ascii="Times New Roman" w:hAnsi="Times New Roman"/>
-          <w:sz w:val="24"/>
-        </w:rPr>
-        <w:t xml:space="preserve"> p</w:t>
-      </w:r>
-      <w:r>
-        <w:rPr>
-          <w:rFonts w:ascii="Times New Roman" w:hAnsi="Times New Roman"/>
-          <w:i/>
-          <w:sz w:val="24"/>
-        </w:rPr>
-        <w:t>e</w:t>
-      </w:r>
-      <w:r>
-        <w:rPr>
-          <w:rFonts w:ascii="Times New Roman" w:hAnsi="Times New Roman"/>
-          <w:i/>
-          <w:sz w:val="24"/>
-        </w:rPr>
-        <w:t>r</w:t>
-      </w:r>
-      <w:r>
-        <w:rPr>
-          <w:rFonts w:ascii="Times New Roman" w:hAnsi="Times New Roman"/>
-          <w:i/>
-          <w:sz w:val="24"/>
-        </w:rPr>
-        <w:t>s</w:t>
-      </w:r>
-      <w:r>
-        <w:rPr>
-          <w:rFonts w:ascii="Times New Roman" w:hAnsi="Times New Roman"/>
-          <w:sz w:val="24"/>
-        </w:rPr>
-        <w:t>i</w:t>
-      </w:r>
-      <w:r>
-        <w:rPr>
-          <w:rFonts w:ascii="Times New Roman" w:hAnsi="Times New Roman"/>
-          <w:i/>
-          <w:sz w:val="24"/>
-        </w:rPr>
-        <w:t>s</w:t>
-      </w:r>
-      <w:r>
-        <w:rPr>
-          <w:rFonts w:ascii="Times New Roman" w:hAnsi="Times New Roman"/>
-          <w:i/>
-          <w:sz w:val="24"/>
-        </w:rPr>
-        <w:t>t</w:t>
-      </w:r>
-      <w:r>
-        <w:rPr>
-          <w:rFonts w:ascii="Times New Roman" w:hAnsi="Times New Roman"/>
-          <w:sz w:val="24"/>
-        </w:rPr>
-        <w:t>id</w:t>
-      </w:r>
-      <w:r>
-        <w:rPr>
-          <w:rFonts w:ascii="Times New Roman" w:hAnsi="Times New Roman"/>
-          <w:i/>
-          <w:sz w:val="24"/>
-        </w:rPr>
-        <w:t>a</w:t>
-      </w:r>
-      <w:r>
-        <w:rPr>
-          <w:rFonts w:ascii="Times New Roman" w:hAnsi="Times New Roman"/>
-          <w:i/>
-          <w:sz w:val="24"/>
-        </w:rPr>
-        <w:t>s</w:t>
-      </w:r>
-      <w:r>
-        <w:rPr>
-          <w:rFonts w:ascii="Times New Roman" w:hAnsi="Times New Roman"/>
-          <w:sz w:val="24"/>
-        </w:rPr>
-        <w:t>, ch</w:t>
-      </w:r>
-      <w:r>
-        <w:rPr>
-          <w:rFonts w:ascii="Times New Roman" w:hAnsi="Times New Roman"/>
-          <w:i/>
-          <w:sz w:val="24"/>
-        </w:rPr>
-        <w:t>a</w:t>
-      </w:r>
-      <w:r>
-        <w:rPr>
-          <w:rFonts w:ascii="Times New Roman" w:hAnsi="Times New Roman"/>
-          <w:sz w:val="24"/>
-        </w:rPr>
-        <w:t>v</w:t>
-      </w:r>
-      <w:r>
-        <w:rPr>
-          <w:rFonts w:ascii="Times New Roman" w:hAnsi="Times New Roman"/>
-          <w:i/>
-          <w:sz w:val="24"/>
-        </w:rPr>
-        <w:t>e</w:t>
-      </w:r>
-      <w:r>
-        <w:rPr>
-          <w:rFonts w:ascii="Times New Roman" w:hAnsi="Times New Roman"/>
-          <w:i/>
-          <w:sz w:val="24"/>
-        </w:rPr>
-        <w:t>s</w:t>
-      </w:r>
-      <w:r>
-        <w:rPr>
-          <w:rFonts w:ascii="Times New Roman" w:hAnsi="Times New Roman"/>
-          <w:sz w:val="24"/>
-        </w:rPr>
-        <w:t xml:space="preserve"> </w:t>
-      </w:r>
-      <w:r>
-        <w:rPr>
-          <w:rFonts w:ascii="Times New Roman" w:hAnsi="Times New Roman"/>
-          <w:i/>
-          <w:sz w:val="24"/>
-        </w:rPr>
-        <w:t>e</w:t>
-      </w:r>
-      <w:r>
-        <w:rPr>
-          <w:rFonts w:ascii="Times New Roman" w:hAnsi="Times New Roman"/>
-          <w:sz w:val="24"/>
-        </w:rPr>
-        <w:t xml:space="preserve"> c</w:t>
-      </w:r>
-      <w:r>
-        <w:rPr>
-          <w:rFonts w:ascii="Times New Roman" w:hAnsi="Times New Roman"/>
-          <w:i/>
-          <w:sz w:val="24"/>
-        </w:rPr>
-        <w:t>a</w:t>
-      </w:r>
-      <w:r>
-        <w:rPr>
-          <w:rFonts w:ascii="Times New Roman" w:hAnsi="Times New Roman"/>
-          <w:i/>
-          <w:sz w:val="24"/>
-        </w:rPr>
-        <w:t>r</w:t>
-      </w:r>
-      <w:r>
-        <w:rPr>
-          <w:rFonts w:ascii="Times New Roman" w:hAnsi="Times New Roman"/>
-          <w:sz w:val="24"/>
-        </w:rPr>
-        <w:t>din</w:t>
-      </w:r>
-      <w:r>
-        <w:rPr>
-          <w:rFonts w:ascii="Times New Roman" w:hAnsi="Times New Roman"/>
-          <w:i/>
-          <w:sz w:val="24"/>
-        </w:rPr>
-        <w:t>a</w:t>
-      </w:r>
-      <w:r>
-        <w:rPr>
-          <w:rFonts w:ascii="Times New Roman" w:hAnsi="Times New Roman"/>
-          <w:sz w:val="24"/>
-        </w:rPr>
-        <w:t>lid</w:t>
-      </w:r>
-      <w:r>
-        <w:rPr>
-          <w:rFonts w:ascii="Times New Roman" w:hAnsi="Times New Roman"/>
-          <w:i/>
-          <w:sz w:val="24"/>
-        </w:rPr>
-        <w:t>a</w:t>
-      </w:r>
-      <w:r>
-        <w:rPr>
-          <w:rFonts w:ascii="Times New Roman" w:hAnsi="Times New Roman"/>
-          <w:sz w:val="24"/>
-        </w:rPr>
-        <w:t>d</w:t>
-      </w:r>
-      <w:r>
-        <w:rPr>
-          <w:rFonts w:ascii="Times New Roman" w:hAnsi="Times New Roman"/>
-          <w:i/>
-          <w:sz w:val="24"/>
-        </w:rPr>
-        <w:t>e</w:t>
-      </w:r>
-      <w:r>
-        <w:rPr>
-          <w:rFonts w:ascii="Times New Roman" w:hAnsi="Times New Roman"/>
-          <w:i/>
-          <w:sz w:val="24"/>
-        </w:rPr>
-        <w:t>s</w:t>
-      </w:r>
-      <w:r>
-        <w:rPr>
-          <w:rFonts w:ascii="Times New Roman" w:hAnsi="Times New Roman"/>
-          <w:sz w:val="24"/>
-        </w:rPr>
-        <w:t>. Im</w:t>
-      </w:r>
-      <w:r>
-        <w:rPr>
-          <w:rFonts w:ascii="Times New Roman" w:hAnsi="Times New Roman"/>
-          <w:i/>
-          <w:sz w:val="24"/>
-        </w:rPr>
-        <w:t>a</w:t>
-      </w:r>
-      <w:r>
-        <w:rPr>
-          <w:rFonts w:ascii="Times New Roman" w:hAnsi="Times New Roman"/>
-          <w:i/>
-          <w:sz w:val="24"/>
-        </w:rPr>
-        <w:t>g</w:t>
-      </w:r>
-      <w:r>
-        <w:rPr>
-          <w:rFonts w:ascii="Times New Roman" w:hAnsi="Times New Roman"/>
-          <w:i/>
-          <w:sz w:val="24"/>
-        </w:rPr>
-        <w:t>e</w:t>
-      </w:r>
-      <w:r>
-        <w:rPr>
-          <w:rFonts w:ascii="Times New Roman" w:hAnsi="Times New Roman"/>
-          <w:sz w:val="24"/>
-        </w:rPr>
-        <w:t>n</w:t>
-      </w:r>
-      <w:r>
-        <w:rPr>
-          <w:rFonts w:ascii="Times New Roman" w:hAnsi="Times New Roman"/>
-          <w:i/>
-          <w:sz w:val="24"/>
-        </w:rPr>
-        <w:t>s</w:t>
-      </w:r>
-      <w:r>
-        <w:rPr>
-          <w:rFonts w:ascii="Times New Roman" w:hAnsi="Times New Roman"/>
-          <w:sz w:val="24"/>
-        </w:rPr>
-        <w:t xml:space="preserve"> </w:t>
-      </w:r>
-      <w:r>
-        <w:rPr>
-          <w:rFonts w:ascii="Times New Roman" w:hAnsi="Times New Roman"/>
-          <w:i/>
-          <w:sz w:val="24"/>
-        </w:rPr>
-        <w:t>s</w:t>
-      </w:r>
-      <w:r>
-        <w:rPr>
-          <w:rFonts w:ascii="Times New Roman" w:hAnsi="Times New Roman"/>
-          <w:sz w:val="24"/>
-        </w:rPr>
-        <w:t>ã</w:t>
-      </w:r>
-      <w:r>
-        <w:rPr>
-          <w:rFonts w:ascii="Times New Roman" w:hAnsi="Times New Roman"/>
-          <w:i/>
-          <w:sz w:val="24"/>
-        </w:rPr>
-        <w:t>o</w:t>
-      </w:r>
-      <w:r>
-        <w:rPr>
-          <w:rFonts w:ascii="Times New Roman" w:hAnsi="Times New Roman"/>
-          <w:sz w:val="24"/>
-        </w:rPr>
-        <w:t xml:space="preserve"> </w:t>
-      </w:r>
-      <w:r>
-        <w:rPr>
-          <w:rFonts w:ascii="Times New Roman" w:hAnsi="Times New Roman"/>
-          <w:i/>
-          <w:sz w:val="24"/>
-        </w:rPr>
-        <w:t>a</w:t>
-      </w:r>
-      <w:r>
-        <w:rPr>
-          <w:rFonts w:ascii="Times New Roman" w:hAnsi="Times New Roman"/>
-          <w:i/>
-          <w:sz w:val="24"/>
-        </w:rPr>
-        <w:t>r</w:t>
-      </w:r>
-      <w:r>
-        <w:rPr>
-          <w:rFonts w:ascii="Times New Roman" w:hAnsi="Times New Roman"/>
-          <w:sz w:val="24"/>
-        </w:rPr>
-        <w:t>m</w:t>
-      </w:r>
-      <w:r>
-        <w:rPr>
-          <w:rFonts w:ascii="Times New Roman" w:hAnsi="Times New Roman"/>
-          <w:i/>
-          <w:sz w:val="24"/>
-        </w:rPr>
-        <w:t>a</w:t>
-      </w:r>
-      <w:r>
-        <w:rPr>
-          <w:rFonts w:ascii="Times New Roman" w:hAnsi="Times New Roman"/>
-          <w:sz w:val="24"/>
-        </w:rPr>
-        <w:t>z</w:t>
-      </w:r>
-      <w:r>
-        <w:rPr>
-          <w:rFonts w:ascii="Times New Roman" w:hAnsi="Times New Roman"/>
-          <w:i/>
-          <w:sz w:val="24"/>
-        </w:rPr>
-        <w:t>e</w:t>
-      </w:r>
-      <w:r>
-        <w:rPr>
-          <w:rFonts w:ascii="Times New Roman" w:hAnsi="Times New Roman"/>
-          <w:sz w:val="24"/>
-        </w:rPr>
-        <w:t>n</w:t>
-      </w:r>
-      <w:r>
-        <w:rPr>
-          <w:rFonts w:ascii="Times New Roman" w:hAnsi="Times New Roman"/>
-          <w:i/>
-          <w:sz w:val="24"/>
-        </w:rPr>
-        <w:t>a</w:t>
-      </w:r>
-      <w:r>
-        <w:rPr>
-          <w:rFonts w:ascii="Times New Roman" w:hAnsi="Times New Roman"/>
-          <w:sz w:val="24"/>
-        </w:rPr>
-        <w:t>d</w:t>
-      </w:r>
-      <w:r>
-        <w:rPr>
-          <w:rFonts w:ascii="Times New Roman" w:hAnsi="Times New Roman"/>
-          <w:i/>
-          <w:sz w:val="24"/>
-        </w:rPr>
-        <w:t>a</w:t>
-      </w:r>
-      <w:r>
-        <w:rPr>
-          <w:rFonts w:ascii="Times New Roman" w:hAnsi="Times New Roman"/>
-          <w:i/>
-          <w:sz w:val="24"/>
-        </w:rPr>
-        <w:t>s</w:t>
-      </w:r>
-      <w:r>
-        <w:rPr>
-          <w:rFonts w:ascii="Times New Roman" w:hAnsi="Times New Roman"/>
-          <w:sz w:val="24"/>
-        </w:rPr>
-        <w:t xml:space="preserve"> n</w:t>
-      </w:r>
-      <w:r>
-        <w:rPr>
-          <w:rFonts w:ascii="Times New Roman" w:hAnsi="Times New Roman"/>
-          <w:i/>
-          <w:sz w:val="24"/>
-        </w:rPr>
-        <w:t>o</w:t>
-      </w:r>
-      <w:r>
-        <w:rPr>
-          <w:rFonts w:ascii="Times New Roman" w:hAnsi="Times New Roman"/>
-          <w:sz w:val="24"/>
-        </w:rPr>
-        <w:t xml:space="preserve"> </w:t>
-      </w:r>
-      <w:r>
-        <w:rPr>
-          <w:rFonts w:ascii="Times New Roman" w:hAnsi="Times New Roman"/>
-          <w:i/>
-          <w:sz w:val="24"/>
-        </w:rPr>
-        <w:t>S</w:t>
-      </w:r>
-      <w:r>
-        <w:rPr>
-          <w:rFonts w:ascii="Times New Roman" w:hAnsi="Times New Roman"/>
-          <w:sz w:val="24"/>
-        </w:rPr>
-        <w:t>up</w:t>
-      </w:r>
-      <w:r>
-        <w:rPr>
-          <w:rFonts w:ascii="Times New Roman" w:hAnsi="Times New Roman"/>
-          <w:i/>
-          <w:sz w:val="24"/>
-        </w:rPr>
-        <w:t>a</w:t>
-      </w:r>
-      <w:r>
-        <w:rPr>
-          <w:rFonts w:ascii="Times New Roman" w:hAnsi="Times New Roman"/>
-          <w:sz w:val="24"/>
-        </w:rPr>
-        <w:t>b</w:t>
-      </w:r>
-      <w:r>
-        <w:rPr>
-          <w:rFonts w:ascii="Times New Roman" w:hAnsi="Times New Roman"/>
-          <w:i/>
-          <w:sz w:val="24"/>
-        </w:rPr>
-        <w:t>a</w:t>
-      </w:r>
-      <w:r>
-        <w:rPr>
-          <w:rFonts w:ascii="Times New Roman" w:hAnsi="Times New Roman"/>
-          <w:i/>
-          <w:sz w:val="24"/>
-        </w:rPr>
-        <w:t>s</w:t>
-      </w:r>
-      <w:r>
-        <w:rPr>
-          <w:rFonts w:ascii="Times New Roman" w:hAnsi="Times New Roman"/>
-          <w:i/>
-          <w:sz w:val="24"/>
-        </w:rPr>
-        <w:t>e</w:t>
-      </w:r>
-      <w:r>
-        <w:rPr>
-          <w:rFonts w:ascii="Times New Roman" w:hAnsi="Times New Roman"/>
-          <w:sz w:val="24"/>
-        </w:rPr>
-        <w:t xml:space="preserve"> </w:t>
-      </w:r>
-      <w:r>
-        <w:rPr>
-          <w:rFonts w:ascii="Times New Roman" w:hAnsi="Times New Roman"/>
-          <w:i/>
-          <w:sz w:val="24"/>
-        </w:rPr>
-        <w:t>S</w:t>
-      </w:r>
-      <w:r>
-        <w:rPr>
-          <w:rFonts w:ascii="Times New Roman" w:hAnsi="Times New Roman"/>
-          <w:i/>
-          <w:sz w:val="24"/>
-        </w:rPr>
-        <w:t>t</w:t>
-      </w:r>
-      <w:r>
-        <w:rPr>
-          <w:rFonts w:ascii="Times New Roman" w:hAnsi="Times New Roman"/>
-          <w:i/>
-          <w:sz w:val="24"/>
-        </w:rPr>
-        <w:t>o</w:t>
-      </w:r>
-      <w:r>
-        <w:rPr>
-          <w:rFonts w:ascii="Times New Roman" w:hAnsi="Times New Roman"/>
-          <w:i/>
-          <w:sz w:val="24"/>
-        </w:rPr>
-        <w:t>r</w:t>
-      </w:r>
-      <w:r>
-        <w:rPr>
-          <w:rFonts w:ascii="Times New Roman" w:hAnsi="Times New Roman"/>
-          <w:i/>
-          <w:sz w:val="24"/>
-        </w:rPr>
-        <w:t>a</w:t>
-      </w:r>
-      <w:r>
-        <w:rPr>
-          <w:rFonts w:ascii="Times New Roman" w:hAnsi="Times New Roman"/>
-          <w:i/>
-          <w:sz w:val="24"/>
-        </w:rPr>
-        <w:t>g</w:t>
-      </w:r>
-      <w:r>
-        <w:rPr>
-          <w:rFonts w:ascii="Times New Roman" w:hAnsi="Times New Roman"/>
-          <w:i/>
-          <w:sz w:val="24"/>
-        </w:rPr>
-        <w:t>e</w:t>
-      </w:r>
-      <w:r>
-        <w:rPr>
-          <w:rFonts w:ascii="Times New Roman" w:hAnsi="Times New Roman"/>
-          <w:sz w:val="24"/>
-        </w:rPr>
-        <w:t xml:space="preserve"> </w:t>
-      </w:r>
-      <w:r>
-        <w:rPr>
-          <w:rFonts w:ascii="Times New Roman" w:hAnsi="Times New Roman"/>
-          <w:i/>
-          <w:sz w:val="24"/>
-        </w:rPr>
-        <w:t>e</w:t>
-      </w:r>
-      <w:r>
-        <w:rPr>
-          <w:rFonts w:ascii="Times New Roman" w:hAnsi="Times New Roman"/>
-          <w:sz w:val="24"/>
-        </w:rPr>
-        <w:t xml:space="preserve"> </w:t>
-      </w:r>
-      <w:r>
-        <w:rPr>
-          <w:rFonts w:ascii="Times New Roman" w:hAnsi="Times New Roman"/>
-          <w:i/>
-          <w:sz w:val="24"/>
-        </w:rPr>
-        <w:t>a</w:t>
-      </w:r>
-      <w:r>
-        <w:rPr>
-          <w:rFonts w:ascii="Times New Roman" w:hAnsi="Times New Roman"/>
-          <w:i/>
-          <w:sz w:val="24"/>
-        </w:rPr>
-        <w:t>s</w:t>
-      </w:r>
-      <w:r>
-        <w:rPr>
-          <w:rFonts w:ascii="Times New Roman" w:hAnsi="Times New Roman"/>
-          <w:i/>
-          <w:sz w:val="24"/>
-        </w:rPr>
-        <w:t>s</w:t>
-      </w:r>
-      <w:r>
-        <w:rPr>
-          <w:rFonts w:ascii="Times New Roman" w:hAnsi="Times New Roman"/>
-          <w:i/>
-          <w:sz w:val="24"/>
-        </w:rPr>
-        <w:t>o</w:t>
-      </w:r>
-      <w:r>
-        <w:rPr>
-          <w:rFonts w:ascii="Times New Roman" w:hAnsi="Times New Roman"/>
-          <w:sz w:val="24"/>
-        </w:rPr>
-        <w:t>ci</w:t>
-      </w:r>
-      <w:r>
-        <w:rPr>
-          <w:rFonts w:ascii="Times New Roman" w:hAnsi="Times New Roman"/>
-          <w:i/>
-          <w:sz w:val="24"/>
-        </w:rPr>
-        <w:t>a</w:t>
-      </w:r>
-      <w:r>
-        <w:rPr>
-          <w:rFonts w:ascii="Times New Roman" w:hAnsi="Times New Roman"/>
-          <w:sz w:val="24"/>
-        </w:rPr>
-        <w:t>d</w:t>
-      </w:r>
-      <w:r>
-        <w:rPr>
-          <w:rFonts w:ascii="Times New Roman" w:hAnsi="Times New Roman"/>
-          <w:i/>
-          <w:sz w:val="24"/>
-        </w:rPr>
-        <w:t>a</w:t>
-      </w:r>
-      <w:r>
-        <w:rPr>
-          <w:rFonts w:ascii="Times New Roman" w:hAnsi="Times New Roman"/>
-          <w:i/>
-          <w:sz w:val="24"/>
-        </w:rPr>
-        <w:t>s</w:t>
-      </w:r>
-      <w:r>
-        <w:rPr>
-          <w:rFonts w:ascii="Times New Roman" w:hAnsi="Times New Roman"/>
-          <w:sz w:val="24"/>
-        </w:rPr>
-        <w:t xml:space="preserve"> </w:t>
-      </w:r>
-      <w:r>
-        <w:rPr>
-          <w:rFonts w:ascii="Times New Roman" w:hAnsi="Times New Roman"/>
-          <w:i/>
-          <w:sz w:val="24"/>
-        </w:rPr>
-        <w:t>a</w:t>
-      </w:r>
-      <w:r>
-        <w:rPr>
-          <w:rFonts w:ascii="Times New Roman" w:hAnsi="Times New Roman"/>
-          <w:sz w:val="24"/>
-        </w:rPr>
-        <w:t xml:space="preserve"> f</w:t>
-      </w:r>
-      <w:r>
-        <w:rPr>
-          <w:rFonts w:ascii="Times New Roman" w:hAnsi="Times New Roman"/>
-          <w:i/>
-          <w:sz w:val="24"/>
-        </w:rPr>
-        <w:t>o</w:t>
-      </w:r>
-      <w:r>
-        <w:rPr>
-          <w:rFonts w:ascii="Times New Roman" w:hAnsi="Times New Roman"/>
-          <w:i/>
-          <w:sz w:val="24"/>
-        </w:rPr>
-        <w:t>t</w:t>
-      </w:r>
-      <w:r>
-        <w:rPr>
-          <w:rFonts w:ascii="Times New Roman" w:hAnsi="Times New Roman"/>
-          <w:i/>
-          <w:sz w:val="24"/>
-        </w:rPr>
-        <w:t>o</w:t>
-      </w:r>
-      <w:r>
-        <w:rPr>
-          <w:rFonts w:ascii="Times New Roman" w:hAnsi="Times New Roman"/>
-          <w:i/>
-          <w:sz w:val="24"/>
-        </w:rPr>
-        <w:t>s</w:t>
-      </w:r>
-      <w:r>
-        <w:rPr>
-          <w:rFonts w:ascii="Times New Roman" w:hAnsi="Times New Roman"/>
-          <w:sz w:val="24"/>
-        </w:rPr>
-        <w:t>_</w:t>
-      </w:r>
-      <w:r>
-        <w:rPr>
-          <w:rFonts w:ascii="Times New Roman" w:hAnsi="Times New Roman"/>
-          <w:i/>
-          <w:sz w:val="24"/>
-        </w:rPr>
-        <w:t>a</w:t>
-      </w:r>
-      <w:r>
-        <w:rPr>
-          <w:rFonts w:ascii="Times New Roman" w:hAnsi="Times New Roman"/>
-          <w:sz w:val="24"/>
-        </w:rPr>
-        <w:t>nunci</w:t>
-      </w:r>
-      <w:r>
-        <w:rPr>
-          <w:rFonts w:ascii="Times New Roman" w:hAnsi="Times New Roman"/>
-          <w:i/>
-          <w:sz w:val="24"/>
-        </w:rPr>
-        <w:t>o</w:t>
-      </w:r>
-      <w:r>
-        <w:rPr>
-          <w:rFonts w:ascii="Times New Roman" w:hAnsi="Times New Roman"/>
-          <w:sz w:val="24"/>
-        </w:rPr>
-        <w:t>.</w:t>
+        <w:t xml:space="preserve"> e associadas a fotos_anuncio.</w:t>
       </w:r>
     </w:p>
     <w:p>
@@ -14521,7 +13666,46 @@
         <w:jc w:val="both"/>
       </w:pPr>
       <w:r>
-        <w:t>A implementação priorizou autenticação, anúncios, busca com filtros avançados, edição, gerenciamento administrativo, marcação de venda, compartilhamento, contato e comunicação. Os módulos priorizados foram implementados, verificados e refinados conforme o escopo efetivamente disponível. A integração com o Chatling foi realizada no front-end por meio do script JavaScript do serviço. Os fluxos de comunicação utilizam mensagens persistentes, notificações persistentes e bucket privado para novas fotos, com URL assinada para participantes autorizados.</w:t>
+        <w:rPr>
+          <w:i w:val="0"/>
+        </w:rPr>
+        <w:t xml:space="preserve">A implementação priorizou autenticação, anúncios, busca com filtros avançados, edição, gerenciamento administrativo, marcação de venda, compartilhamento, contato e comunicação. Os módulos priorizados foram implementados, verificados e refinados conforme o escopo efetivamente disponível. A integração com o </w:t>
+      </w:r>
+      <w:r>
+        <w:rPr>
+          <w:i/>
+        </w:rPr>
+        <w:t>Chatling</w:t>
+      </w:r>
+      <w:r>
+        <w:rPr>
+          <w:i w:val="0"/>
+        </w:rPr>
+        <w:t xml:space="preserve"> foi realizada no </w:t>
+      </w:r>
+      <w:r>
+        <w:rPr>
+          <w:i/>
+        </w:rPr>
+        <w:t>front-end</w:t>
+      </w:r>
+      <w:r>
+        <w:rPr>
+          <w:i w:val="0"/>
+        </w:rPr>
+        <w:t xml:space="preserve"> por meio do script </w:t>
+      </w:r>
+      <w:r>
+        <w:rPr>
+          <w:i/>
+        </w:rPr>
+        <w:t>JavaScript</w:t>
+      </w:r>
+      <w:r>
+        <w:rPr>
+          <w:i w:val="0"/>
+        </w:rPr>
+        <w:t xml:space="preserve"> do serviço. Os fluxos de comunicação utilizam mensagens persistentes, notificações persistentes e bucket privado para novas fotos, com URL assinada para participantes autorizados.</w:t>
       </w:r>
     </w:p>
     <w:p>
@@ -15477,25 +14661,8 @@
             </w:tcMar>
           </w:tcPr>
           <w:p>
-            <w:pPr>
-              <w:spacing w:before="0" w:after="0" w:line="240" w:lineRule="auto"/>
-              <w:ind w:firstLine="0"/>
-              <w:jc w:val="left"/>
-            </w:pPr>
-            <w:r>
-              <w:rPr>
-                <w:rFonts w:ascii="Times New Roman" w:hAnsi="Times New Roman"/>
-                <w:b w:val="0"/>
-                <w:sz w:val="17"/>
-              </w:rPr>
-            </w:r>
-            <w:r>
-              <w:rPr>
-                <w:rFonts w:ascii="Times New Roman" w:hAnsi="Times New Roman"/>
-                <w:b w:val="0"/>
-                <w:sz w:val="17"/>
-              </w:rPr>
-              <w:t>RNF08 / Privacidade</w:t>
+            <w:r>
+              <w:t>RNF08 / Segurança (privacidade)</w:t>
             </w:r>
           </w:p>
         </w:tc>
@@ -15512,25 +14679,8 @@
             </w:tcMar>
           </w:tcPr>
           <w:p>
-            <w:pPr>
-              <w:spacing w:before="0" w:after="0" w:line="240" w:lineRule="auto"/>
-              <w:ind w:firstLine="0"/>
-              <w:jc w:val="left"/>
-            </w:pPr>
-            <w:r>
-              <w:rPr>
-                <w:rFonts w:ascii="Times New Roman" w:hAnsi="Times New Roman"/>
-                <w:b w:val="0"/>
-                <w:sz w:val="17"/>
-              </w:rPr>
-            </w:r>
-            <w:r>
-              <w:rPr>
-                <w:rFonts w:ascii="Times New Roman" w:hAnsi="Times New Roman"/>
-                <w:b w:val="0"/>
-                <w:sz w:val="17"/>
-              </w:rPr>
-              <w:t>Usuário deve ser informado sobre termos, privacidade e terceiros.</w:t>
+            <w:r>
+              <w:t>Dados pessoais e dados enviados ao Chatling devem ter finalidade e exposição limitadas.</w:t>
             </w:r>
           </w:p>
         </w:tc>
@@ -15547,25 +14697,8 @@
             </w:tcMar>
           </w:tcPr>
           <w:p>
-            <w:pPr>
-              <w:spacing w:before="0" w:after="0" w:line="240" w:lineRule="auto"/>
-              <w:ind w:firstLine="0"/>
-              <w:jc w:val="left"/>
-            </w:pPr>
-            <w:r>
-              <w:rPr>
-                <w:rFonts w:ascii="Times New Roman" w:hAnsi="Times New Roman"/>
-                <w:b w:val="0"/>
-                <w:sz w:val="17"/>
-              </w:rPr>
-            </w:r>
-            <w:r>
-              <w:rPr>
-                <w:rFonts w:ascii="Times New Roman" w:hAnsi="Times New Roman"/>
-                <w:b w:val="0"/>
-                <w:sz w:val="17"/>
-              </w:rPr>
-              <w:t>Verificar aceite legal e aviso sobre Chatling.</w:t>
+            <w:r>
+              <w:t>Verificar aviso de privacidade, minimização de dados e dependências externas.</w:t>
             </w:r>
           </w:p>
         </w:tc>
@@ -15607,7 +14740,7 @@
         <w:jc w:val="both"/>
       </w:pPr>
       <w:r>
-        <w:t>Os testes foram funcionais e manuais, complementados por responsividade e validações automatizadas de contraste e estrutura. Para manter o documento dentro do limite de 30 páginas, as evidências devem ser concentradas em três pontos: o Quadro 6, na seção 3.8, recebe a matriz compacta de cenários, ambiente e resultado; a seção 4.2 recebe as capturas principais da interface; e a seção 4.4 recebe uma captura curta da proteção do Storage ou uma referência ao relatório de segurança. Cada captura deve ter legenda, fonte e data, sem repetir a mesma imagem em seções diferentes. Cada cenário considerou entrada, resultado esperado, resultado obtido e status. A validação de aceitação confirmou, em duas contas, o envio e recebimento de mensagens e fotos, mensagens não lidas, notificações persistentes, login, logout e uso em celular. Os testes finais foram realizados em Chromium e Firefox sobre Arch Linux; as evidências registram o ambiente e os resultados. O aceite de 25/10/2026 está registrado em evidencias/aceite-marketplace-20261025.md.</w:t>
+        <w:t>O protocolo combinou testes funcionais manuais, verificação de responsividade e validações automatizadas de contraste e estrutura. Foram considerados 17 cenários agregados no Quadro 6, executados pela equipe de desenvolvimento em 25 de outubro de 2026, com duas contas de teste, anúncios e fotos do ambiente de produção. Os navegadores registrados foram Chromium e Firefox em Arch Linux, além de verificações em celular; versões exatas, modelos e resoluções não foram anotados. Cada cenário foi descrito por entrada, resultado esperado, resultado observado e status.</w:t>
       </w:r>
     </w:p>
     <w:p>
@@ -15617,7 +14750,22 @@
         <w:jc w:val="both"/>
       </w:pPr>
       <w:r>
-        <w:t>Registro mínimo de auditoria do protocolo de testes: inserir no Quadro 6 apenas os oito a dez cenários mais representativos, agrupando login/logout, marketplace, mensagens, fotos privadas, notificações, responsividade e segurança. Não criar uma tabela separada para cada navegador; registrar Chromium e Firefox na coluna Ambiente e indicar Arch Linux ou celular na mesma linha. As capturas correspondentes devem ser colocadas somente na seção 4.2, usando subfiguras quando duas telas comprovarem um único cenário.</w:t>
+        <w:rPr>
+          <w:i w:val="0"/>
+        </w:rPr>
+        <w:t xml:space="preserve">O Quadro 6 reúne os cenários agregados para evitar repetição entre navegadores. A evidência de aceite do </w:t>
+      </w:r>
+      <w:r>
+        <w:rPr>
+          <w:i/>
+        </w:rPr>
+        <w:t>marketplace</w:t>
+      </w:r>
+      <w:r>
+        <w:rPr>
+          <w:i w:val="0"/>
+        </w:rPr>
+        <w:t xml:space="preserve"> registra os fluxos UC09, UC15, UC20, UC24 e UC25; o roteiro de mensagens registra o envio e recebimento de textos e fotos, notificações persistentes, login, logout e responsividade.</w:t>
       </w:r>
     </w:p>
     <w:tbl>
@@ -15768,25 +14916,8 @@
             </w:tcMar>
           </w:tcPr>
           <w:p>
-            <w:pPr>
-              <w:spacing w:before="0" w:after="0" w:line="240" w:lineRule="auto"/>
-              <w:ind w:firstLine="0"/>
-              <w:jc w:val="left"/>
-            </w:pPr>
-            <w:r>
-              <w:rPr>
-                <w:rFonts w:ascii="Times New Roman" w:hAnsi="Times New Roman"/>
-                <w:b w:val="0"/>
-                <w:sz w:val="17"/>
-              </w:rPr>
-            </w:r>
-            <w:r>
-              <w:rPr>
-                <w:rFonts w:ascii="Times New Roman" w:hAnsi="Times New Roman"/>
-                <w:b w:val="0"/>
-                <w:sz w:val="17"/>
-              </w:rPr>
-              <w:t>Equipe de desenvolvimento; registrar nomes.</w:t>
+            <w:r>
+              <w:t>Equipe de desenvolvimento; nomes individuais não registrados no aceite.</w:t>
             </w:r>
           </w:p>
         </w:tc>
@@ -15843,25 +14974,8 @@
             </w:tcMar>
           </w:tcPr>
           <w:p>
-            <w:pPr>
-              <w:spacing w:before="0" w:after="0" w:line="240" w:lineRule="auto"/>
-              <w:ind w:firstLine="0"/>
-              <w:jc w:val="left"/>
-            </w:pPr>
-            <w:r>
-              <w:rPr>
-                <w:rFonts w:ascii="Times New Roman" w:hAnsi="Times New Roman"/>
-                <w:b w:val="0"/>
-                <w:sz w:val="17"/>
-              </w:rPr>
-            </w:r>
-            <w:r>
-              <w:rPr>
-                <w:rFonts w:ascii="Times New Roman" w:hAnsi="Times New Roman"/>
-                <w:b w:val="0"/>
-                <w:sz w:val="17"/>
-              </w:rPr>
-              <w:t>Período geral até agosto de 2026; preencher cada execução.</w:t>
+            <w:r>
+              <w:t>25 out. 2026; horário não registrado.</w:t>
             </w:r>
           </w:p>
         </w:tc>
@@ -15916,25 +15030,8 @@
             </w:tcMar>
           </w:tcPr>
           <w:p>
-            <w:pPr>
-              <w:spacing w:before="0" w:after="0" w:line="240" w:lineRule="auto"/>
-              <w:ind w:firstLine="0"/>
-              <w:jc w:val="left"/>
-            </w:pPr>
-            <w:r>
-              <w:rPr>
-                <w:rFonts w:ascii="Times New Roman" w:hAnsi="Times New Roman"/>
-                <w:b w:val="0"/>
-                <w:sz w:val="17"/>
-              </w:rPr>
-            </w:r>
-            <w:r>
-              <w:rPr>
-                <w:rFonts w:ascii="Times New Roman" w:hAnsi="Times New Roman"/>
-                <w:b w:val="0"/>
-                <w:sz w:val="17"/>
-              </w:rPr>
-              <w:t>Oito cenários agregados no Quadro 6; informar casos e repetições.</w:t>
+            <w:r>
+              <w:t>17 cenários agregados no Quadro 6; número de repetições não registrado.</w:t>
             </w:r>
           </w:p>
         </w:tc>
@@ -15991,25 +15088,8 @@
             </w:tcMar>
           </w:tcPr>
           <w:p>
-            <w:pPr>
-              <w:spacing w:before="0" w:after="0" w:line="240" w:lineRule="auto"/>
-              <w:ind w:firstLine="0"/>
-              <w:jc w:val="left"/>
-            </w:pPr>
-            <w:r>
-              <w:rPr>
-                <w:rFonts w:ascii="Times New Roman" w:hAnsi="Times New Roman"/>
-                <w:b w:val="0"/>
-                <w:sz w:val="17"/>
-              </w:rPr>
-            </w:r>
-            <w:r>
-              <w:rPr>
-                <w:rFonts w:ascii="Times New Roman" w:hAnsi="Times New Roman"/>
-                <w:b w:val="0"/>
-                <w:sz w:val="17"/>
-              </w:rPr>
-              <w:t>Caracterização ausente; indicar fictícios, anonimizados ou reais.</w:t>
+            <w:r>
+              <w:t>Duas contas de teste, anúncios e fotos usados no ambiente de produção; natureza detalhada dos dados não registrada.</w:t>
             </w:r>
           </w:p>
         </w:tc>
@@ -16065,7 +15145,7 @@
           </w:tcPr>
           <w:p>
             <w:r>
-              <w:t>Firefox 158.0 e Chromium 154.0.8037.97 confirmados no Arch Linux; Brave e Chrome usados no histórico, versões ainda não confirmadas.</w:t>
+              <w:t>Chromium e Firefox; versões exatas não registradas no aceite.</w:t>
             </w:r>
           </w:p>
         </w:tc>
@@ -16123,7 +15203,7 @@
           </w:tcPr>
           <w:p>
             <w:r>
-              <w:t>Arch Linux e Windows.</w:t>
+              <w:t>Arch Linux na validação final; Windows aparece no histórico de desenvolvimento, sem versão registrada.</w:t>
             </w:r>
           </w:p>
         </w:tc>
@@ -16179,7 +15259,7 @@
           </w:tcPr>
           <w:p>
             <w:r>
-              <w:t>Vários tamanhos via Mobile FIRST 4.20.4, incluindo smartphones e tablets; modelos/resoluções exatos não registrados.</w:t>
+              <w:t>Desktop e celular; modelos e resoluções exatos não registrados.</w:t>
             </w:r>
           </w:p>
         </w:tc>
@@ -16221,7 +15301,22 @@
         <w:jc w:val="both"/>
       </w:pPr>
       <w:r>
-        <w:t>As limitações incluem testes predominantemente manuais, ausência de métricas quantitativas de desempenho e usabilidade, ausência de participantes externos e dependência de serviço de terceiro. A validação funcional realizada não equivale a uma auditoria jurídica ou a uma certificação de conformidade com a LGPD. O Chatling continua sujeito à configuração e aos limites do provedor, e estudos futuros devem ampliar a amostra de usuários e medir tempo de resposta, carga e usabilidade.</w:t>
+        <w:rPr>
+          <w:i w:val="0"/>
+        </w:rPr>
+        <w:t xml:space="preserve">As limitações incluem testes predominantemente manuais, ausência de métricas quantitativas de desempenho e usabilidade, ausência de participantes externos e dependência de serviço de terceiro. A validação funcional realizada não equivale a uma auditoria jurídica ou a uma certificação de conformidade com a LGPD. O </w:t>
+      </w:r>
+      <w:r>
+        <w:rPr>
+          <w:i/>
+        </w:rPr>
+        <w:t>Chatling</w:t>
+      </w:r>
+      <w:r>
+        <w:rPr>
+          <w:i w:val="0"/>
+        </w:rPr>
+        <w:t xml:space="preserve"> continua sujeito à configuração e aos limites do provedor, e estudos futuros devem ampliar a amostra de usuários e medir tempo de resposta, carga e usabilidade.</w:t>
       </w:r>
     </w:p>
     <w:p>
@@ -16261,7 +15356,22 @@
         <w:jc w:val="both"/>
       </w:pPr>
       <w:r>
-        <w:t>A modelagem definiu 25 casos de uso e 16 requisitos funcionais relacionados, com diferentes níveis de implementação no protótipo. Os testes funcionais e a aceitação manual confirmaram os fluxos principais de autenticação, marketplace, filtros avançados, edição, categorias, venda, compartilhamento, formulário de contato, comunicação entre contas, envio de fotos, mensagens não lidas, notificações persistentes e responsividade. Os resultados descritos correspondem ao ambiente de produção validado em 25 de outubro de 2026.</w:t>
+        <w:rPr>
+          <w:i w:val="0"/>
+        </w:rPr>
+        <w:t xml:space="preserve">A modelagem definiu 25 casos de uso e 16 requisitos funcionais relacionados. Os 17 cenários agregados do Quadro 6 confirmaram os fluxos principais de autenticação, </w:t>
+      </w:r>
+      <w:r>
+        <w:rPr>
+          <w:i/>
+        </w:rPr>
+        <w:t>marketplace</w:t>
+      </w:r>
+      <w:r>
+        <w:rPr>
+          <w:i w:val="0"/>
+        </w:rPr>
+        <w:t>, filtros avançados, edição, categorias, venda, compartilhamento, formulário de contato, comunicação entre contas, envio de fotos, mensagens não lidas, notificações persistentes e responsividade. Os resultados correspondem ao ambiente de produção validado em 25 de outubro de 2026.</w:t>
       </w:r>
     </w:p>
     <w:p>
@@ -17501,7 +16611,7 @@
           </w:tcPr>
           <w:p>
             <w:r>
-              <w:t>Verificados; registrar dispositivos na versão final.</w:t>
+              <w:t>Desktop e celular verificados; modelos e resoluções não registrados.</w:t>
             </w:r>
           </w:p>
         </w:tc>
@@ -17511,7 +16621,7 @@
           </w:tcPr>
           <w:p>
             <w:r>
-              <w:t>PASS com ressalva</w:t>
+              <w:t>PASS com limitação</w:t>
             </w:r>
           </w:p>
         </w:tc>
@@ -17538,7 +16648,7 @@
         <w:jc w:val="both"/>
       </w:pPr>
       <w:r>
-        <w:t>A validação funcional confirmou UC21: o envio de mensagem entre contas gerou registro persistente de notificação e badge de não lidas na conta destinatária. O resultado deve ser interpretado como evidência de funcionamento no ambiente testado, e não como certificação de disponibilidade contínua do serviço.</w:t>
+        <w:t>A validação funcional confirmou o UC21: o envio de mensagem entre contas gerou registro persistente de notificação e badge de não lidas na conta destinatária. Esse resultado descreve o ambiente e as contas testadas; não constitui certificação de disponibilidade contínua do serviço.</w:t>
       </w:r>
     </w:p>
     <w:p>
@@ -17563,7 +16673,7 @@
         <w:jc w:val="both"/>
       </w:pPr>
       <w:r>
-        <w:t>A Figura 5 documenta a tela inicial e deve receber uma captura da home com busca e navegação principal. A Figura 6 deve mostrar autenticação, incluindo login ou logout. A Figura 7 deve reunir marketplace, pesquisa, filtros básicos e avançados e detalhes de anúncio. A Figura 8 deve reunir, em subfiguras (a), (b) e (c), a conversa entre duas contas, o envio ou recebimento de foto e o badge de notificação. A Figura 9 deve mostrar publicação, edição, marcação como vendido, gerenciamento administrativo ou moderação. Essa distribuição evita criar novas figuras e ajuda a manter o limite de 30 páginas.</w:t>
+        <w:t>As Figuras 5 a 9 apresentam capturas do ambiente publicado. A Figura 5 mostra a tela inicial; a Figura 6, a autenticação; a Figura 7, a pesquisa com filtros; a Figura 8, o painel administrativo e a moderação; e a Figura 9 reúne o detalhe de anúncio e o formulário de publicação. As legendas identificam o que cada tela demonstra.</w:t>
       </w:r>
     </w:p>
     <w:p>
@@ -17750,10 +16860,21 @@
       </w:pPr>
       <w:r>
         <w:rPr>
-          <w:rFonts w:ascii="Times New Roman" w:hAnsi="Times New Roman"/>
-          <w:sz w:val="20"/>
+          <w:i w:val="0"/>
         </w:rPr>
-        <w:t>Figura 7 – Tela representativa do marketplace com pesquisa, filtros e anúncios.</w:t>
+        <w:t xml:space="preserve">Figura 7 – Tela representativa do </w:t>
+      </w:r>
+      <w:r>
+        <w:rPr>
+          <w:i/>
+        </w:rPr>
+        <w:t>marketplace</w:t>
+      </w:r>
+      <w:r>
+        <w:rPr>
+          <w:i w:val="0"/>
+        </w:rPr>
+        <w:t xml:space="preserve"> com pesquisa, filtros e anúncios.</w:t>
       </w:r>
     </w:p>
     <w:p>
@@ -17817,11 +16938,7 @@
         <w:jc w:val="left"/>
       </w:pPr>
       <w:r>
-        <w:rPr>
-          <w:rFonts w:ascii="Times New Roman" w:hAnsi="Times New Roman"/>
-          <w:sz w:val="20"/>
-        </w:rPr>
-        <w:t>Figura 8 – Tela representativa do painel de moderação e atendimento Chatling.</w:t>
+        <w:t>Figura 8 – Painel administrativo e moderação de anúncios em produção.</w:t>
       </w:r>
     </w:p>
     <w:p>
@@ -17885,11 +17002,7 @@
         <w:jc w:val="left"/>
       </w:pPr>
       <w:r>
-        <w:rPr>
-          <w:rFonts w:ascii="Times New Roman" w:hAnsi="Times New Roman"/>
-          <w:sz w:val="20"/>
-        </w:rPr>
-        <w:t>Figura 9 – Telas representativas de detalhe e publicação de anúncio.</w:t>
+        <w:t>Figura 9 – Detalhe de anúncio e formulário de publicação em produção.</w:t>
       </w:r>
     </w:p>
     <w:p>
@@ -17913,7 +17026,22 @@
         <w:jc w:val="both"/>
       </w:pPr>
       <w:r>
-        <w:t>As Figuras 5 a 9 devem ser substituídas por capturas reais do ambiente de demonstração antes da entrega final. A matriz de testes fica no Quadro 6; as telas ficam na seção 4.2; e a evidência de segurança do bucket privado deve ser citada na seção 4.4, sem inserir logs extensos no corpo do artigo. Os logs completos permanecem no diretório de evidências do projeto e podem ser apresentados à banca se solicitados.</w:t>
+        <w:rPr>
+          <w:i w:val="0"/>
+        </w:rPr>
+        <w:t xml:space="preserve">As Figuras 5 a 9 foram capturadas no ambiente publicado em 25 de outubro de 2026. A captura do assistente conversacional não foi obtida na sessão final; por isso, a seção 4.3 descreve a integração e registra essa limitação sem apresentar o </w:t>
+      </w:r>
+      <w:r>
+        <w:rPr>
+          <w:i/>
+        </w:rPr>
+        <w:t>Chatling</w:t>
+      </w:r>
+      <w:r>
+        <w:rPr>
+          <w:i w:val="0"/>
+        </w:rPr>
+        <w:t xml:space="preserve"> como resultado de teste concluído.</w:t>
       </w:r>
     </w:p>
     <w:p>
@@ -17924,11 +17052,21 @@
       </w:pPr>
       <w:r>
         <w:rPr>
-          <w:rFonts w:ascii="Times New Roman" w:hAnsi="Times New Roman"/>
-          <w:b/>
-          <w:sz w:val="24"/>
+          <w:i w:val="0"/>
         </w:rPr>
-        <w:t>4.3 Chatling: escopo, avaliação e risco</w:t>
+        <w:t xml:space="preserve">4.3 </w:t>
+      </w:r>
+      <w:r>
+        <w:rPr>
+          <w:i/>
+        </w:rPr>
+        <w:t>Chatling</w:t>
+      </w:r>
+      <w:r>
+        <w:rPr>
+          <w:i w:val="0"/>
+        </w:rPr>
+        <w:t>: escopo, avaliação e risco</w:t>
       </w:r>
     </w:p>
     <w:p>
@@ -17939,10 +17077,45 @@
       </w:pPr>
       <w:r>
         <w:rPr>
-          <w:rFonts w:ascii="Times New Roman" w:hAnsi="Times New Roman"/>
-          <w:sz w:val="24"/>
+          <w:i w:val="0"/>
         </w:rPr>
-        <w:t>O agente conversacional da MGMOTORSBR é carregado no front-end por meio do embed.js, com o identificador 6944231868. No plano Free utilizado pela equipe, o serviço informa 200 créditos de IA, um agente, um assento e até 500.000 caracteres na base de conhecimento. O roteiro de avaliação inclui perguntas sobre busca por marca e faixa de preço, publicação de anúncios e funcionamento da plataforma; os diálogos efetivamente obtidos devem ser anexados como evidência da avaliação qualitativa.</w:t>
+        <w:t xml:space="preserve">O agente conversacional da MGMOTORSBR é carregado no </w:t>
+      </w:r>
+      <w:r>
+        <w:rPr>
+          <w:i/>
+        </w:rPr>
+        <w:t>front-end</w:t>
+      </w:r>
+      <w:r>
+        <w:rPr>
+          <w:i w:val="0"/>
+        </w:rPr>
+        <w:t xml:space="preserve"> por meio do embed.js, com o identificador 6944231868. A página oficial de preços do </w:t>
+      </w:r>
+      <w:r>
+        <w:rPr>
+          <w:i/>
+        </w:rPr>
+        <w:t>Chatling</w:t>
+      </w:r>
+      <w:r>
+        <w:rPr>
+          <w:i w:val="0"/>
+        </w:rPr>
+        <w:t xml:space="preserve"> consultada em 25 de outubro de 2026 informa o plano Free com 200 créditos de IA por mês, um agente, um assento e 500.000 caracteres na base de conhecimento (</w:t>
+      </w:r>
+      <w:r>
+        <w:rPr>
+          <w:i/>
+        </w:rPr>
+        <w:t>CHATLING</w:t>
+      </w:r>
+      <w:r>
+        <w:rPr>
+          <w:i w:val="0"/>
+        </w:rPr>
+        <w:t>, 2026). O roteiro de avaliação previa perguntas sobre busca por marca e faixa de preço, publicação de anúncios e funcionamento da plataforma; como não foram arquivados diálogos reais na sessão final, não é possível atribuir uma avaliação qualitativa conclusiva às respostas.</w:t>
       </w:r>
     </w:p>
     <w:p>
@@ -17953,10 +17126,21 @@
       </w:pPr>
       <w:r>
         <w:rPr>
-          <w:rFonts w:ascii="Times New Roman" w:hAnsi="Times New Roman"/>
-          <w:sz w:val="24"/>
+          <w:i w:val="0"/>
         </w:rPr>
-        <w:t>Como serviço externo, o Chatling pode alterar comportamento, produzir respostas incorretas e tratar dados fora da infraestrutura do projeto. A entrega deve anexar a política do provedor, o plano, a versão, a base de conhecimento, os limites e a retenção antes de afirmar conformidade com a LGPD. No plano Free, a página pública informa que o conteúdo pertence ao usuário, não é usado para treinar modelos e os documentos enviados são apagados após o processamento; a política institucional ainda deve ser conferida para o caso concreto.</w:t>
+        <w:t xml:space="preserve">Como serviço externo, o </w:t>
+      </w:r>
+      <w:r>
+        <w:rPr>
+          <w:i/>
+        </w:rPr>
+        <w:t>Chatling</w:t>
+      </w:r>
+      <w:r>
+        <w:rPr>
+          <w:i w:val="0"/>
+        </w:rPr>
+        <w:t xml:space="preserve"> pode alterar comportamento, produzir respostas incorretas e tratar dados fora da infraestrutura do projeto. A equipe não arquivou a versão da interface, a base de conhecimento nem a política de retenção do provedor; portanto, o artigo não afirma conformidade com a LGPD. O uso em produção deve evitar o envio de dados pessoais desnecessários e encaminhar decisões de compra para os canais humanos da plataforma.</w:t>
       </w:r>
     </w:p>
     <w:p>
@@ -17981,7 +17165,22 @@
         <w:jc w:val="both"/>
       </w:pPr>
       <w:r>
-        <w:t>A solução apresenta adequação funcional nos fluxos principais e usa autenticação, perfis, RLS, variáveis de ambiente e função protegida de exclusão. As novas fotos de conversas ficam em bucket privado, com policies que restringem upload ao proprietário do caminho e leitura aos participantes por meio de URLs assinadas. Breakpoints de 1024, 768 e 480 px foram identificados e a validação final confirmou uso em celular. Migrations, casos de uso, requisitos, evidências e GitHub favorecem manutenibilidade, mas não substituem auditoria completa de segurança, desempenho ou usabilidade.</w:t>
+        <w:rPr>
+          <w:i w:val="0"/>
+        </w:rPr>
+        <w:t xml:space="preserve">A solução apresenta adequação funcional nos fluxos principais e usa autenticação, perfis, RLS, variáveis de ambiente e função protegida de exclusão. As novas fotos de conversas ficam em bucket privado, com policies que restringem </w:t>
+      </w:r>
+      <w:r>
+        <w:rPr>
+          <w:i/>
+        </w:rPr>
+        <w:t>upload</w:t>
+      </w:r>
+      <w:r>
+        <w:rPr>
+          <w:i w:val="0"/>
+        </w:rPr>
+        <w:t xml:space="preserve"> ao proprietário do caminho e leitura aos participantes por meio de URLs assinadas. Breakpoints de 1024, 768 e 480 px foram identificados e a validação final confirmou uso em celular. Migrations, casos de uso, requisitos, evidências e GitHub favorecem manutenibilidade, mas não substituem auditoria completa de segurança, desempenho ou usabilidade.</w:t>
       </w:r>
     </w:p>
     <w:p>
@@ -18006,7 +17205,22 @@
         <w:jc w:val="both"/>
       </w:pPr>
       <w:r>
-        <w:t>Os resultados respondem afirmativamente, em caráter de protótipo acadêmico: foi possível reunir cadastro, anúncios, filtros avançados, edição, categorias, venda, compartilhamento, contato, mensagens entre contas, notificações persistentes, fotos privadas no chat e suporte conversacional mantendo ligação entre requisitos, casos de uso, tabelas e testes. A resposta é qualificada porque o Chatling depende de configuração externa, a validação quantitativa de usabilidade ainda é insuficiente e o sistema não deve ser apresentado como produto comercial pronto.</w:t>
+        <w:rPr>
+          <w:i w:val="0"/>
+        </w:rPr>
+        <w:t xml:space="preserve">Os resultados respondem afirmativamente, em caráter de protótipo acadêmico: foi possível reunir cadastro, anúncios, filtros avançados, edição, categorias, venda, compartilhamento, contato, mensagens entre contas, notificações persistentes, fotos privadas no chat e suporte conversacional mantendo ligação entre requisitos, casos de uso, tabelas e testes. A resposta é qualificada porque o </w:t>
+      </w:r>
+      <w:r>
+        <w:rPr>
+          <w:i/>
+        </w:rPr>
+        <w:t>Chatling</w:t>
+      </w:r>
+      <w:r>
+        <w:rPr>
+          <w:i w:val="0"/>
+        </w:rPr>
+        <w:t xml:space="preserve"> depende de configuração externa, a validação quantitativa de usabilidade ainda é insuficiente e o sistema não deve ser apresentado como produto comercial pronto.</w:t>
       </w:r>
     </w:p>
     <w:p>
@@ -18031,7 +17245,7 @@
         <w:jc w:val="both"/>
       </w:pPr>
       <w:r>
-        <w:t>A MGMOTORSBR alcançou o objetivo de produzir um protótipo funcional de intermediação de veículos com cadastro, autenticação, anúncios, pesquisa, contato, moderação, painel administrativo, mensagens entre usuários, notificações persistentes, fotos privadas no chat e apoio conversacional. A modelagem de 25 casos de uso, 16 requisitos funcionais, banco PostgreSQL no Supabase, políticas de acesso e critérios ISO/IEC 25010 fornecem rastreabilidade para continuidade.</w:t>
+        <w:t>A MGMOTORSBR alcançou o objetivo de produzir e avaliar um protótipo funcional de intermediação de veículos com cadastro, autenticação, anúncios, filtros avançados, edição, categorias, venda, compartilhamento, contato, moderação, painel administrativo, mensagens entre usuários, notificações persistentes e fotos privadas no chat. O apoio conversacional foi integrado por serviço externo, mas não recebeu avaliação final conclusiva. A modelagem de 25 casos de uso, 16 requisitos funcionais, banco PostgreSQL no Supabase, políticas de acesso e critérios ISO/IEC 25010 fornecem rastreabilidade para continuidade.</w:t>
       </w:r>
     </w:p>
     <w:p>
@@ -18066,7 +17280,22 @@
         <w:jc w:val="both"/>
       </w:pPr>
       <w:r>
-        <w:t>Antes da entrega, inserir as capturas reais na seção 4.2 conforme o mapa definido, preencher o Quadro 6 com executor, data, navegador, sistema, resolução e resultado, mantendo a referência ao aceite de 25/10/2026, e citar na seção 4.4 a evidência do bucket privado. Não incluir todas as telas nem logs completos no DOCX: o conjunto recomendado é de até seis imagens compostas, uma matriz compacta e uma referência ao repositório de evidências. Também devem ser registrados a versão da interface, a configuração do agente, os diálogos reais e a política de dados do Chatling.</w:t>
+        <w:rPr>
+          <w:i w:val="0"/>
+        </w:rPr>
+        <w:t xml:space="preserve">Para a entrega, permanecem como pendências metodológicas o registro das versões dos navegadores, resoluções e modelos de dispositivo, além de uma avaliação externa de usabilidade. A configuração e a política de dados do </w:t>
+      </w:r>
+      <w:r>
+        <w:rPr>
+          <w:i/>
+        </w:rPr>
+        <w:t>Chatling</w:t>
+      </w:r>
+      <w:r>
+        <w:rPr>
+          <w:i w:val="0"/>
+        </w:rPr>
+        <w:t xml:space="preserve"> também devem ser anexadas se o assistente for apresentado como parte dos resultados. As capturas do site já foram inseridas nas Figuras 5 a 9.</w:t>
       </w:r>
     </w:p>
     <w:p>
@@ -18091,7 +17320,22 @@
         <w:jc w:val="both"/>
       </w:pPr>
       <w:r>
-        <w:t>Recomenda-se estudo de usabilidade com cinco a oito participantes externos, tarefas cronometradas e SUS; métricas de resposta e carga; análise complementar de segurança e RLS; documentação de diálogos do Chatling; revisão institucional da privacidade; e definição de licença compatível com distribuição.</w:t>
+        <w:rPr>
+          <w:i w:val="0"/>
+        </w:rPr>
+        <w:t xml:space="preserve">Recomenda-se estudo de usabilidade com cinco a oito participantes externos, tarefas cronometradas e SUS; métricas de resposta e carga; análise complementar de segurança e RLS; documentação de diálogos do </w:t>
+      </w:r>
+      <w:r>
+        <w:rPr>
+          <w:i/>
+        </w:rPr>
+        <w:t>Chatling</w:t>
+      </w:r>
+      <w:r>
+        <w:rPr>
+          <w:i w:val="0"/>
+        </w:rPr>
+        <w:t>; revisão institucional da privacidade; e definição de licença compatível com distribuição.</w:t>
       </w:r>
     </w:p>
     <w:p>
@@ -18116,7 +17360,7 @@
         <w:jc w:val="both"/>
       </w:pPr>
       <w:r>
-        <w:t>ABCOMM. Faturamento do Ecommerce no Brasil. Disponível em: https://dados.abcomm.org/. Acesso em: 25 out. 2026.</w:t>
+        <w:t>ABCOMM. Faturamento do ecommerce no Brasil: principais indicadores de 2025. [S. l.], 2025. Disponível em: https://dados.abcomm.org/. Acesso em: 25 out. 2026.</w:t>
       </w:r>
     </w:p>
     <w:p>
@@ -18172,13 +17416,8 @@
       </w:r>
     </w:p>
     <w:p>
-      <w:pPr>
-        <w:spacing w:before="0" w:after="0" w:line="240" w:lineRule="auto"/>
-        <w:ind w:left="0" w:right="0" w:firstLine="0"/>
-        <w:jc w:val="both"/>
-      </w:pPr>
-      <w:r>
-        <w:t>FENAUTO. Mercado de veículos usados bate recorde histórico de vendas. 06 jan. 2026. Disponível em: https://www.fenauto.org.br/news/mercado-de-veiculos-usados-bate-recorde-historico-de-vendas. Acesso em: 25 out. 2026.</w:t>
+      <w:r>
+        <w:t>CHATLING. Pricing. [S. l.], 2026. Disponível em: https://chatling.ai/pricing. Acesso em: 25 out. 2026.</w:t>
       </w:r>
     </w:p>
     <w:p>
@@ -18188,7 +17427,7 @@
         <w:jc w:val="both"/>
       </w:pPr>
       <w:r>
-        <w:t>IEEE. IEEE/ISO/IEC 29148:2018: Systems and software engineering — Life cycle processes — Requirements engineering. Disponível em: https://standards.ieee.org/standard/29148-2018.html. Acesso em: 25 out. 2026.</w:t>
+        <w:t>FENAUTO. Mercado de veículos usados bate recorde histórico de vendas. 06 jan. 2026. Disponível em: https://www.fenauto.org.br/news/mercado-de-veiculos-usados-bate-recorde-historico-de-vendas. Acesso em: 25 out. 2026.</w:t>
       </w:r>
     </w:p>
     <w:p>
@@ -18198,7 +17437,7 @@
         <w:jc w:val="both"/>
       </w:pPr>
       <w:r>
-        <w:t>ISO. ISO/IEC 25010:2023: Systems and software engineering — Systems and software Quality Requirements and Evaluation (SQuaRE) — Product quality model. Disponível em: https://www.iso.org/standard/78176.html. Acesso em: 25 out. 2026.</w:t>
+        <w:t>IEEE. ISO/IEC/IEEE 29148:2018: Systems and software engineering — Life cycle processes — Requirements engineering. [S. l.], 2018. Disponível em: https://standards.ieee.org/standard/29148-2018.html. Acesso em: 25 out. 2026.</w:t>
       </w:r>
     </w:p>
     <w:p>
@@ -18208,7 +17447,7 @@
         <w:jc w:val="both"/>
       </w:pPr>
       <w:r>
-        <w:t>MOBIAUTO. Mobiauto: compra e venda de carros novos e usados. Disponível em: https://www.mobiauto.com.br/. Acesso em: 25 out. 2026.</w:t>
+        <w:t>ISO. ISO/IEC 25010:2023: Systems and software engineering — Systems and software Quality Requirements and Evaluation (SQuaRE) — Product quality model. Geneva: ISO, 2023. Disponível em: https://www.iso.org/standard/78176.html. Acesso em: 25 out. 2026.</w:t>
       </w:r>
     </w:p>
     <w:p>
@@ -18218,7 +17457,7 @@
         <w:jc w:val="both"/>
       </w:pPr>
       <w:r>
-        <w:t>OLX. Autos. Disponível em: https://www.olx.com.br/autos-e-pecas. Acesso em: 25 out. 2026.</w:t>
+        <w:t>MOBIAUTO. Mobiauto: compra e venda de carros novos e usados. [S. d.]. Disponível em: https://www.mobiauto.com.br/. Acesso em: 25 out. 2026.</w:t>
       </w:r>
     </w:p>
     <w:p>
@@ -18228,7 +17467,7 @@
         <w:jc w:val="both"/>
       </w:pPr>
       <w:r>
-        <w:t>PEREIRA, G. da S.; PINTO, G. S. A importância do e-commerce no processo de comercialização de produtos, mercadorias e serviços de micro e pequenas empresas. Revista Interface Tecnológica, v. 18, n. 2, p. 316–328, 2021. DOI: 10.31510/infa.v18i2.1327. Disponível em: https://revista.fatectq.edu.br/interfacetecnologica/article/view/1327. Acesso em: 25 out. 2026.</w:t>
+        <w:t>OLX. Autos e peças. [S. d.]. Disponível em: https://www.olx.com.br/autos-e-pecas. Acesso em: 25 out. 2026.</w:t>
       </w:r>
     </w:p>
     <w:p>
@@ -18238,7 +17477,17 @@
         <w:jc w:val="both"/>
       </w:pPr>
       <w:r>
-        <w:t>WEBMOTORS. Webmotors: compre, venda e financie carros ou motos novos, usados e seminovos. Disponível em: https://www.webmotors.com.br/. Acesso em: 25 out. 2026.</w:t>
+        <w:t>PEREIRA, G. da S.; PINTO, G. S. A importância do e-commerce no processo de comercialização de produtos, mercadorias e serviços de micro e pequenas empresas. Revista Interface Tecnológica, v. 18, n. 2, p. 316–328, 2021. DOI: 10.31510/infa.v18i2.1327. Disponível em: https://revista.fatectq.edu.br/interfacetecnologica/article/view/1327. Acesso em: 25 out. 2026.</w:t>
+      </w:r>
+    </w:p>
+    <w:p>
+      <w:pPr>
+        <w:spacing w:before="0" w:after="0" w:line="240" w:lineRule="auto"/>
+        <w:ind w:left="0" w:right="0" w:firstLine="0"/>
+        <w:jc w:val="both"/>
+      </w:pPr>
+      <w:r>
+        <w:t>WEBMOTORS. Webmotors: compre, venda e financie carros ou motos novos, usados e seminovos. [S. d.]. Disponível em: https://www.webmotors.com.br/. Acesso em: 25 out. 2026.</w:t>
       </w:r>
     </w:p>
     <w:sectPr>

</xml_diff>

<commit_message>
docs: registrar versões do ambiente
</commit_message>
<xml_diff>
--- a/ArtigoMG_revisado_MGMOTORSBR.docx
+++ b/ArtigoMG_revisado_MGMOTORSBR.docx
@@ -4431,55 +4431,47 @@
         <w:rPr>
           <w:i w:val="0"/>
         </w:rPr>
-        <w:t xml:space="preserve">O </w:t>
+        <w:t>O front-end utiliza HTML5, CSS3 e JavaScript sem framework. O Supabase Free fornece PostgreSQL, autenticação, Storage e endpoints; o cliente é @supabase/supabase-js 2.117.3. As fotos novas das conversas são armazenadas no bucket privado FOTOS-MENSAGENS e acessadas por URLs assinadas, enquanto as fotos antigas permanecem compatíveis. O ambiente de desenvolvimento utilizou Node.js 26.12.0, Visual Studio Code 1.143.1 e Supabase CLI 2.117.0. A consulta de versão executada no SQL Editor confirmou PostgreSQL 17.6 em arquitetura aarch64. As extensões relevantes registradas foram Live Server 5.7.10 e GitHub Pull Requests 0.172.0; as demais extensões do ambiente não são necessárias para executar a aplicação. Git e GitHub foram usados para versionamento e o site está publicado no Vercel, no endereço oficial https://mgmotorss.vercel.app/MG-INICIO/inicio.html. Repositório: https://github.com/murilotecoteco/MGMOTORSBR. O README informa que nenhuma licença foi aplicada ao projeto educacional.</w:t>
       </w:r>
       <w:r>
         <w:rPr>
           <w:i/>
         </w:rPr>
-        <w:t>front-end</w:t>
       </w:r>
       <w:r>
         <w:rPr>
           <w:i w:val="0"/>
         </w:rPr>
-        <w:t xml:space="preserve"> utiliza HTML5, CSS3 e </w:t>
       </w:r>
       <w:r>
         <w:rPr>
           <w:i/>
         </w:rPr>
-        <w:t>JavaScript</w:t>
       </w:r>
       <w:r>
         <w:rPr>
           <w:i w:val="0"/>
         </w:rPr>
-        <w:t xml:space="preserve"> sem framework. O Supabase Free fornece PostgreSQL, autenticação, </w:t>
       </w:r>
       <w:r>
         <w:rPr>
           <w:i/>
         </w:rPr>
-        <w:t>Storage</w:t>
       </w:r>
       <w:r>
         <w:rPr>
           <w:i w:val="0"/>
         </w:rPr>
-        <w:t xml:space="preserve"> e </w:t>
       </w:r>
       <w:r>
         <w:rPr>
           <w:i/>
         </w:rPr>
-        <w:t>endpoint</w:t>
       </w:r>
       <w:r>
         <w:rPr>
           <w:i w:val="0"/>
         </w:rPr>
-        <w:t>s; o cliente é @supabase/supabase-js 2.45.4. As fotos novas das conversas são armazenadas no bucket privado FOTOS-MENSAGENS e acessadas por URLs assinadas, enquanto as fotos antigas permanecem compatíveis. O ambiente de desenvolvimento utilizou Node.js 26.12.0 e Visual Studio Code 1.142.0. A versão do PostgreSQL provisionado pelo Supabase, a versão da CLI do Supabase e as extensões do VS Code não foram registradas. Git e GitHub foram usados para versionamento e o site está publicado no Vercel, no endereço oficial https://mgmotorss.vercel.app/MG-INICIO/inicio.html. Repositório: https://github.com/murilotecoteco/MGMOTORSBR. O README informa que nenhuma licença foi aplicada ao projeto educacional.</w:t>
       </w:r>
     </w:p>
     <w:p>
@@ -4489,7 +4481,7 @@
         <w:jc w:val="both"/>
       </w:pPr>
       <w:r>
-        <w:t>Nos testes e no desenvolvimento foram utilizados Arch Linux e Windows. A validação final registrada pelos autores foi realizada em Chromium e Firefox sobre Arch Linux, além de testes em dispositivo móvel. Foram confirmados login, logout, filtros avançados, edição, categorias, venda, compartilhamento, formulário de contato, mensagens entre duas contas, envio e recebimento de fotos, mensagens não lidas, notificações persistentes, atualização das conversas e funcionamento responsivo. O aceite não registrou as versões exatas dos navegadores, o modelo do dispositivo móvel nem as resoluções utilizadas.</w:t>
+        <w:t>Nos testes e no desenvolvimento foram utilizados Arch Linux e Windows. A validação final registrada pelos autores foi realizada em Chromium 156.0.8078.47 e Firefox 158.0.1 sobre Arch Linux, além de testes em dispositivo móvel. Foram confirmados login, logout, filtros avançados, edição, categorias, venda, compartilhamento, formulário de contato, mensagens entre duas contas, envio e recebimento de fotos, mensagens não lidas, notificações persistentes, atualização das conversas e funcionamento responsivo. O aceite confirmou as versões dos navegadores, mas não registrou o modelo do dispositivo móvel nem as resoluções utilizadas.</w:t>
       </w:r>
     </w:p>
     <w:p>
@@ -14740,7 +14732,7 @@
         <w:jc w:val="both"/>
       </w:pPr>
       <w:r>
-        <w:t>O protocolo combinou testes funcionais manuais, verificação de responsividade e validações automatizadas de contraste e estrutura. Foram considerados 17 cenários agregados no Quadro 6, executados pela equipe de desenvolvimento em 25 de outubro de 2026, com duas contas de teste, anúncios e fotos do ambiente de produção. Os navegadores registrados foram Chromium e Firefox em Arch Linux, além de verificações em celular; versões exatas, modelos e resoluções não foram anotados. Cada cenário foi descrito por entrada, resultado esperado, resultado observado e status.</w:t>
+        <w:t>O protocolo combinou testes funcionais manuais, verificação de responsividade e validações automatizadas de contraste e estrutura. Foram considerados 17 cenários agregados no Quadro 6, executados pela equipe de desenvolvimento em 25 de outubro de 2026, com duas contas de teste, anúncios e fotos do ambiente de produção. Os navegadores registrados foram Chromium 156.0.8078.47 e Firefox 158.0.1 em Arch Linux, além de verificações em celular; o modelo do dispositivo e as resoluções não foram anotados. Cada cenário foi descrito por entrada, resultado esperado, resultado observado e status.</w:t>
       </w:r>
     </w:p>
     <w:p>
@@ -15145,7 +15137,7 @@
           </w:tcPr>
           <w:p>
             <w:r>
-              <w:t>Chromium e Firefox; versões exatas não registradas no aceite.</w:t>
+              <w:t>Chromium 156.0.8078.47 e Firefox 158.0.1; versões confirmadas no Arch Linux.</w:t>
             </w:r>
           </w:p>
         </w:tc>
@@ -17255,7 +17247,7 @@
         <w:jc w:val="both"/>
       </w:pPr>
       <w:r>
-        <w:t>Os testes indicaram funcionamento satisfatório dos fluxos principais. A comunicação entre duas contas, o envio e recebimento de fotos, as mensagens não lidas, as notificações persistentes, o login, o logout, os filtros avançados, a edição, as categorias, a venda, o compartilhamento, o formulário de contato e a responsividade foram confirmados em Chromium e Firefox sobre Arch Linux, além de testes em celular. A plataforma deve ser apresentada como protótipo acadêmico validado, não como produto comercial pronto. A integração é tecnicamente viável, mas depende de acompanhamento, testes ampliados e validações externas.</w:t>
+        <w:t>Os testes indicaram funcionamento satisfatório dos fluxos principais. A comunicação entre duas contas, o envio e recebimento de fotos, as mensagens não lidas, as notificações persistentes, o login, o logout, os filtros avançados, a edição, as categorias, a venda, o compartilhamento, o formulário de contato e a responsividade foram confirmados em Chromium 156.0.8078.47 e Firefox 158.0.1 sobre Arch Linux, além de testes em celular. A plataforma deve ser apresentada como protótipo acadêmico validado, não como produto comercial pronto. A integração é tecnicamente viável, mas depende de acompanhamento, testes ampliados e validações externas.</w:t>
       </w:r>
     </w:p>
     <w:p>
@@ -17283,19 +17275,17 @@
         <w:rPr>
           <w:i w:val="0"/>
         </w:rPr>
-        <w:t xml:space="preserve">Para a entrega, permanecem como pendências metodológicas o registro das versões dos navegadores, resoluções e modelos de dispositivo, além de uma avaliação externa de usabilidade. A configuração e a política de dados do </w:t>
+        <w:t>Para a entrega, permanecem como pendências metodológicas o registro das resoluções e do modelo de dispositivo móvel, além de uma avaliação externa de usabilidade. As versões dos navegadores já foram confirmadas como Chromium 156.0.8078.47 e Firefox 158.0.1 no Arch Linux. A configuração e a política de dados do Chatling também devem ser anexadas se o assistente for apresentado como parte dos resultados. As capturas do site já foram inseridas nas Figuras 5 a 9.</w:t>
       </w:r>
       <w:r>
         <w:rPr>
           <w:i/>
         </w:rPr>
-        <w:t>Chatling</w:t>
       </w:r>
       <w:r>
         <w:rPr>
           <w:i w:val="0"/>
         </w:rPr>
-        <w:t xml:space="preserve"> também devem ser anexadas se o assistente for apresentado como parte dos resultados. As capturas do site já foram inseridas nas Figuras 5 a 9.</w:t>
       </w:r>
     </w:p>
     <w:p>

</xml_diff>

<commit_message>
fix: ajustar navbar responsiva e registrar dispositivos
</commit_message>
<xml_diff>
--- a/ArtigoMG_revisado_MGMOTORSBR.docx
+++ b/ArtigoMG_revisado_MGMOTORSBR.docx
@@ -4481,7 +4481,7 @@
         <w:jc w:val="both"/>
       </w:pPr>
       <w:r>
-        <w:t>Nos testes e no desenvolvimento foram utilizados Arch Linux e Windows. A validação final registrada pelos autores foi realizada em Chromium 156.0.8078.47 e Firefox 158.0.1 sobre Arch Linux, além de testes em dispositivo móvel. Foram confirmados login, logout, filtros avançados, edição, categorias, venda, compartilhamento, formulário de contato, mensagens entre duas contas, envio e recebimento de fotos, mensagens não lidas, notificações persistentes, atualização das conversas e funcionamento responsivo. O aceite confirmou as versões dos navegadores, mas não registrou o modelo do dispositivo móvel nem as resoluções utilizadas.</w:t>
+        <w:t>Nos testes e no desenvolvimento foram utilizados Arch Linux e Windows. A validação final registrada pelos autores foi realizada em Chromium 156.0.8078.47 e Firefox 158.0.1 sobre Arch Linux, além de testes nos dispositivos Redmi 13C (1600 × 720) e Samsung A35 (1080 × 2340). Foram confirmados login, logout, filtros avançados, edição, categorias, venda, compartilhamento, formulário de contato, mensagens entre duas contas, envio e recebimento de fotos, mensagens não lidas, notificações persistentes, atualização das conversas e funcionamento responsivo. Durante a revisão visual, a navbar móvel apresentou sobreposição entre menu e ícones; o CSS global foi ajustado para manter os ícones na mesma linha e abrir o menu em uma segunda linha, sem cobrir o conteúdo.</w:t>
       </w:r>
     </w:p>
     <w:p>
@@ -14732,7 +14732,7 @@
         <w:jc w:val="both"/>
       </w:pPr>
       <w:r>
-        <w:t>O protocolo combinou testes funcionais manuais, verificação de responsividade e validações automatizadas de contraste e estrutura. Foram considerados 17 cenários agregados no Quadro 6, executados pela equipe de desenvolvimento em 25 de outubro de 2026, com duas contas de teste, anúncios e fotos do ambiente de produção. Os navegadores registrados foram Chromium 156.0.8078.47 e Firefox 158.0.1 em Arch Linux, além de verificações em celular; o modelo do dispositivo e as resoluções não foram anotados. Cada cenário foi descrito por entrada, resultado esperado, resultado observado e status.</w:t>
+        <w:t>O protocolo combinou testes funcionais manuais, verificação de responsividade e validações automatizadas de contraste e estrutura. Foram considerados 17 cenários agregados no Quadro 6, executados pela equipe de desenvolvimento em 25 de outubro de 2026, com duas contas de teste, anúncios e fotos do ambiente de produção. Os navegadores registrados foram Chromium 156.0.8078.47 e Firefox 158.0.1 em Arch Linux, com verificações nos dispositivos Redmi 13C (1600 × 720) e Samsung A35 (1080 × 2340). Durante a revisão, a navbar foi ajustada para manter os ícones alinhados e o menu em uma segunda linha; o teste visual após o novo deploy deve ser repetido. Cada cenário foi descrito por entrada, resultado esperado, resultado observado e status.</w:t>
       </w:r>
     </w:p>
     <w:p>
@@ -17275,7 +17275,7 @@
         <w:rPr>
           <w:i w:val="0"/>
         </w:rPr>
-        <w:t>Para a entrega, permanecem como pendências metodológicas o registro das resoluções e do modelo de dispositivo móvel, além de uma avaliação externa de usabilidade. As versões dos navegadores já foram confirmadas como Chromium 156.0.8078.47 e Firefox 158.0.1 no Arch Linux. A configuração e a política de dados do Chatling também devem ser anexadas se o assistente for apresentado como parte dos resultados. As capturas do site já foram inseridas nas Figuras 5 a 9.</w:t>
+        <w:t>Para a entrega, permanecem como pendências metodológicas uma avaliação externa de usabilidade e a repetição do teste visual da navbar após o novo deploy. Os dispositivos e resoluções foram registrados como Redmi 13C (1600 × 720) e Samsung A35 (1080 × 2340), e as versões dos navegadores como Chromium 156.0.8078.47 e Firefox 158.0.1 no Arch Linux. A configuração e a política de dados do Chatling também devem ser anexadas se o assistente for apresentado como parte dos resultados. As capturas do site já foram inseridas nas Figuras 5 a 9.</w:t>
       </w:r>
       <w:r>
         <w:rPr>

</xml_diff>